<commit_message>
docs: HANDOFF §633, CLAUDE.md e o Guia 2.6 com a varredura e as Initiatives
HANDOFF §633: o que a varredura da atualização do Pane conferiu (as sete
baterias que falham, iguais no código de antes; as 99 telas nos dois temas
e nas duas línguas) e cada defeito com a causa. CLAUDE.md: Initiatives e a
categoria, a coluna REAL no arrasto, o Sync só com o perfil de quem clicou,
o dia devolvido às 08:00, o CSV, a trava por SID — e o que tinha ficado
velho (o `_ALWAYS_ALLOWED_PATHS` sem /user-home e /settings, a contagem dos
testes).

Guia 2.6: a §17.3 vira Initiatives, com as categorias e o filtro; os dois
monitores dizem quem desfaz o ajuste e o que acontece com o quadro
desatualizado; oito prints refeitos (dados fictícios, relógio fixo), e os
dois Word reconstruídos. O README dos testes ganhou as duas baterias desta
atualização que tinham ficado fora dele (check_mc_move, check_clear_filters_icon).

Co-Authored-By: Claude Opus 5.5 (1M context) <noreply@anthropic.com>
</commit_message>
<xml_diff>
--- a/SOP_PROCESSAMENTO_OTC.docx
+++ b/SOP_PROCESSAMENTO_OTC.docx
@@ -476,7 +476,7 @@
               <a:graphicData uri="http://schemas.openxmlformats.org/drawingml/2006/picture">
                 <pic:pic>
                   <pic:nvPicPr>
-                    <pic:cNvPr id="0" name="tmpvy4qaab6.png"/>
+                    <pic:cNvPr id="0" name="tmp21bmwh0k.png"/>
                     <pic:cNvPicPr/>
                   </pic:nvPicPr>
                   <pic:blipFill>
@@ -536,7 +536,7 @@
               <a:graphicData uri="http://schemas.openxmlformats.org/drawingml/2006/picture">
                 <pic:pic>
                   <pic:nvPicPr>
-                    <pic:cNvPr id="0" name="tmpe1rholih.png"/>
+                    <pic:cNvPr id="0" name="tmpr879f47h.png"/>
                     <pic:cNvPicPr/>
                   </pic:nvPicPr>
                   <pic:blipFill>
@@ -596,7 +596,7 @@
               <a:graphicData uri="http://schemas.openxmlformats.org/drawingml/2006/picture">
                 <pic:pic>
                   <pic:nvPicPr>
-                    <pic:cNvPr id="0" name="tmpyq0r2z31.png"/>
+                    <pic:cNvPr id="0" name="tmpnstsecv1.png"/>
                     <pic:cNvPicPr/>
                   </pic:nvPicPr>
                   <pic:blipFill>
@@ -656,7 +656,7 @@
               <a:graphicData uri="http://schemas.openxmlformats.org/drawingml/2006/picture">
                 <pic:pic>
                   <pic:nvPicPr>
-                    <pic:cNvPr id="0" name="tmptrgclybh.png"/>
+                    <pic:cNvPr id="0" name="tmppctajb9j.png"/>
                     <pic:cNvPicPr/>
                   </pic:nvPicPr>
                   <pic:blipFill>
@@ -716,7 +716,7 @@
               <a:graphicData uri="http://schemas.openxmlformats.org/drawingml/2006/picture">
                 <pic:pic>
                   <pic:nvPicPr>
-                    <pic:cNvPr id="0" name="tmplmikj03s.png"/>
+                    <pic:cNvPr id="0" name="tmptp81e8mi.png"/>
                     <pic:cNvPicPr/>
                   </pic:nvPicPr>
                   <pic:blipFill>
@@ -959,7 +959,7 @@
               <a:graphicData uri="http://schemas.openxmlformats.org/drawingml/2006/picture">
                 <pic:pic>
                   <pic:nvPicPr>
-                    <pic:cNvPr id="0" name="tmps_ox9j5d.png"/>
+                    <pic:cNvPr id="0" name="tmpt23naqas.png"/>
                     <pic:cNvPicPr/>
                   </pic:nvPicPr>
                   <pic:blipFill>
@@ -1015,7 +1015,7 @@
               <a:graphicData uri="http://schemas.openxmlformats.org/drawingml/2006/picture">
                 <pic:pic>
                   <pic:nvPicPr>
-                    <pic:cNvPr id="0" name="tmpowz3pq5n.png"/>
+                    <pic:cNvPr id="0" name="tmpzy4gxca7.png"/>
                     <pic:cNvPicPr/>
                   </pic:nvPicPr>
                   <pic:blipFill>
@@ -1143,7 +1143,7 @@
               <a:graphicData uri="http://schemas.openxmlformats.org/drawingml/2006/picture">
                 <pic:pic>
                   <pic:nvPicPr>
-                    <pic:cNvPr id="0" name="tmpl76ccylj.png"/>
+                    <pic:cNvPr id="0" name="tmpcu24uf9o.png"/>
                     <pic:cNvPicPr/>
                   </pic:nvPicPr>
                   <pic:blipFill>
@@ -1208,7 +1208,7 @@
               <a:graphicData uri="http://schemas.openxmlformats.org/drawingml/2006/picture">
                 <pic:pic>
                   <pic:nvPicPr>
-                    <pic:cNvPr id="0" name="tmp_ac9m7zk.png"/>
+                    <pic:cNvPr id="0" name="tmph7s4ifw1.png"/>
                     <pic:cNvPicPr/>
                   </pic:nvPicPr>
                   <pic:blipFill>
@@ -1513,7 +1513,7 @@
               <a:graphicData uri="http://schemas.openxmlformats.org/drawingml/2006/picture">
                 <pic:pic>
                   <pic:nvPicPr>
-                    <pic:cNvPr id="0" name="tmpvy4qaab6.png"/>
+                    <pic:cNvPr id="0" name="tmp21bmwh0k.png"/>
                     <pic:cNvPicPr/>
                   </pic:nvPicPr>
                   <pic:blipFill>
@@ -1899,7 +1899,7 @@
               <a:graphicData uri="http://schemas.openxmlformats.org/drawingml/2006/picture">
                 <pic:pic>
                   <pic:nvPicPr>
-                    <pic:cNvPr id="0" name="tmpyq0r2z31.png"/>
+                    <pic:cNvPr id="0" name="tmpnstsecv1.png"/>
                     <pic:cNvPicPr/>
                   </pic:nvPicPr>
                   <pic:blipFill>
@@ -1955,7 +1955,7 @@
               <a:graphicData uri="http://schemas.openxmlformats.org/drawingml/2006/picture">
                 <pic:pic>
                   <pic:nvPicPr>
-                    <pic:cNvPr id="0" name="tmpe1rholih.png"/>
+                    <pic:cNvPr id="0" name="tmpr879f47h.png"/>
                     <pic:cNvPicPr/>
                   </pic:nvPicPr>
                   <pic:blipFill>
@@ -2147,7 +2147,7 @@
               <a:graphicData uri="http://schemas.openxmlformats.org/drawingml/2006/picture">
                 <pic:pic>
                   <pic:nvPicPr>
-                    <pic:cNvPr id="0" name="tmp13ouylna.png"/>
+                    <pic:cNvPr id="0" name="tmpie8rmq84.png"/>
                     <pic:cNvPicPr/>
                   </pic:nvPicPr>
                   <pic:blipFill>
@@ -2203,7 +2203,7 @@
               <a:graphicData uri="http://schemas.openxmlformats.org/drawingml/2006/picture">
                 <pic:pic>
                   <pic:nvPicPr>
-                    <pic:cNvPr id="0" name="tmp0xn468hx.png"/>
+                    <pic:cNvPr id="0" name="tmpyl35k4qz.png"/>
                     <pic:cNvPicPr/>
                   </pic:nvPicPr>
                   <pic:blipFill>
@@ -2259,7 +2259,7 @@
               <a:graphicData uri="http://schemas.openxmlformats.org/drawingml/2006/picture">
                 <pic:pic>
                   <pic:nvPicPr>
-                    <pic:cNvPr id="0" name="tmpqmel9wd0.png"/>
+                    <pic:cNvPr id="0" name="tmpzrrosk84.png"/>
                     <pic:cNvPicPr/>
                   </pic:nvPicPr>
                   <pic:blipFill>
@@ -2366,7 +2366,7 @@
               <a:graphicData uri="http://schemas.openxmlformats.org/drawingml/2006/picture">
                 <pic:pic>
                   <pic:nvPicPr>
-                    <pic:cNvPr id="0" name="tmptrgclybh.png"/>
+                    <pic:cNvPr id="0" name="tmppctajb9j.png"/>
                     <pic:cNvPicPr/>
                   </pic:nvPicPr>
                   <pic:blipFill>
@@ -2473,7 +2473,7 @@
               <a:graphicData uri="http://schemas.openxmlformats.org/drawingml/2006/picture">
                 <pic:pic>
                   <pic:nvPicPr>
-                    <pic:cNvPr id="0" name="tmpmv28o0tb.png"/>
+                    <pic:cNvPr id="0" name="tmpl1uyng8v.png"/>
                     <pic:cNvPicPr/>
                   </pic:nvPicPr>
                   <pic:blipFill>
@@ -2580,7 +2580,7 @@
               <a:graphicData uri="http://schemas.openxmlformats.org/drawingml/2006/picture">
                 <pic:pic>
                   <pic:nvPicPr>
-                    <pic:cNvPr id="0" name="tmpn2r2p4gb.png"/>
+                    <pic:cNvPr id="0" name="tmp9lqq9vaz.png"/>
                     <pic:cNvPicPr/>
                   </pic:nvPicPr>
                   <pic:blipFill>
@@ -2636,7 +2636,7 @@
               <a:graphicData uri="http://schemas.openxmlformats.org/drawingml/2006/picture">
                 <pic:pic>
                   <pic:nvPicPr>
-                    <pic:cNvPr id="0" name="tmpor6xs149.png"/>
+                    <pic:cNvPr id="0" name="tmp3fs_jnd5.png"/>
                     <pic:cNvPicPr/>
                   </pic:nvPicPr>
                   <pic:blipFill>
@@ -2703,7 +2703,7 @@
               <a:graphicData uri="http://schemas.openxmlformats.org/drawingml/2006/picture">
                 <pic:pic>
                   <pic:nvPicPr>
-                    <pic:cNvPr id="0" name="tmp0nlfbs__.png"/>
+                    <pic:cNvPr id="0" name="tmpzls63but.png"/>
                     <pic:cNvPicPr/>
                   </pic:nvPicPr>
                   <pic:blipFill>
@@ -2769,7 +2769,7 @@
               <a:graphicData uri="http://schemas.openxmlformats.org/drawingml/2006/picture">
                 <pic:pic>
                   <pic:nvPicPr>
-                    <pic:cNvPr id="0" name="tmpmtho3buq.png"/>
+                    <pic:cNvPr id="0" name="tmplm6jugq4.png"/>
                     <pic:cNvPicPr/>
                   </pic:nvPicPr>
                   <pic:blipFill>
@@ -2834,7 +2834,7 @@
               <a:graphicData uri="http://schemas.openxmlformats.org/drawingml/2006/picture">
                 <pic:pic>
                   <pic:nvPicPr>
-                    <pic:cNvPr id="0" name="tmp9_h08x1d.png"/>
+                    <pic:cNvPr id="0" name="tmpbhr0ko1n.png"/>
                     <pic:cNvPicPr/>
                   </pic:nvPicPr>
                   <pic:blipFill>
@@ -2953,7 +2953,7 @@
               <a:graphicData uri="http://schemas.openxmlformats.org/drawingml/2006/picture">
                 <pic:pic>
                   <pic:nvPicPr>
-                    <pic:cNvPr id="0" name="tmpap5aia5q.png"/>
+                    <pic:cNvPr id="0" name="tmpahb08vjl.png"/>
                     <pic:cNvPicPr/>
                   </pic:nvPicPr>
                   <pic:blipFill>
@@ -3020,7 +3020,7 @@
               <a:graphicData uri="http://schemas.openxmlformats.org/drawingml/2006/picture">
                 <pic:pic>
                   <pic:nvPicPr>
-                    <pic:cNvPr id="0" name="tmp7kepi2e4.png"/>
+                    <pic:cNvPr id="0" name="tmpcjzvy3yk.png"/>
                     <pic:cNvPicPr/>
                   </pic:nvPicPr>
                   <pic:blipFill>
@@ -3157,7 +3157,7 @@
               <a:graphicData uri="http://schemas.openxmlformats.org/drawingml/2006/picture">
                 <pic:pic>
                   <pic:nvPicPr>
-                    <pic:cNvPr id="0" name="tmp974n2iqb.png"/>
+                    <pic:cNvPr id="0" name="tmpy07e8w28.png"/>
                     <pic:cNvPicPr/>
                   </pic:nvPicPr>
                   <pic:blipFill>
@@ -3236,7 +3236,7 @@
               <a:graphicData uri="http://schemas.openxmlformats.org/drawingml/2006/picture">
                 <pic:pic>
                   <pic:nvPicPr>
-                    <pic:cNvPr id="0" name="tmpmy_nbdmh.png"/>
+                    <pic:cNvPr id="0" name="tmpyfd3a89m.png"/>
                     <pic:cNvPicPr/>
                   </pic:nvPicPr>
                   <pic:blipFill>
@@ -3303,7 +3303,7 @@
               <a:graphicData uri="http://schemas.openxmlformats.org/drawingml/2006/picture">
                 <pic:pic>
                   <pic:nvPicPr>
-                    <pic:cNvPr id="0" name="tmpi1zx7y2y.png"/>
+                    <pic:cNvPr id="0" name="tmpv3p8i3s8.png"/>
                     <pic:cNvPicPr/>
                   </pic:nvPicPr>
                   <pic:blipFill>
@@ -3359,7 +3359,7 @@
               <a:graphicData uri="http://schemas.openxmlformats.org/drawingml/2006/picture">
                 <pic:pic>
                   <pic:nvPicPr>
-                    <pic:cNvPr id="0" name="tmplmikj03s.png"/>
+                    <pic:cNvPr id="0" name="tmptp81e8mi.png"/>
                     <pic:cNvPicPr/>
                   </pic:nvPicPr>
                   <pic:blipFill>
@@ -3426,7 +3426,7 @@
               <a:graphicData uri="http://schemas.openxmlformats.org/drawingml/2006/picture">
                 <pic:pic>
                   <pic:nvPicPr>
-                    <pic:cNvPr id="0" name="tmpvl3938qa.png"/>
+                    <pic:cNvPr id="0" name="tmpxwydjvnq.png"/>
                     <pic:cNvPicPr/>
                   </pic:nvPicPr>
                   <pic:blipFill>
@@ -3482,7 +3482,7 @@
               <a:graphicData uri="http://schemas.openxmlformats.org/drawingml/2006/picture">
                 <pic:pic>
                   <pic:nvPicPr>
-                    <pic:cNvPr id="0" name="tmpt34h08pn.png"/>
+                    <pic:cNvPr id="0" name="tmpkvb6sww_.png"/>
                     <pic:cNvPicPr/>
                   </pic:nvPicPr>
                   <pic:blipFill>
@@ -3538,7 +3538,7 @@
               <a:graphicData uri="http://schemas.openxmlformats.org/drawingml/2006/picture">
                 <pic:pic>
                   <pic:nvPicPr>
-                    <pic:cNvPr id="0" name="tmpka67dzv9.png"/>
+                    <pic:cNvPr id="0" name="tmp_p85x67j.png"/>
                     <pic:cNvPicPr/>
                   </pic:nvPicPr>
                   <pic:blipFill>
@@ -3594,7 +3594,7 @@
               <a:graphicData uri="http://schemas.openxmlformats.org/drawingml/2006/picture">
                 <pic:pic>
                   <pic:nvPicPr>
-                    <pic:cNvPr id="0" name="tmpntoldt9u.png"/>
+                    <pic:cNvPr id="0" name="tmprc9j3c8z.png"/>
                     <pic:cNvPicPr/>
                   </pic:nvPicPr>
                   <pic:blipFill>
@@ -3650,7 +3650,7 @@
               <a:graphicData uri="http://schemas.openxmlformats.org/drawingml/2006/picture">
                 <pic:pic>
                   <pic:nvPicPr>
-                    <pic:cNvPr id="0" name="tmpc7cd4dk2.png"/>
+                    <pic:cNvPr id="0" name="tmpw5gwww7q.png"/>
                     <pic:cNvPicPr/>
                   </pic:nvPicPr>
                   <pic:blipFill>
@@ -3706,7 +3706,7 @@
               <a:graphicData uri="http://schemas.openxmlformats.org/drawingml/2006/picture">
                 <pic:pic>
                   <pic:nvPicPr>
-                    <pic:cNvPr id="0" name="tmpclst0tnw.png"/>
+                    <pic:cNvPr id="0" name="tmp_9mqfxf9.png"/>
                     <pic:cNvPicPr/>
                   </pic:nvPicPr>
                   <pic:blipFill>
@@ -4337,7 +4337,7 @@
               <a:graphicData uri="http://schemas.openxmlformats.org/drawingml/2006/picture">
                 <pic:pic>
                   <pic:nvPicPr>
-                    <pic:cNvPr id="0" name="tmp893fqlkq.png"/>
+                    <pic:cNvPr id="0" name="tmphzf7ccw2.png"/>
                     <pic:cNvPicPr/>
                   </pic:nvPicPr>
                   <pic:blipFill>
@@ -4393,7 +4393,7 @@
               <a:graphicData uri="http://schemas.openxmlformats.org/drawingml/2006/picture">
                 <pic:pic>
                   <pic:nvPicPr>
-                    <pic:cNvPr id="0" name="tmpren18itk.png"/>
+                    <pic:cNvPr id="0" name="tmpwux92tgh.png"/>
                     <pic:cNvPicPr/>
                   </pic:nvPicPr>
                   <pic:blipFill>
@@ -4496,7 +4496,7 @@
               <a:graphicData uri="http://schemas.openxmlformats.org/drawingml/2006/picture">
                 <pic:pic>
                   <pic:nvPicPr>
-                    <pic:cNvPr id="0" name="tmpsmqx11c1.png"/>
+                    <pic:cNvPr id="0" name="tmp55wssinp.png"/>
                     <pic:cNvPicPr/>
                   </pic:nvPicPr>
                   <pic:blipFill>
@@ -4581,7 +4581,7 @@
               <a:graphicData uri="http://schemas.openxmlformats.org/drawingml/2006/picture">
                 <pic:pic>
                   <pic:nvPicPr>
-                    <pic:cNvPr id="0" name="tmpph6_1_nj.png"/>
+                    <pic:cNvPr id="0" name="tmp9m579rex.png"/>
                     <pic:cNvPicPr/>
                   </pic:nvPicPr>
                   <pic:blipFill>
@@ -4637,7 +4637,7 @@
               <a:graphicData uri="http://schemas.openxmlformats.org/drawingml/2006/picture">
                 <pic:pic>
                   <pic:nvPicPr>
-                    <pic:cNvPr id="0" name="tmp_flu9mib.png"/>
+                    <pic:cNvPr id="0" name="tmpsjzourwg.png"/>
                     <pic:cNvPicPr/>
                   </pic:nvPicPr>
                   <pic:blipFill>
@@ -4693,7 +4693,7 @@
               <a:graphicData uri="http://schemas.openxmlformats.org/drawingml/2006/picture">
                 <pic:pic>
                   <pic:nvPicPr>
-                    <pic:cNvPr id="0" name="tmpgchmj5l7.png"/>
+                    <pic:cNvPr id="0" name="tmp6m27f9in.png"/>
                     <pic:cNvPicPr/>
                   </pic:nvPicPr>
                   <pic:blipFill>
@@ -4749,7 +4749,7 @@
               <a:graphicData uri="http://schemas.openxmlformats.org/drawingml/2006/picture">
                 <pic:pic>
                   <pic:nvPicPr>
-                    <pic:cNvPr id="0" name="tmp2uonfk5n.png"/>
+                    <pic:cNvPr id="0" name="tmprim_5q37.png"/>
                     <pic:cNvPicPr/>
                   </pic:nvPicPr>
                   <pic:blipFill>
@@ -4805,7 +4805,7 @@
               <a:graphicData uri="http://schemas.openxmlformats.org/drawingml/2006/picture">
                 <pic:pic>
                   <pic:nvPicPr>
-                    <pic:cNvPr id="0" name="tmp9mt_5431.png"/>
+                    <pic:cNvPr id="0" name="tmpn5y397__.png"/>
                     <pic:cNvPicPr/>
                   </pic:nvPicPr>
                   <pic:blipFill>

</xml_diff>

<commit_message>
docs(guia, sop): a data que se digita, o Reduce transparency e o recap de opção de Commodities
O Guia e o SOP não acompanharam as mudanças de 20/10: o 4.11 dizia só
"digite a data direto no campo", sem a seleção no clique, a máscara, o
calendário que acompanha a digitação e a data impossível que volta à
última válida (§636); o Reduce transparency (3.9) não dizia que também
tira as animações de entrada da troca de página; e a recompra de opção de
Commodities aparecia como "planilha ou tabela colada", quando agora tem
leitor próprio para o Trade Recap da mesa — uma tabela por perna (Client e
o B2B Banco), sem B3 ID, casada pelo Live Position, quantidade em
unidades, FX Rate e o sinal do banco (§637). Os .docx são regerados do .md
pelo build_sop_docx.py.

Co-Authored-By: Claude Opus 5.5 (1M context) <noreply@anthropic.com>
</commit_message>
<xml_diff>
--- a/SOP_PROCESSAMENTO_OTC.docx
+++ b/SOP_PROCESSAMENTO_OTC.docx
@@ -476,7 +476,7 @@
               <a:graphicData uri="http://schemas.openxmlformats.org/drawingml/2006/picture">
                 <pic:pic>
                   <pic:nvPicPr>
-                    <pic:cNvPr id="0" name="tmp21bmwh0k.png"/>
+                    <pic:cNvPr id="0" name="tmpep0mwkr1.png"/>
                     <pic:cNvPicPr/>
                   </pic:nvPicPr>
                   <pic:blipFill>
@@ -536,7 +536,7 @@
               <a:graphicData uri="http://schemas.openxmlformats.org/drawingml/2006/picture">
                 <pic:pic>
                   <pic:nvPicPr>
-                    <pic:cNvPr id="0" name="tmpr879f47h.png"/>
+                    <pic:cNvPr id="0" name="tmpzpmdje1x.png"/>
                     <pic:cNvPicPr/>
                   </pic:nvPicPr>
                   <pic:blipFill>
@@ -596,7 +596,7 @@
               <a:graphicData uri="http://schemas.openxmlformats.org/drawingml/2006/picture">
                 <pic:pic>
                   <pic:nvPicPr>
-                    <pic:cNvPr id="0" name="tmpnstsecv1.png"/>
+                    <pic:cNvPr id="0" name="tmpf5zwv66h.png"/>
                     <pic:cNvPicPr/>
                   </pic:nvPicPr>
                   <pic:blipFill>
@@ -656,7 +656,7 @@
               <a:graphicData uri="http://schemas.openxmlformats.org/drawingml/2006/picture">
                 <pic:pic>
                   <pic:nvPicPr>
-                    <pic:cNvPr id="0" name="tmppctajb9j.png"/>
+                    <pic:cNvPr id="0" name="tmps0m6wyk6.png"/>
                     <pic:cNvPicPr/>
                   </pic:nvPicPr>
                   <pic:blipFill>
@@ -716,7 +716,7 @@
               <a:graphicData uri="http://schemas.openxmlformats.org/drawingml/2006/picture">
                 <pic:pic>
                   <pic:nvPicPr>
-                    <pic:cNvPr id="0" name="tmptp81e8mi.png"/>
+                    <pic:cNvPr id="0" name="tmpe01w8an6.png"/>
                     <pic:cNvPicPr/>
                   </pic:nvPicPr>
                   <pic:blipFill>
@@ -959,7 +959,7 @@
               <a:graphicData uri="http://schemas.openxmlformats.org/drawingml/2006/picture">
                 <pic:pic>
                   <pic:nvPicPr>
-                    <pic:cNvPr id="0" name="tmpt23naqas.png"/>
+                    <pic:cNvPr id="0" name="tmpd3ue4mxr.png"/>
                     <pic:cNvPicPr/>
                   </pic:nvPicPr>
                   <pic:blipFill>
@@ -1015,7 +1015,7 @@
               <a:graphicData uri="http://schemas.openxmlformats.org/drawingml/2006/picture">
                 <pic:pic>
                   <pic:nvPicPr>
-                    <pic:cNvPr id="0" name="tmpzy4gxca7.png"/>
+                    <pic:cNvPr id="0" name="tmpe4m1kkzk.png"/>
                     <pic:cNvPicPr/>
                   </pic:nvPicPr>
                   <pic:blipFill>
@@ -1143,7 +1143,7 @@
               <a:graphicData uri="http://schemas.openxmlformats.org/drawingml/2006/picture">
                 <pic:pic>
                   <pic:nvPicPr>
-                    <pic:cNvPr id="0" name="tmpcu24uf9o.png"/>
+                    <pic:cNvPr id="0" name="tmpkp2idc5w.png"/>
                     <pic:cNvPicPr/>
                   </pic:nvPicPr>
                   <pic:blipFill>
@@ -1208,7 +1208,7 @@
               <a:graphicData uri="http://schemas.openxmlformats.org/drawingml/2006/picture">
                 <pic:pic>
                   <pic:nvPicPr>
-                    <pic:cNvPr id="0" name="tmph7s4ifw1.png"/>
+                    <pic:cNvPr id="0" name="tmpeszzw7ph.png"/>
                     <pic:cNvPicPr/>
                   </pic:nvPicPr>
                   <pic:blipFill>
@@ -1513,7 +1513,7 @@
               <a:graphicData uri="http://schemas.openxmlformats.org/drawingml/2006/picture">
                 <pic:pic>
                   <pic:nvPicPr>
-                    <pic:cNvPr id="0" name="tmp21bmwh0k.png"/>
+                    <pic:cNvPr id="0" name="tmpep0mwkr1.png"/>
                     <pic:cNvPicPr/>
                   </pic:nvPicPr>
                   <pic:blipFill>
@@ -1899,7 +1899,7 @@
               <a:graphicData uri="http://schemas.openxmlformats.org/drawingml/2006/picture">
                 <pic:pic>
                   <pic:nvPicPr>
-                    <pic:cNvPr id="0" name="tmpnstsecv1.png"/>
+                    <pic:cNvPr id="0" name="tmpf5zwv66h.png"/>
                     <pic:cNvPicPr/>
                   </pic:nvPicPr>
                   <pic:blipFill>
@@ -1955,7 +1955,7 @@
               <a:graphicData uri="http://schemas.openxmlformats.org/drawingml/2006/picture">
                 <pic:pic>
                   <pic:nvPicPr>
-                    <pic:cNvPr id="0" name="tmpr879f47h.png"/>
+                    <pic:cNvPr id="0" name="tmpzpmdje1x.png"/>
                     <pic:cNvPicPr/>
                   </pic:nvPicPr>
                   <pic:blipFill>
@@ -2147,7 +2147,7 @@
               <a:graphicData uri="http://schemas.openxmlformats.org/drawingml/2006/picture">
                 <pic:pic>
                   <pic:nvPicPr>
-                    <pic:cNvPr id="0" name="tmpie8rmq84.png"/>
+                    <pic:cNvPr id="0" name="tmp4c7sumoj.png"/>
                     <pic:cNvPicPr/>
                   </pic:nvPicPr>
                   <pic:blipFill>
@@ -2203,7 +2203,7 @@
               <a:graphicData uri="http://schemas.openxmlformats.org/drawingml/2006/picture">
                 <pic:pic>
                   <pic:nvPicPr>
-                    <pic:cNvPr id="0" name="tmpyl35k4qz.png"/>
+                    <pic:cNvPr id="0" name="tmpre0tihs0.png"/>
                     <pic:cNvPicPr/>
                   </pic:nvPicPr>
                   <pic:blipFill>
@@ -2259,7 +2259,7 @@
               <a:graphicData uri="http://schemas.openxmlformats.org/drawingml/2006/picture">
                 <pic:pic>
                   <pic:nvPicPr>
-                    <pic:cNvPr id="0" name="tmpzrrosk84.png"/>
+                    <pic:cNvPr id="0" name="tmpoj5trvp8.png"/>
                     <pic:cNvPicPr/>
                   </pic:nvPicPr>
                   <pic:blipFill>
@@ -2366,7 +2366,7 @@
               <a:graphicData uri="http://schemas.openxmlformats.org/drawingml/2006/picture">
                 <pic:pic>
                   <pic:nvPicPr>
-                    <pic:cNvPr id="0" name="tmppctajb9j.png"/>
+                    <pic:cNvPr id="0" name="tmps0m6wyk6.png"/>
                     <pic:cNvPicPr/>
                   </pic:nvPicPr>
                   <pic:blipFill>
@@ -2473,7 +2473,7 @@
               <a:graphicData uri="http://schemas.openxmlformats.org/drawingml/2006/picture">
                 <pic:pic>
                   <pic:nvPicPr>
-                    <pic:cNvPr id="0" name="tmpl1uyng8v.png"/>
+                    <pic:cNvPr id="0" name="tmpsv5l2i5h.png"/>
                     <pic:cNvPicPr/>
                   </pic:nvPicPr>
                   <pic:blipFill>
@@ -2580,7 +2580,7 @@
               <a:graphicData uri="http://schemas.openxmlformats.org/drawingml/2006/picture">
                 <pic:pic>
                   <pic:nvPicPr>
-                    <pic:cNvPr id="0" name="tmp9lqq9vaz.png"/>
+                    <pic:cNvPr id="0" name="tmprdnf8lle.png"/>
                     <pic:cNvPicPr/>
                   </pic:nvPicPr>
                   <pic:blipFill>
@@ -2636,7 +2636,7 @@
               <a:graphicData uri="http://schemas.openxmlformats.org/drawingml/2006/picture">
                 <pic:pic>
                   <pic:nvPicPr>
-                    <pic:cNvPr id="0" name="tmp3fs_jnd5.png"/>
+                    <pic:cNvPr id="0" name="tmpfuuoqh1d.png"/>
                     <pic:cNvPicPr/>
                   </pic:nvPicPr>
                   <pic:blipFill>
@@ -2703,7 +2703,7 @@
               <a:graphicData uri="http://schemas.openxmlformats.org/drawingml/2006/picture">
                 <pic:pic>
                   <pic:nvPicPr>
-                    <pic:cNvPr id="0" name="tmpzls63but.png"/>
+                    <pic:cNvPr id="0" name="tmpiubi5b9z.png"/>
                     <pic:cNvPicPr/>
                   </pic:nvPicPr>
                   <pic:blipFill>
@@ -2769,7 +2769,7 @@
               <a:graphicData uri="http://schemas.openxmlformats.org/drawingml/2006/picture">
                 <pic:pic>
                   <pic:nvPicPr>
-                    <pic:cNvPr id="0" name="tmplm6jugq4.png"/>
+                    <pic:cNvPr id="0" name="tmpqwlu3qpo.png"/>
                     <pic:cNvPicPr/>
                   </pic:nvPicPr>
                   <pic:blipFill>
@@ -2834,7 +2834,7 @@
               <a:graphicData uri="http://schemas.openxmlformats.org/drawingml/2006/picture">
                 <pic:pic>
                   <pic:nvPicPr>
-                    <pic:cNvPr id="0" name="tmpbhr0ko1n.png"/>
+                    <pic:cNvPr id="0" name="tmp4z07m8gz.png"/>
                     <pic:cNvPicPr/>
                   </pic:nvPicPr>
                   <pic:blipFill>
@@ -2953,7 +2953,7 @@
               <a:graphicData uri="http://schemas.openxmlformats.org/drawingml/2006/picture">
                 <pic:pic>
                   <pic:nvPicPr>
-                    <pic:cNvPr id="0" name="tmpahb08vjl.png"/>
+                    <pic:cNvPr id="0" name="tmpe_wrd8kf.png"/>
                     <pic:cNvPicPr/>
                   </pic:nvPicPr>
                   <pic:blipFill>
@@ -3020,7 +3020,7 @@
               <a:graphicData uri="http://schemas.openxmlformats.org/drawingml/2006/picture">
                 <pic:pic>
                   <pic:nvPicPr>
-                    <pic:cNvPr id="0" name="tmpcjzvy3yk.png"/>
+                    <pic:cNvPr id="0" name="tmpwd1gyfut.png"/>
                     <pic:cNvPicPr/>
                   </pic:nvPicPr>
                   <pic:blipFill>
@@ -3157,7 +3157,7 @@
               <a:graphicData uri="http://schemas.openxmlformats.org/drawingml/2006/picture">
                 <pic:pic>
                   <pic:nvPicPr>
-                    <pic:cNvPr id="0" name="tmpy07e8w28.png"/>
+                    <pic:cNvPr id="0" name="tmpazhlo4gz.png"/>
                     <pic:cNvPicPr/>
                   </pic:nvPicPr>
                   <pic:blipFill>
@@ -3236,7 +3236,7 @@
               <a:graphicData uri="http://schemas.openxmlformats.org/drawingml/2006/picture">
                 <pic:pic>
                   <pic:nvPicPr>
-                    <pic:cNvPr id="0" name="tmpyfd3a89m.png"/>
+                    <pic:cNvPr id="0" name="tmplgx45m3m.png"/>
                     <pic:cNvPicPr/>
                   </pic:nvPicPr>
                   <pic:blipFill>
@@ -3303,7 +3303,7 @@
               <a:graphicData uri="http://schemas.openxmlformats.org/drawingml/2006/picture">
                 <pic:pic>
                   <pic:nvPicPr>
-                    <pic:cNvPr id="0" name="tmpv3p8i3s8.png"/>
+                    <pic:cNvPr id="0" name="tmplxqckjxj.png"/>
                     <pic:cNvPicPr/>
                   </pic:nvPicPr>
                   <pic:blipFill>
@@ -3359,7 +3359,7 @@
               <a:graphicData uri="http://schemas.openxmlformats.org/drawingml/2006/picture">
                 <pic:pic>
                   <pic:nvPicPr>
-                    <pic:cNvPr id="0" name="tmptp81e8mi.png"/>
+                    <pic:cNvPr id="0" name="tmpe01w8an6.png"/>
                     <pic:cNvPicPr/>
                   </pic:nvPicPr>
                   <pic:blipFill>
@@ -3426,7 +3426,7 @@
               <a:graphicData uri="http://schemas.openxmlformats.org/drawingml/2006/picture">
                 <pic:pic>
                   <pic:nvPicPr>
-                    <pic:cNvPr id="0" name="tmpxwydjvnq.png"/>
+                    <pic:cNvPr id="0" name="tmpv6tkgdsw.png"/>
                     <pic:cNvPicPr/>
                   </pic:nvPicPr>
                   <pic:blipFill>
@@ -3482,7 +3482,7 @@
               <a:graphicData uri="http://schemas.openxmlformats.org/drawingml/2006/picture">
                 <pic:pic>
                   <pic:nvPicPr>
-                    <pic:cNvPr id="0" name="tmpkvb6sww_.png"/>
+                    <pic:cNvPr id="0" name="tmpc3bb2e4i.png"/>
                     <pic:cNvPicPr/>
                   </pic:nvPicPr>
                   <pic:blipFill>
@@ -3538,7 +3538,7 @@
               <a:graphicData uri="http://schemas.openxmlformats.org/drawingml/2006/picture">
                 <pic:pic>
                   <pic:nvPicPr>
-                    <pic:cNvPr id="0" name="tmp_p85x67j.png"/>
+                    <pic:cNvPr id="0" name="tmp8893yxp6.png"/>
                     <pic:cNvPicPr/>
                   </pic:nvPicPr>
                   <pic:blipFill>
@@ -3594,7 +3594,7 @@
               <a:graphicData uri="http://schemas.openxmlformats.org/drawingml/2006/picture">
                 <pic:pic>
                   <pic:nvPicPr>
-                    <pic:cNvPr id="0" name="tmprc9j3c8z.png"/>
+                    <pic:cNvPr id="0" name="tmpf7w7ucs3.png"/>
                     <pic:cNvPicPr/>
                   </pic:nvPicPr>
                   <pic:blipFill>
@@ -3650,7 +3650,7 @@
               <a:graphicData uri="http://schemas.openxmlformats.org/drawingml/2006/picture">
                 <pic:pic>
                   <pic:nvPicPr>
-                    <pic:cNvPr id="0" name="tmpw5gwww7q.png"/>
+                    <pic:cNvPr id="0" name="tmpg4hbcv1e.png"/>
                     <pic:cNvPicPr/>
                   </pic:nvPicPr>
                   <pic:blipFill>
@@ -3706,7 +3706,7 @@
               <a:graphicData uri="http://schemas.openxmlformats.org/drawingml/2006/picture">
                 <pic:pic>
                   <pic:nvPicPr>
-                    <pic:cNvPr id="0" name="tmp_9mqfxf9.png"/>
+                    <pic:cNvPr id="0" name="tmppma9cogj.png"/>
                     <pic:cNvPicPr/>
                   </pic:nvPicPr>
                   <pic:blipFill>
@@ -4245,6 +4245,84 @@
     </w:p>
     <w:p>
       <w:r>
+        <w:t xml:space="preserve">A de </w:t>
+      </w:r>
+      <w:r>
+        <w:rPr>
+          <w:b/>
+        </w:rPr>
+        <w:t>Options Commodities</w:t>
+      </w:r>
+      <w:r>
+        <w:t xml:space="preserve"> lê o e-mail da mesa (*INTERNAL JPMorgan Trade</w:t>
+      </w:r>
+    </w:p>
+    <w:p>
+      <w:r>
+        <w:t xml:space="preserve">Recap … Unwind*), uma tabela por perna: </w:t>
+      </w:r>
+      <w:r>
+        <w:rPr>
+          <w:b/>
+        </w:rPr>
+        <w:t>Client</w:t>
+      </w:r>
+      <w:r>
+        <w:t xml:space="preserve"> (a operação com o cliente) e</w:t>
+      </w:r>
+    </w:p>
+    <w:p>
+      <w:r>
+        <w:rPr>
+          <w:b/>
+        </w:rPr>
+        <w:t>Banco</w:t>
+      </w:r>
+      <w:r>
+        <w:t xml:space="preserve"> (o B2B Banco × Lawton). O e-mail não traz o B3 ID — a coluna</w:t>
+      </w:r>
+    </w:p>
+    <w:p>
+      <w:r>
+        <w:t>*Contract* é o mês do futuro —, e cada perna é achada no Live Position pelas</w:t>
+      </w:r>
+    </w:p>
+    <w:p>
+      <w:r>
+        <w:t>características (strike, quantidade original, Call/Put), só entre os contratos</w:t>
+      </w:r>
+    </w:p>
+    <w:p>
+      <w:r>
+        <w:t>do seu tipo; nome do cliente e datas da opção desempatam, e mais de um</w:t>
+      </w:r>
+    </w:p>
+    <w:p>
+      <w:r>
+        <w:t>candidato deixa a linha sem B3 ID, avisando. Quantidade em unidades da</w:t>
+      </w:r>
+    </w:p>
+    <w:p>
+      <w:r>
+        <w:t xml:space="preserve">mercadoria; prêmio em USD por unidade e a paridade na coluna </w:t>
+      </w:r>
+      <w:r>
+        <w:rPr>
+          <w:b/>
+        </w:rPr>
+        <w:t>FX Rate</w:t>
+      </w:r>
+      <w:r>
+        <w:t>, como</w:t>
+      </w:r>
+    </w:p>
+    <w:p>
+      <w:r>
+        <w:t>vieram no e-mail; sinal do banco (no B2B, o contrário da perna Client).</w:t>
+      </w:r>
+    </w:p>
+    <w:p>
+      <w:r>
         <w:rPr>
           <w:b/>
         </w:rPr>
@@ -4337,7 +4415,7 @@
               <a:graphicData uri="http://schemas.openxmlformats.org/drawingml/2006/picture">
                 <pic:pic>
                   <pic:nvPicPr>
-                    <pic:cNvPr id="0" name="tmphzf7ccw2.png"/>
+                    <pic:cNvPr id="0" name="tmp7wm10nlf.png"/>
                     <pic:cNvPicPr/>
                   </pic:nvPicPr>
                   <pic:blipFill>
@@ -4393,7 +4471,7 @@
               <a:graphicData uri="http://schemas.openxmlformats.org/drawingml/2006/picture">
                 <pic:pic>
                   <pic:nvPicPr>
-                    <pic:cNvPr id="0" name="tmpwux92tgh.png"/>
+                    <pic:cNvPr id="0" name="tmpg9yz_jay.png"/>
                     <pic:cNvPicPr/>
                   </pic:nvPicPr>
                   <pic:blipFill>
@@ -4496,7 +4574,7 @@
               <a:graphicData uri="http://schemas.openxmlformats.org/drawingml/2006/picture">
                 <pic:pic>
                   <pic:nvPicPr>
-                    <pic:cNvPr id="0" name="tmp55wssinp.png"/>
+                    <pic:cNvPr id="0" name="tmpcxjmhk2j.png"/>
                     <pic:cNvPicPr/>
                   </pic:nvPicPr>
                   <pic:blipFill>
@@ -4581,7 +4659,7 @@
               <a:graphicData uri="http://schemas.openxmlformats.org/drawingml/2006/picture">
                 <pic:pic>
                   <pic:nvPicPr>
-                    <pic:cNvPr id="0" name="tmp9m579rex.png"/>
+                    <pic:cNvPr id="0" name="tmplw1bdttd.png"/>
                     <pic:cNvPicPr/>
                   </pic:nvPicPr>
                   <pic:blipFill>
@@ -4637,7 +4715,7 @@
               <a:graphicData uri="http://schemas.openxmlformats.org/drawingml/2006/picture">
                 <pic:pic>
                   <pic:nvPicPr>
-                    <pic:cNvPr id="0" name="tmpsjzourwg.png"/>
+                    <pic:cNvPr id="0" name="tmp60a92u9g.png"/>
                     <pic:cNvPicPr/>
                   </pic:nvPicPr>
                   <pic:blipFill>
@@ -4693,7 +4771,7 @@
               <a:graphicData uri="http://schemas.openxmlformats.org/drawingml/2006/picture">
                 <pic:pic>
                   <pic:nvPicPr>
-                    <pic:cNvPr id="0" name="tmp6m27f9in.png"/>
+                    <pic:cNvPr id="0" name="tmp9m6vf6_1.png"/>
                     <pic:cNvPicPr/>
                   </pic:nvPicPr>
                   <pic:blipFill>
@@ -4749,7 +4827,7 @@
               <a:graphicData uri="http://schemas.openxmlformats.org/drawingml/2006/picture">
                 <pic:pic>
                   <pic:nvPicPr>
-                    <pic:cNvPr id="0" name="tmprim_5q37.png"/>
+                    <pic:cNvPr id="0" name="tmpvh11have.png"/>
                     <pic:cNvPicPr/>
                   </pic:nvPicPr>
                   <pic:blipFill>
@@ -4805,7 +4883,7 @@
               <a:graphicData uri="http://schemas.openxmlformats.org/drawingml/2006/picture">
                 <pic:pic>
                   <pic:nvPicPr>
-                    <pic:cNvPr id="0" name="tmpn5y397__.png"/>
+                    <pic:cNvPr id="0" name="tmpsr_t5_zm.png"/>
                     <pic:cNvPicPr/>
                   </pic:nvPicPr>
                   <pic:blipFill>

</xml_diff>

<commit_message>
docs: HANDOFF §640-§641, CLAUDE.md, Guia e SOP com a recompra pela API e o Send na cor padrão
O Guia (5.10) e o SOP passam a dizer que a recompra de NDF FX entra pela API
de liquidação, sozinha de 30 em 30 minutos ou no Import com o dropzone vazio,
só as novas, com o e-mail como plano B no dropzone — e que ele não é mais
arquivado na pasta Unwind. O CLAUDE.md troca as regras da varredura do box
pelas do pull (D0 + D+1, só a nova, leitura estrita, o sinal do Settlement
Quantity ainda com uma amostra só), a linha Unwinds × NDF do api-links e o
Contrail sobre a cor do botão.

Co-Authored-By: Claude Opus 5.5 (1M context) <noreply@anthropic.com>
</commit_message>
<xml_diff>
--- a/SOP_PROCESSAMENTO_OTC.docx
+++ b/SOP_PROCESSAMENTO_OTC.docx
@@ -476,7 +476,7 @@
               <a:graphicData uri="http://schemas.openxmlformats.org/drawingml/2006/picture">
                 <pic:pic>
                   <pic:nvPicPr>
-                    <pic:cNvPr id="0" name="tmpep0mwkr1.png"/>
+                    <pic:cNvPr id="0" name="tmp2u9b6sez.png"/>
                     <pic:cNvPicPr/>
                   </pic:nvPicPr>
                   <pic:blipFill>
@@ -536,7 +536,7 @@
               <a:graphicData uri="http://schemas.openxmlformats.org/drawingml/2006/picture">
                 <pic:pic>
                   <pic:nvPicPr>
-                    <pic:cNvPr id="0" name="tmpzpmdje1x.png"/>
+                    <pic:cNvPr id="0" name="tmp8_e3el2b.png"/>
                     <pic:cNvPicPr/>
                   </pic:nvPicPr>
                   <pic:blipFill>
@@ -596,7 +596,7 @@
               <a:graphicData uri="http://schemas.openxmlformats.org/drawingml/2006/picture">
                 <pic:pic>
                   <pic:nvPicPr>
-                    <pic:cNvPr id="0" name="tmpf5zwv66h.png"/>
+                    <pic:cNvPr id="0" name="tmpkhg76qqb.png"/>
                     <pic:cNvPicPr/>
                   </pic:nvPicPr>
                   <pic:blipFill>
@@ -656,7 +656,7 @@
               <a:graphicData uri="http://schemas.openxmlformats.org/drawingml/2006/picture">
                 <pic:pic>
                   <pic:nvPicPr>
-                    <pic:cNvPr id="0" name="tmps0m6wyk6.png"/>
+                    <pic:cNvPr id="0" name="tmpz4a_2khv.png"/>
                     <pic:cNvPicPr/>
                   </pic:nvPicPr>
                   <pic:blipFill>
@@ -716,7 +716,7 @@
               <a:graphicData uri="http://schemas.openxmlformats.org/drawingml/2006/picture">
                 <pic:pic>
                   <pic:nvPicPr>
-                    <pic:cNvPr id="0" name="tmpe01w8an6.png"/>
+                    <pic:cNvPr id="0" name="tmpc8wuqlgd.png"/>
                     <pic:cNvPicPr/>
                   </pic:nvPicPr>
                   <pic:blipFill>
@@ -959,7 +959,7 @@
               <a:graphicData uri="http://schemas.openxmlformats.org/drawingml/2006/picture">
                 <pic:pic>
                   <pic:nvPicPr>
-                    <pic:cNvPr id="0" name="tmpd3ue4mxr.png"/>
+                    <pic:cNvPr id="0" name="tmp80rgizcs.png"/>
                     <pic:cNvPicPr/>
                   </pic:nvPicPr>
                   <pic:blipFill>
@@ -1015,7 +1015,7 @@
               <a:graphicData uri="http://schemas.openxmlformats.org/drawingml/2006/picture">
                 <pic:pic>
                   <pic:nvPicPr>
-                    <pic:cNvPr id="0" name="tmpe4m1kkzk.png"/>
+                    <pic:cNvPr id="0" name="tmp39dsw_3h.png"/>
                     <pic:cNvPicPr/>
                   </pic:nvPicPr>
                   <pic:blipFill>
@@ -1143,7 +1143,7 @@
               <a:graphicData uri="http://schemas.openxmlformats.org/drawingml/2006/picture">
                 <pic:pic>
                   <pic:nvPicPr>
-                    <pic:cNvPr id="0" name="tmpkp2idc5w.png"/>
+                    <pic:cNvPr id="0" name="tmpvci67303.png"/>
                     <pic:cNvPicPr/>
                   </pic:nvPicPr>
                   <pic:blipFill>
@@ -1208,7 +1208,7 @@
               <a:graphicData uri="http://schemas.openxmlformats.org/drawingml/2006/picture">
                 <pic:pic>
                   <pic:nvPicPr>
-                    <pic:cNvPr id="0" name="tmpeszzw7ph.png"/>
+                    <pic:cNvPr id="0" name="tmpwr8c48uu.png"/>
                     <pic:cNvPicPr/>
                   </pic:nvPicPr>
                   <pic:blipFill>
@@ -1513,7 +1513,7 @@
               <a:graphicData uri="http://schemas.openxmlformats.org/drawingml/2006/picture">
                 <pic:pic>
                   <pic:nvPicPr>
-                    <pic:cNvPr id="0" name="tmpep0mwkr1.png"/>
+                    <pic:cNvPr id="0" name="tmp2u9b6sez.png"/>
                     <pic:cNvPicPr/>
                   </pic:nvPicPr>
                   <pic:blipFill>
@@ -1899,7 +1899,7 @@
               <a:graphicData uri="http://schemas.openxmlformats.org/drawingml/2006/picture">
                 <pic:pic>
                   <pic:nvPicPr>
-                    <pic:cNvPr id="0" name="tmpf5zwv66h.png"/>
+                    <pic:cNvPr id="0" name="tmpkhg76qqb.png"/>
                     <pic:cNvPicPr/>
                   </pic:nvPicPr>
                   <pic:blipFill>
@@ -1955,7 +1955,7 @@
               <a:graphicData uri="http://schemas.openxmlformats.org/drawingml/2006/picture">
                 <pic:pic>
                   <pic:nvPicPr>
-                    <pic:cNvPr id="0" name="tmpzpmdje1x.png"/>
+                    <pic:cNvPr id="0" name="tmp8_e3el2b.png"/>
                     <pic:cNvPicPr/>
                   </pic:nvPicPr>
                   <pic:blipFill>
@@ -2147,7 +2147,7 @@
               <a:graphicData uri="http://schemas.openxmlformats.org/drawingml/2006/picture">
                 <pic:pic>
                   <pic:nvPicPr>
-                    <pic:cNvPr id="0" name="tmp4c7sumoj.png"/>
+                    <pic:cNvPr id="0" name="tmp_11at3cz.png"/>
                     <pic:cNvPicPr/>
                   </pic:nvPicPr>
                   <pic:blipFill>
@@ -2203,7 +2203,7 @@
               <a:graphicData uri="http://schemas.openxmlformats.org/drawingml/2006/picture">
                 <pic:pic>
                   <pic:nvPicPr>
-                    <pic:cNvPr id="0" name="tmpre0tihs0.png"/>
+                    <pic:cNvPr id="0" name="tmp258ynouq.png"/>
                     <pic:cNvPicPr/>
                   </pic:nvPicPr>
                   <pic:blipFill>
@@ -2259,7 +2259,7 @@
               <a:graphicData uri="http://schemas.openxmlformats.org/drawingml/2006/picture">
                 <pic:pic>
                   <pic:nvPicPr>
-                    <pic:cNvPr id="0" name="tmpoj5trvp8.png"/>
+                    <pic:cNvPr id="0" name="tmp2xvipl_t.png"/>
                     <pic:cNvPicPr/>
                   </pic:nvPicPr>
                   <pic:blipFill>
@@ -2366,7 +2366,7 @@
               <a:graphicData uri="http://schemas.openxmlformats.org/drawingml/2006/picture">
                 <pic:pic>
                   <pic:nvPicPr>
-                    <pic:cNvPr id="0" name="tmps0m6wyk6.png"/>
+                    <pic:cNvPr id="0" name="tmpz4a_2khv.png"/>
                     <pic:cNvPicPr/>
                   </pic:nvPicPr>
                   <pic:blipFill>
@@ -2473,7 +2473,7 @@
               <a:graphicData uri="http://schemas.openxmlformats.org/drawingml/2006/picture">
                 <pic:pic>
                   <pic:nvPicPr>
-                    <pic:cNvPr id="0" name="tmpsv5l2i5h.png"/>
+                    <pic:cNvPr id="0" name="tmpnfijc7qf.png"/>
                     <pic:cNvPicPr/>
                   </pic:nvPicPr>
                   <pic:blipFill>
@@ -2580,7 +2580,7 @@
               <a:graphicData uri="http://schemas.openxmlformats.org/drawingml/2006/picture">
                 <pic:pic>
                   <pic:nvPicPr>
-                    <pic:cNvPr id="0" name="tmprdnf8lle.png"/>
+                    <pic:cNvPr id="0" name="tmpe7t1o790.png"/>
                     <pic:cNvPicPr/>
                   </pic:nvPicPr>
                   <pic:blipFill>
@@ -2636,7 +2636,7 @@
               <a:graphicData uri="http://schemas.openxmlformats.org/drawingml/2006/picture">
                 <pic:pic>
                   <pic:nvPicPr>
-                    <pic:cNvPr id="0" name="tmpfuuoqh1d.png"/>
+                    <pic:cNvPr id="0" name="tmpqp4ukisu.png"/>
                     <pic:cNvPicPr/>
                   </pic:nvPicPr>
                   <pic:blipFill>
@@ -2703,7 +2703,7 @@
               <a:graphicData uri="http://schemas.openxmlformats.org/drawingml/2006/picture">
                 <pic:pic>
                   <pic:nvPicPr>
-                    <pic:cNvPr id="0" name="tmpiubi5b9z.png"/>
+                    <pic:cNvPr id="0" name="tmpd38__v11.png"/>
                     <pic:cNvPicPr/>
                   </pic:nvPicPr>
                   <pic:blipFill>
@@ -2769,7 +2769,7 @@
               <a:graphicData uri="http://schemas.openxmlformats.org/drawingml/2006/picture">
                 <pic:pic>
                   <pic:nvPicPr>
-                    <pic:cNvPr id="0" name="tmpqwlu3qpo.png"/>
+                    <pic:cNvPr id="0" name="tmp_ofu383u.png"/>
                     <pic:cNvPicPr/>
                   </pic:nvPicPr>
                   <pic:blipFill>
@@ -2834,7 +2834,7 @@
               <a:graphicData uri="http://schemas.openxmlformats.org/drawingml/2006/picture">
                 <pic:pic>
                   <pic:nvPicPr>
-                    <pic:cNvPr id="0" name="tmp4z07m8gz.png"/>
+                    <pic:cNvPr id="0" name="tmpvk02tug5.png"/>
                     <pic:cNvPicPr/>
                   </pic:nvPicPr>
                   <pic:blipFill>
@@ -2953,7 +2953,7 @@
               <a:graphicData uri="http://schemas.openxmlformats.org/drawingml/2006/picture">
                 <pic:pic>
                   <pic:nvPicPr>
-                    <pic:cNvPr id="0" name="tmpe_wrd8kf.png"/>
+                    <pic:cNvPr id="0" name="tmpimactrm4.png"/>
                     <pic:cNvPicPr/>
                   </pic:nvPicPr>
                   <pic:blipFill>
@@ -3020,7 +3020,7 @@
               <a:graphicData uri="http://schemas.openxmlformats.org/drawingml/2006/picture">
                 <pic:pic>
                   <pic:nvPicPr>
-                    <pic:cNvPr id="0" name="tmpwd1gyfut.png"/>
+                    <pic:cNvPr id="0" name="tmp52zimmel.png"/>
                     <pic:cNvPicPr/>
                   </pic:nvPicPr>
                   <pic:blipFill>
@@ -3157,7 +3157,7 @@
               <a:graphicData uri="http://schemas.openxmlformats.org/drawingml/2006/picture">
                 <pic:pic>
                   <pic:nvPicPr>
-                    <pic:cNvPr id="0" name="tmpazhlo4gz.png"/>
+                    <pic:cNvPr id="0" name="tmpj5tg83b0.png"/>
                     <pic:cNvPicPr/>
                   </pic:nvPicPr>
                   <pic:blipFill>
@@ -3236,7 +3236,7 @@
               <a:graphicData uri="http://schemas.openxmlformats.org/drawingml/2006/picture">
                 <pic:pic>
                   <pic:nvPicPr>
-                    <pic:cNvPr id="0" name="tmplgx45m3m.png"/>
+                    <pic:cNvPr id="0" name="tmpk0zs2vci.png"/>
                     <pic:cNvPicPr/>
                   </pic:nvPicPr>
                   <pic:blipFill>
@@ -3303,7 +3303,7 @@
               <a:graphicData uri="http://schemas.openxmlformats.org/drawingml/2006/picture">
                 <pic:pic>
                   <pic:nvPicPr>
-                    <pic:cNvPr id="0" name="tmplxqckjxj.png"/>
+                    <pic:cNvPr id="0" name="tmpq7mhb84x.png"/>
                     <pic:cNvPicPr/>
                   </pic:nvPicPr>
                   <pic:blipFill>
@@ -3359,7 +3359,7 @@
               <a:graphicData uri="http://schemas.openxmlformats.org/drawingml/2006/picture">
                 <pic:pic>
                   <pic:nvPicPr>
-                    <pic:cNvPr id="0" name="tmpe01w8an6.png"/>
+                    <pic:cNvPr id="0" name="tmpc8wuqlgd.png"/>
                     <pic:cNvPicPr/>
                   </pic:nvPicPr>
                   <pic:blipFill>
@@ -3426,7 +3426,7 @@
               <a:graphicData uri="http://schemas.openxmlformats.org/drawingml/2006/picture">
                 <pic:pic>
                   <pic:nvPicPr>
-                    <pic:cNvPr id="0" name="tmpv6tkgdsw.png"/>
+                    <pic:cNvPr id="0" name="tmp69437fny.png"/>
                     <pic:cNvPicPr/>
                   </pic:nvPicPr>
                   <pic:blipFill>
@@ -3482,7 +3482,7 @@
               <a:graphicData uri="http://schemas.openxmlformats.org/drawingml/2006/picture">
                 <pic:pic>
                   <pic:nvPicPr>
-                    <pic:cNvPr id="0" name="tmpc3bb2e4i.png"/>
+                    <pic:cNvPr id="0" name="tmplhio7v8u.png"/>
                     <pic:cNvPicPr/>
                   </pic:nvPicPr>
                   <pic:blipFill>
@@ -3538,7 +3538,7 @@
               <a:graphicData uri="http://schemas.openxmlformats.org/drawingml/2006/picture">
                 <pic:pic>
                   <pic:nvPicPr>
-                    <pic:cNvPr id="0" name="tmp8893yxp6.png"/>
+                    <pic:cNvPr id="0" name="tmphag25kk0.png"/>
                     <pic:cNvPicPr/>
                   </pic:nvPicPr>
                   <pic:blipFill>
@@ -3594,7 +3594,7 @@
               <a:graphicData uri="http://schemas.openxmlformats.org/drawingml/2006/picture">
                 <pic:pic>
                   <pic:nvPicPr>
-                    <pic:cNvPr id="0" name="tmpf7w7ucs3.png"/>
+                    <pic:cNvPr id="0" name="tmp_38kxbki.png"/>
                     <pic:cNvPicPr/>
                   </pic:nvPicPr>
                   <pic:blipFill>
@@ -3650,7 +3650,7 @@
               <a:graphicData uri="http://schemas.openxmlformats.org/drawingml/2006/picture">
                 <pic:pic>
                   <pic:nvPicPr>
-                    <pic:cNvPr id="0" name="tmpg4hbcv1e.png"/>
+                    <pic:cNvPr id="0" name="tmpynp0a328.png"/>
                     <pic:cNvPicPr/>
                   </pic:nvPicPr>
                   <pic:blipFill>
@@ -3706,7 +3706,7 @@
               <a:graphicData uri="http://schemas.openxmlformats.org/drawingml/2006/picture">
                 <pic:pic>
                   <pic:nvPicPr>
-                    <pic:cNvPr id="0" name="tmppma9cogj.png"/>
+                    <pic:cNvPr id="0" name="tmprirgirbi.png"/>
                     <pic:cNvPicPr/>
                   </pic:nvPicPr>
                   <pic:blipFill>
@@ -3754,63 +3754,76 @@
     </w:p>
     <w:p>
       <w:r>
-        <w:t>Recompra (antecipação) de termo de moeda já registrado na B3. O aviso do Athena</w:t>
+        <w:t>Recompra (antecipação) de termo de moeda já registrado na B3 — processo</w:t>
       </w:r>
     </w:p>
     <w:p>
       <w:r>
-        <w:t>(*BRL NDF Unwind Notification*) chega por e-mail durante o dia — processo</w:t>
+        <w:t>SEPARADO do lote de liquidação da manhã. A recompra entra pela **API de</w:t>
       </w:r>
     </w:p>
     <w:p>
       <w:r>
-        <w:t>SEPARADO do lote de liquidação da manhã. A tela importa o e-mail (arrastado do</w:t>
+        <w:t>liquidação do Athena</w:t>
+      </w:r>
+      <w:r>
+        <w:rPr>
+          <w:b/>
+        </w:rPr>
+        <w:t xml:space="preserve"> (a mesma do NDF Cockpit), que traz o </w:t>
+      </w:r>
+      <w:r>
+        <w:t>B3 ID** do</w:t>
       </w:r>
     </w:p>
     <w:p>
       <w:r>
-        <w:t xml:space="preserve">Outlook como </w:t>
-      </w:r>
-      <w:r>
-        <w:rPr>
-          <w:rFonts w:ascii="Consolas" w:hAnsi="Consolas"/>
-          <w:color w:val="B03060"/>
-        </w:rPr>
-        <w:t>.msg</w:t>
-      </w:r>
-      <w:r>
-        <w:t>/</w:t>
-      </w:r>
-      <w:r>
-        <w:rPr>
-          <w:rFonts w:ascii="Consolas" w:hAnsi="Consolas"/>
-          <w:color w:val="B03060"/>
-        </w:rPr>
-        <w:t>.eml</w:t>
-      </w:r>
-      <w:r>
-        <w:t>, ou pela varredura automática do box de 30 em 30</w:t>
+        <w:t>contrato: a tela a puxa sozinha de 30 em 30 minutos, das 08h às 20h, ou no</w:t>
       </w:r>
     </w:p>
     <w:p>
       <w:r>
-        <w:t>minutos), casa a operação com o Live Position de NDF pelo identificador,</w:t>
+        <w:rPr>
+          <w:b/>
+        </w:rPr>
+        <w:t>Import</w:t>
+      </w:r>
+      <w:r>
+        <w:t xml:space="preserve"> com o dropzone vazio. Ela pede a data e o dia útil seguinte e grava</w:t>
       </w:r>
     </w:p>
     <w:p>
       <w:r>
-        <w:rPr>
-          <w:b/>
-        </w:rPr>
-        <w:t>confere o resultado apurado</w:t>
-      </w:r>
-      <w:r>
-        <w:t xml:space="preserve"> e monta o arquivo TER 0014 (antecipação de</w:t>
+        <w:t>só as recompras novas. A tela casa a operação com o Live Position de NDF pelo</w:t>
       </w:r>
     </w:p>
     <w:p>
       <w:r>
-        <w:t>contrato a termo, 133 caracteres) para o Batch Conecta.</w:t>
+        <w:t xml:space="preserve">B3 ID, </w:t>
+      </w:r>
+      <w:r>
+        <w:rPr>
+          <w:b/>
+        </w:rPr>
+        <w:t>confere o resultado apurado</w:t>
+      </w:r>
+      <w:r>
+        <w:t xml:space="preserve"> e monta o arquivo TER 0014 (antecipação</w:t>
+      </w:r>
+    </w:p>
+    <w:p>
+      <w:r>
+        <w:t>de contrato a termo, 133 caracteres) para o Batch Conecta. O e-mail do Athena</w:t>
+      </w:r>
+    </w:p>
+    <w:p>
+      <w:r>
+        <w:t>(*BRL NDF Unwind Notification*) fica como plano B: arrastado para o dropzone</w:t>
+      </w:r>
+    </w:p>
+    <w:p>
+      <w:r>
+        <w:t>quando a API não responder.</w:t>
       </w:r>
     </w:p>
     <w:p>
@@ -4415,7 +4428,7 @@
               <a:graphicData uri="http://schemas.openxmlformats.org/drawingml/2006/picture">
                 <pic:pic>
                   <pic:nvPicPr>
-                    <pic:cNvPr id="0" name="tmp7wm10nlf.png"/>
+                    <pic:cNvPr id="0" name="tmpos3wkgz5.png"/>
                     <pic:cNvPicPr/>
                   </pic:nvPicPr>
                   <pic:blipFill>
@@ -4471,7 +4484,7 @@
               <a:graphicData uri="http://schemas.openxmlformats.org/drawingml/2006/picture">
                 <pic:pic>
                   <pic:nvPicPr>
-                    <pic:cNvPr id="0" name="tmpg9yz_jay.png"/>
+                    <pic:cNvPr id="0" name="tmpsdcwx5yz.png"/>
                     <pic:cNvPicPr/>
                   </pic:nvPicPr>
                   <pic:blipFill>
@@ -4574,7 +4587,7 @@
               <a:graphicData uri="http://schemas.openxmlformats.org/drawingml/2006/picture">
                 <pic:pic>
                   <pic:nvPicPr>
-                    <pic:cNvPr id="0" name="tmpcxjmhk2j.png"/>
+                    <pic:cNvPr id="0" name="tmpzcnw_yb6.png"/>
                     <pic:cNvPicPr/>
                   </pic:nvPicPr>
                   <pic:blipFill>
@@ -4659,7 +4672,7 @@
               <a:graphicData uri="http://schemas.openxmlformats.org/drawingml/2006/picture">
                 <pic:pic>
                   <pic:nvPicPr>
-                    <pic:cNvPr id="0" name="tmplw1bdttd.png"/>
+                    <pic:cNvPr id="0" name="tmpaunkfjh5.png"/>
                     <pic:cNvPicPr/>
                   </pic:nvPicPr>
                   <pic:blipFill>
@@ -4715,7 +4728,7 @@
               <a:graphicData uri="http://schemas.openxmlformats.org/drawingml/2006/picture">
                 <pic:pic>
                   <pic:nvPicPr>
-                    <pic:cNvPr id="0" name="tmp60a92u9g.png"/>
+                    <pic:cNvPr id="0" name="tmptjr1zksa.png"/>
                     <pic:cNvPicPr/>
                   </pic:nvPicPr>
                   <pic:blipFill>
@@ -4771,7 +4784,7 @@
               <a:graphicData uri="http://schemas.openxmlformats.org/drawingml/2006/picture">
                 <pic:pic>
                   <pic:nvPicPr>
-                    <pic:cNvPr id="0" name="tmp9m6vf6_1.png"/>
+                    <pic:cNvPr id="0" name="tmp1wxrtyyi.png"/>
                     <pic:cNvPicPr/>
                   </pic:nvPicPr>
                   <pic:blipFill>
@@ -4827,7 +4840,7 @@
               <a:graphicData uri="http://schemas.openxmlformats.org/drawingml/2006/picture">
                 <pic:pic>
                   <pic:nvPicPr>
-                    <pic:cNvPr id="0" name="tmpvh11have.png"/>
+                    <pic:cNvPr id="0" name="tmpihxb4dul.png"/>
                     <pic:cNvPicPr/>
                   </pic:nvPicPr>
                   <pic:blipFill>
@@ -4883,7 +4896,7 @@
               <a:graphicData uri="http://schemas.openxmlformats.org/drawingml/2006/picture">
                 <pic:pic>
                   <pic:nvPicPr>
-                    <pic:cNvPr id="0" name="tmpsr_t5_zm.png"/>
+                    <pic:cNvPr id="0" name="tmpz3fih7dx.png"/>
                     <pic:cNvPicPr/>
                   </pic:nvPicPr>
                   <pic:blipFill>

</xml_diff>

<commit_message>
docs: HANDOFF §642-§643, CLAUDE.md, Guia e SOP com o Send em lote e a Return do Save CETIP Files
O Guia (4.10) diz que o Send da linha e o da barra mostram o envio — o avião
decola e o botão só fica verde com "Sent" quando o servidor confirma. O Guia,
o SOP e o CLAUDE.md passam a dizer que o Save CETIP Files pega os crus na
pasta Batch Conecta › Return, guarda os originais na origem do dia, salva os
pedidos no destino e os tira da Return sem tocar nos retornos de registro. O
README dos testes registra o check_send_contrail e o check_cetip_return.

Co-Authored-By: Claude Opus 5.5 (1M context) <noreply@anthropic.com>
</commit_message>
<xml_diff>
--- a/SOP_PROCESSAMENTO_OTC.docx
+++ b/SOP_PROCESSAMENTO_OTC.docx
@@ -476,7 +476,7 @@
               <a:graphicData uri="http://schemas.openxmlformats.org/drawingml/2006/picture">
                 <pic:pic>
                   <pic:nvPicPr>
-                    <pic:cNvPr id="0" name="tmp2u9b6sez.png"/>
+                    <pic:cNvPr id="0" name="tmp3taaxqy9.png"/>
                     <pic:cNvPicPr/>
                   </pic:nvPicPr>
                   <pic:blipFill>
@@ -536,7 +536,7 @@
               <a:graphicData uri="http://schemas.openxmlformats.org/drawingml/2006/picture">
                 <pic:pic>
                   <pic:nvPicPr>
-                    <pic:cNvPr id="0" name="tmp8_e3el2b.png"/>
+                    <pic:cNvPr id="0" name="tmpqm4o571a.png"/>
                     <pic:cNvPicPr/>
                   </pic:nvPicPr>
                   <pic:blipFill>
@@ -596,7 +596,7 @@
               <a:graphicData uri="http://schemas.openxmlformats.org/drawingml/2006/picture">
                 <pic:pic>
                   <pic:nvPicPr>
-                    <pic:cNvPr id="0" name="tmpkhg76qqb.png"/>
+                    <pic:cNvPr id="0" name="tmp5nnbnwqf.png"/>
                     <pic:cNvPicPr/>
                   </pic:nvPicPr>
                   <pic:blipFill>
@@ -656,7 +656,7 @@
               <a:graphicData uri="http://schemas.openxmlformats.org/drawingml/2006/picture">
                 <pic:pic>
                   <pic:nvPicPr>
-                    <pic:cNvPr id="0" name="tmpz4a_2khv.png"/>
+                    <pic:cNvPr id="0" name="tmpv0pchyxj.png"/>
                     <pic:cNvPicPr/>
                   </pic:nvPicPr>
                   <pic:blipFill>
@@ -716,7 +716,7 @@
               <a:graphicData uri="http://schemas.openxmlformats.org/drawingml/2006/picture">
                 <pic:pic>
                   <pic:nvPicPr>
-                    <pic:cNvPr id="0" name="tmpc8wuqlgd.png"/>
+                    <pic:cNvPr id="0" name="tmplqg22c4n.png"/>
                     <pic:cNvPicPr/>
                   </pic:nvPicPr>
                   <pic:blipFill>
@@ -959,7 +959,7 @@
               <a:graphicData uri="http://schemas.openxmlformats.org/drawingml/2006/picture">
                 <pic:pic>
                   <pic:nvPicPr>
-                    <pic:cNvPr id="0" name="tmp80rgizcs.png"/>
+                    <pic:cNvPr id="0" name="tmp8bvprebx.png"/>
                     <pic:cNvPicPr/>
                   </pic:nvPicPr>
                   <pic:blipFill>
@@ -1015,7 +1015,7 @@
               <a:graphicData uri="http://schemas.openxmlformats.org/drawingml/2006/picture">
                 <pic:pic>
                   <pic:nvPicPr>
-                    <pic:cNvPr id="0" name="tmp39dsw_3h.png"/>
+                    <pic:cNvPr id="0" name="tmpx6jjc_1p.png"/>
                     <pic:cNvPicPr/>
                   </pic:nvPicPr>
                   <pic:blipFill>
@@ -1143,7 +1143,7 @@
               <a:graphicData uri="http://schemas.openxmlformats.org/drawingml/2006/picture">
                 <pic:pic>
                   <pic:nvPicPr>
-                    <pic:cNvPr id="0" name="tmpvci67303.png"/>
+                    <pic:cNvPr id="0" name="tmpq3m5djxl.png"/>
                     <pic:cNvPicPr/>
                   </pic:nvPicPr>
                   <pic:blipFill>
@@ -1208,7 +1208,7 @@
               <a:graphicData uri="http://schemas.openxmlformats.org/drawingml/2006/picture">
                 <pic:pic>
                   <pic:nvPicPr>
-                    <pic:cNvPr id="0" name="tmpwr8c48uu.png"/>
+                    <pic:cNvPr id="0" name="tmp7p_vxc5s.png"/>
                     <pic:cNvPicPr/>
                   </pic:nvPicPr>
                   <pic:blipFill>
@@ -1319,7 +1319,27 @@
           </w:tcPr>
           <w:p>
             <w:r>
-              <w:t xml:space="preserve">Save CETIP Files (lê os arquivos brutos da B3, renomeia no padrão e salva nas pastas de liquidação; o </w:t>
+              <w:t xml:space="preserve">Save CETIP Files (pega os arquivos brutos da B3 na pasta </w:t>
+            </w:r>
+            <w:r>
+              <w:rPr>
+                <w:rFonts w:ascii="Consolas" w:hAnsi="Consolas"/>
+                <w:color w:val="B03060"/>
+              </w:rPr>
+              <w:t>Batch Conecta › Return</w:t>
+            </w:r>
+            <w:r>
+              <w:t xml:space="preserve"> — compactados, no nome </w:t>
+            </w:r>
+            <w:r>
+              <w:rPr>
+                <w:rFonts w:ascii="Consolas" w:hAnsi="Consolas"/>
+                <w:color w:val="B03060"/>
+              </w:rPr>
+              <w:t>73760_&lt;sistema&gt;_&lt;data&gt;_SP_&lt;arquivo&gt;</w:t>
+            </w:r>
+            <w:r>
+              <w:t xml:space="preserve"> —, guarda os originais na pasta de origem do dia, renomeia no padrão e salva nas pastas de liquidação, e tira da Return os que trouxe; o </w:t>
             </w:r>
             <w:r>
               <w:rPr>
@@ -1513,7 +1533,7 @@
               <a:graphicData uri="http://schemas.openxmlformats.org/drawingml/2006/picture">
                 <pic:pic>
                   <pic:nvPicPr>
-                    <pic:cNvPr id="0" name="tmp2u9b6sez.png"/>
+                    <pic:cNvPr id="0" name="tmp3taaxqy9.png"/>
                     <pic:cNvPicPr/>
                   </pic:nvPicPr>
                   <pic:blipFill>
@@ -1899,7 +1919,7 @@
               <a:graphicData uri="http://schemas.openxmlformats.org/drawingml/2006/picture">
                 <pic:pic>
                   <pic:nvPicPr>
-                    <pic:cNvPr id="0" name="tmpkhg76qqb.png"/>
+                    <pic:cNvPr id="0" name="tmp5nnbnwqf.png"/>
                     <pic:cNvPicPr/>
                   </pic:nvPicPr>
                   <pic:blipFill>
@@ -1955,7 +1975,7 @@
               <a:graphicData uri="http://schemas.openxmlformats.org/drawingml/2006/picture">
                 <pic:pic>
                   <pic:nvPicPr>
-                    <pic:cNvPr id="0" name="tmp8_e3el2b.png"/>
+                    <pic:cNvPr id="0" name="tmpqm4o571a.png"/>
                     <pic:cNvPicPr/>
                   </pic:nvPicPr>
                   <pic:blipFill>
@@ -2147,7 +2167,7 @@
               <a:graphicData uri="http://schemas.openxmlformats.org/drawingml/2006/picture">
                 <pic:pic>
                   <pic:nvPicPr>
-                    <pic:cNvPr id="0" name="tmp_11at3cz.png"/>
+                    <pic:cNvPr id="0" name="tmpc8w32ljx.png"/>
                     <pic:cNvPicPr/>
                   </pic:nvPicPr>
                   <pic:blipFill>
@@ -2203,7 +2223,7 @@
               <a:graphicData uri="http://schemas.openxmlformats.org/drawingml/2006/picture">
                 <pic:pic>
                   <pic:nvPicPr>
-                    <pic:cNvPr id="0" name="tmp258ynouq.png"/>
+                    <pic:cNvPr id="0" name="tmpdpibwhkl.png"/>
                     <pic:cNvPicPr/>
                   </pic:nvPicPr>
                   <pic:blipFill>
@@ -2259,7 +2279,7 @@
               <a:graphicData uri="http://schemas.openxmlformats.org/drawingml/2006/picture">
                 <pic:pic>
                   <pic:nvPicPr>
-                    <pic:cNvPr id="0" name="tmp2xvipl_t.png"/>
+                    <pic:cNvPr id="0" name="tmpsn6xdwq_.png"/>
                     <pic:cNvPicPr/>
                   </pic:nvPicPr>
                   <pic:blipFill>
@@ -2366,7 +2386,7 @@
               <a:graphicData uri="http://schemas.openxmlformats.org/drawingml/2006/picture">
                 <pic:pic>
                   <pic:nvPicPr>
-                    <pic:cNvPr id="0" name="tmpz4a_2khv.png"/>
+                    <pic:cNvPr id="0" name="tmpv0pchyxj.png"/>
                     <pic:cNvPicPr/>
                   </pic:nvPicPr>
                   <pic:blipFill>
@@ -2473,7 +2493,7 @@
               <a:graphicData uri="http://schemas.openxmlformats.org/drawingml/2006/picture">
                 <pic:pic>
                   <pic:nvPicPr>
-                    <pic:cNvPr id="0" name="tmpnfijc7qf.png"/>
+                    <pic:cNvPr id="0" name="tmp_m6wjttb.png"/>
                     <pic:cNvPicPr/>
                   </pic:nvPicPr>
                   <pic:blipFill>
@@ -2580,7 +2600,7 @@
               <a:graphicData uri="http://schemas.openxmlformats.org/drawingml/2006/picture">
                 <pic:pic>
                   <pic:nvPicPr>
-                    <pic:cNvPr id="0" name="tmpe7t1o790.png"/>
+                    <pic:cNvPr id="0" name="tmpdgwli8ie.png"/>
                     <pic:cNvPicPr/>
                   </pic:nvPicPr>
                   <pic:blipFill>
@@ -2636,7 +2656,7 @@
               <a:graphicData uri="http://schemas.openxmlformats.org/drawingml/2006/picture">
                 <pic:pic>
                   <pic:nvPicPr>
-                    <pic:cNvPr id="0" name="tmpqp4ukisu.png"/>
+                    <pic:cNvPr id="0" name="tmpnndulcbb.png"/>
                     <pic:cNvPicPr/>
                   </pic:nvPicPr>
                   <pic:blipFill>
@@ -2703,7 +2723,7 @@
               <a:graphicData uri="http://schemas.openxmlformats.org/drawingml/2006/picture">
                 <pic:pic>
                   <pic:nvPicPr>
-                    <pic:cNvPr id="0" name="tmpd38__v11.png"/>
+                    <pic:cNvPr id="0" name="tmp7wrx3k5n.png"/>
                     <pic:cNvPicPr/>
                   </pic:nvPicPr>
                   <pic:blipFill>
@@ -2769,7 +2789,7 @@
               <a:graphicData uri="http://schemas.openxmlformats.org/drawingml/2006/picture">
                 <pic:pic>
                   <pic:nvPicPr>
-                    <pic:cNvPr id="0" name="tmp_ofu383u.png"/>
+                    <pic:cNvPr id="0" name="tmp_tqb4j3n.png"/>
                     <pic:cNvPicPr/>
                   </pic:nvPicPr>
                   <pic:blipFill>
@@ -2834,7 +2854,7 @@
               <a:graphicData uri="http://schemas.openxmlformats.org/drawingml/2006/picture">
                 <pic:pic>
                   <pic:nvPicPr>
-                    <pic:cNvPr id="0" name="tmpvk02tug5.png"/>
+                    <pic:cNvPr id="0" name="tmprl8nxfhg.png"/>
                     <pic:cNvPicPr/>
                   </pic:nvPicPr>
                   <pic:blipFill>
@@ -2953,7 +2973,7 @@
               <a:graphicData uri="http://schemas.openxmlformats.org/drawingml/2006/picture">
                 <pic:pic>
                   <pic:nvPicPr>
-                    <pic:cNvPr id="0" name="tmpimactrm4.png"/>
+                    <pic:cNvPr id="0" name="tmpbbj0bb4y.png"/>
                     <pic:cNvPicPr/>
                   </pic:nvPicPr>
                   <pic:blipFill>
@@ -3020,7 +3040,7 @@
               <a:graphicData uri="http://schemas.openxmlformats.org/drawingml/2006/picture">
                 <pic:pic>
                   <pic:nvPicPr>
-                    <pic:cNvPr id="0" name="tmp52zimmel.png"/>
+                    <pic:cNvPr id="0" name="tmpf667pl1b.png"/>
                     <pic:cNvPicPr/>
                   </pic:nvPicPr>
                   <pic:blipFill>
@@ -3157,7 +3177,7 @@
               <a:graphicData uri="http://schemas.openxmlformats.org/drawingml/2006/picture">
                 <pic:pic>
                   <pic:nvPicPr>
-                    <pic:cNvPr id="0" name="tmpj5tg83b0.png"/>
+                    <pic:cNvPr id="0" name="tmpne1ukvwl.png"/>
                     <pic:cNvPicPr/>
                   </pic:nvPicPr>
                   <pic:blipFill>
@@ -3236,7 +3256,7 @@
               <a:graphicData uri="http://schemas.openxmlformats.org/drawingml/2006/picture">
                 <pic:pic>
                   <pic:nvPicPr>
-                    <pic:cNvPr id="0" name="tmpk0zs2vci.png"/>
+                    <pic:cNvPr id="0" name="tmpwlx7gu23.png"/>
                     <pic:cNvPicPr/>
                   </pic:nvPicPr>
                   <pic:blipFill>
@@ -3303,7 +3323,7 @@
               <a:graphicData uri="http://schemas.openxmlformats.org/drawingml/2006/picture">
                 <pic:pic>
                   <pic:nvPicPr>
-                    <pic:cNvPr id="0" name="tmpq7mhb84x.png"/>
+                    <pic:cNvPr id="0" name="tmp3kk1pyey.png"/>
                     <pic:cNvPicPr/>
                   </pic:nvPicPr>
                   <pic:blipFill>
@@ -3359,7 +3379,7 @@
               <a:graphicData uri="http://schemas.openxmlformats.org/drawingml/2006/picture">
                 <pic:pic>
                   <pic:nvPicPr>
-                    <pic:cNvPr id="0" name="tmpc8wuqlgd.png"/>
+                    <pic:cNvPr id="0" name="tmplqg22c4n.png"/>
                     <pic:cNvPicPr/>
                   </pic:nvPicPr>
                   <pic:blipFill>
@@ -3426,7 +3446,7 @@
               <a:graphicData uri="http://schemas.openxmlformats.org/drawingml/2006/picture">
                 <pic:pic>
                   <pic:nvPicPr>
-                    <pic:cNvPr id="0" name="tmp69437fny.png"/>
+                    <pic:cNvPr id="0" name="tmpc32mz9rm.png"/>
                     <pic:cNvPicPr/>
                   </pic:nvPicPr>
                   <pic:blipFill>
@@ -3482,7 +3502,7 @@
               <a:graphicData uri="http://schemas.openxmlformats.org/drawingml/2006/picture">
                 <pic:pic>
                   <pic:nvPicPr>
-                    <pic:cNvPr id="0" name="tmplhio7v8u.png"/>
+                    <pic:cNvPr id="0" name="tmpt814w6v5.png"/>
                     <pic:cNvPicPr/>
                   </pic:nvPicPr>
                   <pic:blipFill>
@@ -3538,7 +3558,7 @@
               <a:graphicData uri="http://schemas.openxmlformats.org/drawingml/2006/picture">
                 <pic:pic>
                   <pic:nvPicPr>
-                    <pic:cNvPr id="0" name="tmphag25kk0.png"/>
+                    <pic:cNvPr id="0" name="tmphry4km3g.png"/>
                     <pic:cNvPicPr/>
                   </pic:nvPicPr>
                   <pic:blipFill>
@@ -3594,7 +3614,7 @@
               <a:graphicData uri="http://schemas.openxmlformats.org/drawingml/2006/picture">
                 <pic:pic>
                   <pic:nvPicPr>
-                    <pic:cNvPr id="0" name="tmp_38kxbki.png"/>
+                    <pic:cNvPr id="0" name="tmp182sz069.png"/>
                     <pic:cNvPicPr/>
                   </pic:nvPicPr>
                   <pic:blipFill>
@@ -3650,7 +3670,7 @@
               <a:graphicData uri="http://schemas.openxmlformats.org/drawingml/2006/picture">
                 <pic:pic>
                   <pic:nvPicPr>
-                    <pic:cNvPr id="0" name="tmpynp0a328.png"/>
+                    <pic:cNvPr id="0" name="tmpf4rps0b1.png"/>
                     <pic:cNvPicPr/>
                   </pic:nvPicPr>
                   <pic:blipFill>
@@ -3706,7 +3726,7 @@
               <a:graphicData uri="http://schemas.openxmlformats.org/drawingml/2006/picture">
                 <pic:pic>
                   <pic:nvPicPr>
-                    <pic:cNvPr id="0" name="tmprirgirbi.png"/>
+                    <pic:cNvPr id="0" name="tmpf8ae3gkn.png"/>
                     <pic:cNvPicPr/>
                   </pic:nvPicPr>
                   <pic:blipFill>
@@ -4428,7 +4448,7 @@
               <a:graphicData uri="http://schemas.openxmlformats.org/drawingml/2006/picture">
                 <pic:pic>
                   <pic:nvPicPr>
-                    <pic:cNvPr id="0" name="tmpos3wkgz5.png"/>
+                    <pic:cNvPr id="0" name="tmp58zfng5g.png"/>
                     <pic:cNvPicPr/>
                   </pic:nvPicPr>
                   <pic:blipFill>
@@ -4484,7 +4504,7 @@
               <a:graphicData uri="http://schemas.openxmlformats.org/drawingml/2006/picture">
                 <pic:pic>
                   <pic:nvPicPr>
-                    <pic:cNvPr id="0" name="tmpsdcwx5yz.png"/>
+                    <pic:cNvPr id="0" name="tmpznr870re.png"/>
                     <pic:cNvPicPr/>
                   </pic:nvPicPr>
                   <pic:blipFill>
@@ -4587,7 +4607,7 @@
               <a:graphicData uri="http://schemas.openxmlformats.org/drawingml/2006/picture">
                 <pic:pic>
                   <pic:nvPicPr>
-                    <pic:cNvPr id="0" name="tmpzcnw_yb6.png"/>
+                    <pic:cNvPr id="0" name="tmpp4h1lbae.png"/>
                     <pic:cNvPicPr/>
                   </pic:nvPicPr>
                   <pic:blipFill>
@@ -4672,7 +4692,7 @@
               <a:graphicData uri="http://schemas.openxmlformats.org/drawingml/2006/picture">
                 <pic:pic>
                   <pic:nvPicPr>
-                    <pic:cNvPr id="0" name="tmpaunkfjh5.png"/>
+                    <pic:cNvPr id="0" name="tmpp3azs6vh.png"/>
                     <pic:cNvPicPr/>
                   </pic:nvPicPr>
                   <pic:blipFill>
@@ -4728,7 +4748,7 @@
               <a:graphicData uri="http://schemas.openxmlformats.org/drawingml/2006/picture">
                 <pic:pic>
                   <pic:nvPicPr>
-                    <pic:cNvPr id="0" name="tmptjr1zksa.png"/>
+                    <pic:cNvPr id="0" name="tmpj874ajnc.png"/>
                     <pic:cNvPicPr/>
                   </pic:nvPicPr>
                   <pic:blipFill>
@@ -4784,7 +4804,7 @@
               <a:graphicData uri="http://schemas.openxmlformats.org/drawingml/2006/picture">
                 <pic:pic>
                   <pic:nvPicPr>
-                    <pic:cNvPr id="0" name="tmp1wxrtyyi.png"/>
+                    <pic:cNvPr id="0" name="tmpq5m23ni3.png"/>
                     <pic:cNvPicPr/>
                   </pic:nvPicPr>
                   <pic:blipFill>
@@ -4840,7 +4860,7 @@
               <a:graphicData uri="http://schemas.openxmlformats.org/drawingml/2006/picture">
                 <pic:pic>
                   <pic:nvPicPr>
-                    <pic:cNvPr id="0" name="tmpihxb4dul.png"/>
+                    <pic:cNvPr id="0" name="tmphhdyepwj.png"/>
                     <pic:cNvPicPr/>
                   </pic:nvPicPr>
                   <pic:blipFill>
@@ -4896,7 +4916,7 @@
               <a:graphicData uri="http://schemas.openxmlformats.org/drawingml/2006/picture">
                 <pic:pic>
                   <pic:nvPicPr>
-                    <pic:cNvPr id="0" name="tmpz3fih7dx.png"/>
+                    <pic:cNvPr id="0" name="tmpt7t8ra4t.png"/>
                     <pic:cNvPicPr/>
                   </pic:nvPicPr>
                   <pic:blipFill>

</xml_diff>

<commit_message>
docs: Guia e SOP — o nome dos exports, o swap até R$20 e as marcas do Pay/Rec
O Guia e o SOP ficaram para trás nos três commits de hoje (§664, §665,
§666). O Guia 4.6/4.7 ainda dizia que o nome sugerido é "o título da
tela" e não falava do padrão `<Tela> - OTC Tracker - OTC Processing
System` (tabela nas telas com várias, o cadastro no Mapping, a barra
virando hífen, sem data). O 8.2 do Pay/Rec ganha os funis das três
listas, a tabela das marcas da coluna JPM cpty (Branch, Manual,
Tolerance) e o SWAP casando até R$20; o Match dizia "dentro de R$ 1,00"
sem a exceção do swap, e a tabela de tolerâncias do 18.2.4 não tinha o
swap. O SOP recebe o padrão de nome na nota de Export e o mesmo resumo
no Pay/Rec. Os .docx regerados pelo build_sop_docx.py; o print do
Pay/Rec é a tela vazia e segue valendo.

Co-Authored-By: Claude Opus 5.5 (1M context) <noreply@anthropic.com>
</commit_message>
<xml_diff>
--- a/SOP_PROCESSAMENTO_OTC.docx
+++ b/SOP_PROCESSAMENTO_OTC.docx
@@ -476,7 +476,7 @@
               <a:graphicData uri="http://schemas.openxmlformats.org/drawingml/2006/picture">
                 <pic:pic>
                   <pic:nvPicPr>
-                    <pic:cNvPr id="0" name="tmp3taaxqy9.png"/>
+                    <pic:cNvPr id="0" name="tmp6c6z5jaz.png"/>
                     <pic:cNvPicPr/>
                   </pic:nvPicPr>
                   <pic:blipFill>
@@ -536,7 +536,7 @@
               <a:graphicData uri="http://schemas.openxmlformats.org/drawingml/2006/picture">
                 <pic:pic>
                   <pic:nvPicPr>
-                    <pic:cNvPr id="0" name="tmpqm4o571a.png"/>
+                    <pic:cNvPr id="0" name="tmpeimakgnq.png"/>
                     <pic:cNvPicPr/>
                   </pic:nvPicPr>
                   <pic:blipFill>
@@ -596,7 +596,7 @@
               <a:graphicData uri="http://schemas.openxmlformats.org/drawingml/2006/picture">
                 <pic:pic>
                   <pic:nvPicPr>
-                    <pic:cNvPr id="0" name="tmp5nnbnwqf.png"/>
+                    <pic:cNvPr id="0" name="tmpne8c_1tk.png"/>
                     <pic:cNvPicPr/>
                   </pic:nvPicPr>
                   <pic:blipFill>
@@ -656,7 +656,7 @@
               <a:graphicData uri="http://schemas.openxmlformats.org/drawingml/2006/picture">
                 <pic:pic>
                   <pic:nvPicPr>
-                    <pic:cNvPr id="0" name="tmpv0pchyxj.png"/>
+                    <pic:cNvPr id="0" name="tmp7wdy2s7m.png"/>
                     <pic:cNvPicPr/>
                   </pic:nvPicPr>
                   <pic:blipFill>
@@ -716,7 +716,7 @@
               <a:graphicData uri="http://schemas.openxmlformats.org/drawingml/2006/picture">
                 <pic:pic>
                   <pic:nvPicPr>
-                    <pic:cNvPr id="0" name="tmplqg22c4n.png"/>
+                    <pic:cNvPr id="0" name="tmp9qvcngwx.png"/>
                     <pic:cNvPicPr/>
                   </pic:nvPicPr>
                   <pic:blipFill>
@@ -903,7 +903,38 @@
         <w:rPr>
           <w:color w:val="1A3A5A"/>
         </w:rPr>
-        <w:t>intervalo desabilitado, com o motivo escrito.</w:t>
+        <w:t>intervalo desabilitado, com o motivo escrito. O arquivo sai sempre com o nome</w:t>
+      </w:r>
+    </w:p>
+    <w:p>
+      <w:pPr>
+        <w:ind w:left="360"/>
+        <w:shd w:val="clear" w:fill="EAF2FB"/>
+      </w:pPr>
+      <w:r>
+        <w:rPr>
+          <w:rFonts w:ascii="Consolas" w:hAnsi="Consolas"/>
+          <w:color w:val="1A3A5A"/>
+        </w:rPr>
+        <w:t>&lt;Tela ou tabela&gt; - OTC Tracker - OTC Processing System</w:t>
+      </w:r>
+      <w:r>
+        <w:rPr>
+          <w:color w:val="1A3A5A"/>
+        </w:rPr>
+        <w:t xml:space="preserve"> (no Mapping, o cadastro aberto), sem</w:t>
+      </w:r>
+    </w:p>
+    <w:p>
+      <w:pPr>
+        <w:ind w:left="360"/>
+        <w:shd w:val="clear" w:fill="EAF2FB"/>
+      </w:pPr>
+      <w:r>
+        <w:rPr>
+          <w:color w:val="1A3A5A"/>
+        </w:rPr>
+        <w:t>data, e o mesmo texto é o título dentro do Excel, do PDF e da impressão.</w:t>
       </w:r>
     </w:p>
     <w:p>
@@ -959,7 +990,7 @@
               <a:graphicData uri="http://schemas.openxmlformats.org/drawingml/2006/picture">
                 <pic:pic>
                   <pic:nvPicPr>
-                    <pic:cNvPr id="0" name="tmp8bvprebx.png"/>
+                    <pic:cNvPr id="0" name="tmpovfqm_nh.png"/>
                     <pic:cNvPicPr/>
                   </pic:nvPicPr>
                   <pic:blipFill>
@@ -1015,7 +1046,7 @@
               <a:graphicData uri="http://schemas.openxmlformats.org/drawingml/2006/picture">
                 <pic:pic>
                   <pic:nvPicPr>
-                    <pic:cNvPr id="0" name="tmpx6jjc_1p.png"/>
+                    <pic:cNvPr id="0" name="tmpwplip7or.png"/>
                     <pic:cNvPicPr/>
                   </pic:nvPicPr>
                   <pic:blipFill>
@@ -1143,7 +1174,7 @@
               <a:graphicData uri="http://schemas.openxmlformats.org/drawingml/2006/picture">
                 <pic:pic>
                   <pic:nvPicPr>
-                    <pic:cNvPr id="0" name="tmpq3m5djxl.png"/>
+                    <pic:cNvPr id="0" name="tmpkb7y8q2t.png"/>
                     <pic:cNvPicPr/>
                   </pic:nvPicPr>
                   <pic:blipFill>
@@ -1208,7 +1239,7 @@
               <a:graphicData uri="http://schemas.openxmlformats.org/drawingml/2006/picture">
                 <pic:pic>
                   <pic:nvPicPr>
-                    <pic:cNvPr id="0" name="tmp7p_vxc5s.png"/>
+                    <pic:cNvPr id="0" name="tmpwblzs_9c.png"/>
                     <pic:cNvPicPr/>
                   </pic:nvPicPr>
                   <pic:blipFill>
@@ -1533,7 +1564,7 @@
               <a:graphicData uri="http://schemas.openxmlformats.org/drawingml/2006/picture">
                 <pic:pic>
                   <pic:nvPicPr>
-                    <pic:cNvPr id="0" name="tmp3taaxqy9.png"/>
+                    <pic:cNvPr id="0" name="tmp6c6z5jaz.png"/>
                     <pic:cNvPicPr/>
                   </pic:nvPicPr>
                   <pic:blipFill>
@@ -1919,7 +1950,7 @@
               <a:graphicData uri="http://schemas.openxmlformats.org/drawingml/2006/picture">
                 <pic:pic>
                   <pic:nvPicPr>
-                    <pic:cNvPr id="0" name="tmp5nnbnwqf.png"/>
+                    <pic:cNvPr id="0" name="tmpne8c_1tk.png"/>
                     <pic:cNvPicPr/>
                   </pic:nvPicPr>
                   <pic:blipFill>
@@ -1975,7 +2006,7 @@
               <a:graphicData uri="http://schemas.openxmlformats.org/drawingml/2006/picture">
                 <pic:pic>
                   <pic:nvPicPr>
-                    <pic:cNvPr id="0" name="tmpqm4o571a.png"/>
+                    <pic:cNvPr id="0" name="tmpeimakgnq.png"/>
                     <pic:cNvPicPr/>
                   </pic:nvPicPr>
                   <pic:blipFill>
@@ -2167,7 +2198,7 @@
               <a:graphicData uri="http://schemas.openxmlformats.org/drawingml/2006/picture">
                 <pic:pic>
                   <pic:nvPicPr>
-                    <pic:cNvPr id="0" name="tmpc8w32ljx.png"/>
+                    <pic:cNvPr id="0" name="tmpavxe7nxq.png"/>
                     <pic:cNvPicPr/>
                   </pic:nvPicPr>
                   <pic:blipFill>
@@ -2223,7 +2254,7 @@
               <a:graphicData uri="http://schemas.openxmlformats.org/drawingml/2006/picture">
                 <pic:pic>
                   <pic:nvPicPr>
-                    <pic:cNvPr id="0" name="tmpdpibwhkl.png"/>
+                    <pic:cNvPr id="0" name="tmpusazg_le.png"/>
                     <pic:cNvPicPr/>
                   </pic:nvPicPr>
                   <pic:blipFill>
@@ -2279,7 +2310,7 @@
               <a:graphicData uri="http://schemas.openxmlformats.org/drawingml/2006/picture">
                 <pic:pic>
                   <pic:nvPicPr>
-                    <pic:cNvPr id="0" name="tmpsn6xdwq_.png"/>
+                    <pic:cNvPr id="0" name="tmp3lbgmw6c.png"/>
                     <pic:cNvPicPr/>
                   </pic:nvPicPr>
                   <pic:blipFill>
@@ -2386,7 +2417,7 @@
               <a:graphicData uri="http://schemas.openxmlformats.org/drawingml/2006/picture">
                 <pic:pic>
                   <pic:nvPicPr>
-                    <pic:cNvPr id="0" name="tmpv0pchyxj.png"/>
+                    <pic:cNvPr id="0" name="tmp7wdy2s7m.png"/>
                     <pic:cNvPicPr/>
                   </pic:nvPicPr>
                   <pic:blipFill>
@@ -2493,7 +2524,7 @@
               <a:graphicData uri="http://schemas.openxmlformats.org/drawingml/2006/picture">
                 <pic:pic>
                   <pic:nvPicPr>
-                    <pic:cNvPr id="0" name="tmp_m6wjttb.png"/>
+                    <pic:cNvPr id="0" name="tmpr19og8wv.png"/>
                     <pic:cNvPicPr/>
                   </pic:nvPicPr>
                   <pic:blipFill>
@@ -2600,7 +2631,7 @@
               <a:graphicData uri="http://schemas.openxmlformats.org/drawingml/2006/picture">
                 <pic:pic>
                   <pic:nvPicPr>
-                    <pic:cNvPr id="0" name="tmpdgwli8ie.png"/>
+                    <pic:cNvPr id="0" name="tmpl650o24g.png"/>
                     <pic:cNvPicPr/>
                   </pic:nvPicPr>
                   <pic:blipFill>
@@ -2656,7 +2687,7 @@
               <a:graphicData uri="http://schemas.openxmlformats.org/drawingml/2006/picture">
                 <pic:pic>
                   <pic:nvPicPr>
-                    <pic:cNvPr id="0" name="tmpnndulcbb.png"/>
+                    <pic:cNvPr id="0" name="tmpcg_ybanq.png"/>
                     <pic:cNvPicPr/>
                   </pic:nvPicPr>
                   <pic:blipFill>
@@ -2723,7 +2754,7 @@
               <a:graphicData uri="http://schemas.openxmlformats.org/drawingml/2006/picture">
                 <pic:pic>
                   <pic:nvPicPr>
-                    <pic:cNvPr id="0" name="tmp7wrx3k5n.png"/>
+                    <pic:cNvPr id="0" name="tmpr8urmqid.png"/>
                     <pic:cNvPicPr/>
                   </pic:nvPicPr>
                   <pic:blipFill>
@@ -2770,7 +2801,16 @@
         <w:t>settlement.csv</w:t>
       </w:r>
       <w:r>
-        <w:t xml:space="preserve"> da pasta deixou de ser insumo.</w:t>
+        <w:t xml:space="preserve"> da pasta deixou de ser insumo. O SWAP casa até R$ 20,00 (o lado do banco é líquido do IR regressivo). As tabelas Pending Payment, Pending Receivement e Settled têm o funil no cabeçalho, e a linha que casou dentro da tolerância sem bater no centavo traz a marca </w:t>
+      </w:r>
+      <w:r>
+        <w:rPr>
+          <w:b/>
+        </w:rPr>
+        <w:t>Tolerance</w:t>
+      </w:r>
+      <w:r>
+        <w:t>, com a diferença ao passar o mouse.</w:t>
       </w:r>
     </w:p>
     <w:p>
@@ -2789,7 +2829,7 @@
               <a:graphicData uri="http://schemas.openxmlformats.org/drawingml/2006/picture">
                 <pic:pic>
                   <pic:nvPicPr>
-                    <pic:cNvPr id="0" name="tmp_tqb4j3n.png"/>
+                    <pic:cNvPr id="0" name="tmpy5vsxctt.png"/>
                     <pic:cNvPicPr/>
                   </pic:nvPicPr>
                   <pic:blipFill>
@@ -2854,7 +2894,7 @@
               <a:graphicData uri="http://schemas.openxmlformats.org/drawingml/2006/picture">
                 <pic:pic>
                   <pic:nvPicPr>
-                    <pic:cNvPr id="0" name="tmprl8nxfhg.png"/>
+                    <pic:cNvPr id="0" name="tmpg9bx5htc.png"/>
                     <pic:cNvPicPr/>
                   </pic:nvPicPr>
                   <pic:blipFill>
@@ -2973,7 +3013,7 @@
               <a:graphicData uri="http://schemas.openxmlformats.org/drawingml/2006/picture">
                 <pic:pic>
                   <pic:nvPicPr>
-                    <pic:cNvPr id="0" name="tmpbbj0bb4y.png"/>
+                    <pic:cNvPr id="0" name="tmpxvg9tmzn.png"/>
                     <pic:cNvPicPr/>
                   </pic:nvPicPr>
                   <pic:blipFill>
@@ -3040,7 +3080,7 @@
               <a:graphicData uri="http://schemas.openxmlformats.org/drawingml/2006/picture">
                 <pic:pic>
                   <pic:nvPicPr>
-                    <pic:cNvPr id="0" name="tmpf667pl1b.png"/>
+                    <pic:cNvPr id="0" name="tmpfgat9mss.png"/>
                     <pic:cNvPicPr/>
                   </pic:nvPicPr>
                   <pic:blipFill>
@@ -3177,7 +3217,7 @@
               <a:graphicData uri="http://schemas.openxmlformats.org/drawingml/2006/picture">
                 <pic:pic>
                   <pic:nvPicPr>
-                    <pic:cNvPr id="0" name="tmpne1ukvwl.png"/>
+                    <pic:cNvPr id="0" name="tmp6d_kudwc.png"/>
                     <pic:cNvPicPr/>
                   </pic:nvPicPr>
                   <pic:blipFill>
@@ -3256,7 +3296,7 @@
               <a:graphicData uri="http://schemas.openxmlformats.org/drawingml/2006/picture">
                 <pic:pic>
                   <pic:nvPicPr>
-                    <pic:cNvPr id="0" name="tmpwlx7gu23.png"/>
+                    <pic:cNvPr id="0" name="tmpt7n99q3i.png"/>
                     <pic:cNvPicPr/>
                   </pic:nvPicPr>
                   <pic:blipFill>
@@ -3323,7 +3363,7 @@
               <a:graphicData uri="http://schemas.openxmlformats.org/drawingml/2006/picture">
                 <pic:pic>
                   <pic:nvPicPr>
-                    <pic:cNvPr id="0" name="tmp3kk1pyey.png"/>
+                    <pic:cNvPr id="0" name="tmp5qouwxby.png"/>
                     <pic:cNvPicPr/>
                   </pic:nvPicPr>
                   <pic:blipFill>
@@ -3379,7 +3419,7 @@
               <a:graphicData uri="http://schemas.openxmlformats.org/drawingml/2006/picture">
                 <pic:pic>
                   <pic:nvPicPr>
-                    <pic:cNvPr id="0" name="tmplqg22c4n.png"/>
+                    <pic:cNvPr id="0" name="tmp9qvcngwx.png"/>
                     <pic:cNvPicPr/>
                   </pic:nvPicPr>
                   <pic:blipFill>
@@ -3446,7 +3486,7 @@
               <a:graphicData uri="http://schemas.openxmlformats.org/drawingml/2006/picture">
                 <pic:pic>
                   <pic:nvPicPr>
-                    <pic:cNvPr id="0" name="tmpc32mz9rm.png"/>
+                    <pic:cNvPr id="0" name="tmp7kvxhq70.png"/>
                     <pic:cNvPicPr/>
                   </pic:nvPicPr>
                   <pic:blipFill>
@@ -3502,7 +3542,7 @@
               <a:graphicData uri="http://schemas.openxmlformats.org/drawingml/2006/picture">
                 <pic:pic>
                   <pic:nvPicPr>
-                    <pic:cNvPr id="0" name="tmpt814w6v5.png"/>
+                    <pic:cNvPr id="0" name="tmpht23cf8v.png"/>
                     <pic:cNvPicPr/>
                   </pic:nvPicPr>
                   <pic:blipFill>
@@ -3558,7 +3598,7 @@
               <a:graphicData uri="http://schemas.openxmlformats.org/drawingml/2006/picture">
                 <pic:pic>
                   <pic:nvPicPr>
-                    <pic:cNvPr id="0" name="tmphry4km3g.png"/>
+                    <pic:cNvPr id="0" name="tmpjvel93y7.png"/>
                     <pic:cNvPicPr/>
                   </pic:nvPicPr>
                   <pic:blipFill>
@@ -3614,7 +3654,7 @@
               <a:graphicData uri="http://schemas.openxmlformats.org/drawingml/2006/picture">
                 <pic:pic>
                   <pic:nvPicPr>
-                    <pic:cNvPr id="0" name="tmp182sz069.png"/>
+                    <pic:cNvPr id="0" name="tmpq_y9_p41.png"/>
                     <pic:cNvPicPr/>
                   </pic:nvPicPr>
                   <pic:blipFill>
@@ -3670,7 +3710,7 @@
               <a:graphicData uri="http://schemas.openxmlformats.org/drawingml/2006/picture">
                 <pic:pic>
                   <pic:nvPicPr>
-                    <pic:cNvPr id="0" name="tmpf4rps0b1.png"/>
+                    <pic:cNvPr id="0" name="tmp69ancnk1.png"/>
                     <pic:cNvPicPr/>
                   </pic:nvPicPr>
                   <pic:blipFill>
@@ -3726,7 +3766,7 @@
               <a:graphicData uri="http://schemas.openxmlformats.org/drawingml/2006/picture">
                 <pic:pic>
                   <pic:nvPicPr>
-                    <pic:cNvPr id="0" name="tmpf8ae3gkn.png"/>
+                    <pic:cNvPr id="0" name="tmpmfxs88cm.png"/>
                     <pic:cNvPicPr/>
                   </pic:nvPicPr>
                   <pic:blipFill>
@@ -4448,7 +4488,7 @@
               <a:graphicData uri="http://schemas.openxmlformats.org/drawingml/2006/picture">
                 <pic:pic>
                   <pic:nvPicPr>
-                    <pic:cNvPr id="0" name="tmp58zfng5g.png"/>
+                    <pic:cNvPr id="0" name="tmpheu7ronq.png"/>
                     <pic:cNvPicPr/>
                   </pic:nvPicPr>
                   <pic:blipFill>
@@ -4504,7 +4544,7 @@
               <a:graphicData uri="http://schemas.openxmlformats.org/drawingml/2006/picture">
                 <pic:pic>
                   <pic:nvPicPr>
-                    <pic:cNvPr id="0" name="tmpznr870re.png"/>
+                    <pic:cNvPr id="0" name="tmpnfc_zlde.png"/>
                     <pic:cNvPicPr/>
                   </pic:nvPicPr>
                   <pic:blipFill>
@@ -4607,7 +4647,7 @@
               <a:graphicData uri="http://schemas.openxmlformats.org/drawingml/2006/picture">
                 <pic:pic>
                   <pic:nvPicPr>
-                    <pic:cNvPr id="0" name="tmpp4h1lbae.png"/>
+                    <pic:cNvPr id="0" name="tmpwamnfn5g.png"/>
                     <pic:cNvPicPr/>
                   </pic:nvPicPr>
                   <pic:blipFill>
@@ -4692,7 +4732,7 @@
               <a:graphicData uri="http://schemas.openxmlformats.org/drawingml/2006/picture">
                 <pic:pic>
                   <pic:nvPicPr>
-                    <pic:cNvPr id="0" name="tmpp3azs6vh.png"/>
+                    <pic:cNvPr id="0" name="tmpsuzns7vf.png"/>
                     <pic:cNvPicPr/>
                   </pic:nvPicPr>
                   <pic:blipFill>
@@ -4748,7 +4788,7 @@
               <a:graphicData uri="http://schemas.openxmlformats.org/drawingml/2006/picture">
                 <pic:pic>
                   <pic:nvPicPr>
-                    <pic:cNvPr id="0" name="tmpj874ajnc.png"/>
+                    <pic:cNvPr id="0" name="tmpe9cn8m9v.png"/>
                     <pic:cNvPicPr/>
                   </pic:nvPicPr>
                   <pic:blipFill>
@@ -4804,7 +4844,7 @@
               <a:graphicData uri="http://schemas.openxmlformats.org/drawingml/2006/picture">
                 <pic:pic>
                   <pic:nvPicPr>
-                    <pic:cNvPr id="0" name="tmpq5m23ni3.png"/>
+                    <pic:cNvPr id="0" name="tmpxj6rs640.png"/>
                     <pic:cNvPicPr/>
                   </pic:nvPicPr>
                   <pic:blipFill>
@@ -4860,7 +4900,7 @@
               <a:graphicData uri="http://schemas.openxmlformats.org/drawingml/2006/picture">
                 <pic:pic>
                   <pic:nvPicPr>
-                    <pic:cNvPr id="0" name="tmphhdyepwj.png"/>
+                    <pic:cNvPr id="0" name="tmpayv11sui.png"/>
                     <pic:cNvPicPr/>
                   </pic:nvPicPr>
                   <pic:blipFill>
@@ -4916,7 +4956,7 @@
               <a:graphicData uri="http://schemas.openxmlformats.org/drawingml/2006/picture">
                 <pic:pic>
                   <pic:nvPicPr>
-                    <pic:cNvPr id="0" name="tmpt7t8ra4t.png"/>
+                    <pic:cNvPr id="0" name="tmp1q_qql0z.png"/>
                     <pic:cNvPicPr/>
                   </pic:nvPicPr>
                   <pic:blipFill>

</xml_diff>

<commit_message>
docs: HANDOFF §668, CLAUDE.md, Guia e SOP — select all, um arquivo por tipo, Match de EQUITIES e o Atacama
HANDOFF §668 registra as quatro correções do dia: o select all do
cabeçalho embaixo do ícone de ordenação (a medida das 39 telas), a pasta
de insumos do Pay/Rec com um arquivo por tipo (o salvo por último fica),
a janela de R$20 do Match manual para EQUITIES e a chave da contraparte
que a tela calculava sem o _norm_cpty. O CLAUDE.md ganha a regra do
select all no §7 e as do Pay/Rec no §8; o README dos testes, o que cada
guarda prende. O Guia (8.2 e 18.2.4) e o SOP dizem o arquivo por tipo,
o EQUITIES no Match e que as grafias dos fundos da casa contam como a
mesma contraparte; os .docx regerados pelo build_sop_docx.py.

Co-Authored-By: Claude Opus 5.5 (1M context) <noreply@anthropic.com>
</commit_message>
<xml_diff>
--- a/SOP_PROCESSAMENTO_OTC.docx
+++ b/SOP_PROCESSAMENTO_OTC.docx
@@ -476,7 +476,7 @@
               <a:graphicData uri="http://schemas.openxmlformats.org/drawingml/2006/picture">
                 <pic:pic>
                   <pic:nvPicPr>
-                    <pic:cNvPr id="0" name="tmp6c6z5jaz.png"/>
+                    <pic:cNvPr id="0" name="tmpekoekjpx.png"/>
                     <pic:cNvPicPr/>
                   </pic:nvPicPr>
                   <pic:blipFill>
@@ -536,7 +536,7 @@
               <a:graphicData uri="http://schemas.openxmlformats.org/drawingml/2006/picture">
                 <pic:pic>
                   <pic:nvPicPr>
-                    <pic:cNvPr id="0" name="tmpeimakgnq.png"/>
+                    <pic:cNvPr id="0" name="tmpen0qdvwb.png"/>
                     <pic:cNvPicPr/>
                   </pic:nvPicPr>
                   <pic:blipFill>
@@ -596,7 +596,7 @@
               <a:graphicData uri="http://schemas.openxmlformats.org/drawingml/2006/picture">
                 <pic:pic>
                   <pic:nvPicPr>
-                    <pic:cNvPr id="0" name="tmpne8c_1tk.png"/>
+                    <pic:cNvPr id="0" name="tmpjd23a4dg.png"/>
                     <pic:cNvPicPr/>
                   </pic:nvPicPr>
                   <pic:blipFill>
@@ -656,7 +656,7 @@
               <a:graphicData uri="http://schemas.openxmlformats.org/drawingml/2006/picture">
                 <pic:pic>
                   <pic:nvPicPr>
-                    <pic:cNvPr id="0" name="tmp7wdy2s7m.png"/>
+                    <pic:cNvPr id="0" name="tmp1h0sbgbb.png"/>
                     <pic:cNvPicPr/>
                   </pic:nvPicPr>
                   <pic:blipFill>
@@ -716,7 +716,7 @@
               <a:graphicData uri="http://schemas.openxmlformats.org/drawingml/2006/picture">
                 <pic:pic>
                   <pic:nvPicPr>
-                    <pic:cNvPr id="0" name="tmp9qvcngwx.png"/>
+                    <pic:cNvPr id="0" name="tmpjzwrvb2f.png"/>
                     <pic:cNvPicPr/>
                   </pic:nvPicPr>
                   <pic:blipFill>
@@ -990,7 +990,7 @@
               <a:graphicData uri="http://schemas.openxmlformats.org/drawingml/2006/picture">
                 <pic:pic>
                   <pic:nvPicPr>
-                    <pic:cNvPr id="0" name="tmpovfqm_nh.png"/>
+                    <pic:cNvPr id="0" name="tmpasu17pj6.png"/>
                     <pic:cNvPicPr/>
                   </pic:nvPicPr>
                   <pic:blipFill>
@@ -1046,7 +1046,7 @@
               <a:graphicData uri="http://schemas.openxmlformats.org/drawingml/2006/picture">
                 <pic:pic>
                   <pic:nvPicPr>
-                    <pic:cNvPr id="0" name="tmpwplip7or.png"/>
+                    <pic:cNvPr id="0" name="tmps3u8v5jv.png"/>
                     <pic:cNvPicPr/>
                   </pic:nvPicPr>
                   <pic:blipFill>
@@ -1174,7 +1174,7 @@
               <a:graphicData uri="http://schemas.openxmlformats.org/drawingml/2006/picture">
                 <pic:pic>
                   <pic:nvPicPr>
-                    <pic:cNvPr id="0" name="tmpkb7y8q2t.png"/>
+                    <pic:cNvPr id="0" name="tmpm_thyckz.png"/>
                     <pic:cNvPicPr/>
                   </pic:nvPicPr>
                   <pic:blipFill>
@@ -1239,7 +1239,7 @@
               <a:graphicData uri="http://schemas.openxmlformats.org/drawingml/2006/picture">
                 <pic:pic>
                   <pic:nvPicPr>
-                    <pic:cNvPr id="0" name="tmpwblzs_9c.png"/>
+                    <pic:cNvPr id="0" name="tmph4swcd13.png"/>
                     <pic:cNvPicPr/>
                   </pic:nvPicPr>
                   <pic:blipFill>
@@ -1564,7 +1564,7 @@
               <a:graphicData uri="http://schemas.openxmlformats.org/drawingml/2006/picture">
                 <pic:pic>
                   <pic:nvPicPr>
-                    <pic:cNvPr id="0" name="tmp6c6z5jaz.png"/>
+                    <pic:cNvPr id="0" name="tmpekoekjpx.png"/>
                     <pic:cNvPicPr/>
                   </pic:nvPicPr>
                   <pic:blipFill>
@@ -1950,7 +1950,7 @@
               <a:graphicData uri="http://schemas.openxmlformats.org/drawingml/2006/picture">
                 <pic:pic>
                   <pic:nvPicPr>
-                    <pic:cNvPr id="0" name="tmpne8c_1tk.png"/>
+                    <pic:cNvPr id="0" name="tmpjd23a4dg.png"/>
                     <pic:cNvPicPr/>
                   </pic:nvPicPr>
                   <pic:blipFill>
@@ -2006,7 +2006,7 @@
               <a:graphicData uri="http://schemas.openxmlformats.org/drawingml/2006/picture">
                 <pic:pic>
                   <pic:nvPicPr>
-                    <pic:cNvPr id="0" name="tmpeimakgnq.png"/>
+                    <pic:cNvPr id="0" name="tmpen0qdvwb.png"/>
                     <pic:cNvPicPr/>
                   </pic:nvPicPr>
                   <pic:blipFill>
@@ -2198,7 +2198,7 @@
               <a:graphicData uri="http://schemas.openxmlformats.org/drawingml/2006/picture">
                 <pic:pic>
                   <pic:nvPicPr>
-                    <pic:cNvPr id="0" name="tmpavxe7nxq.png"/>
+                    <pic:cNvPr id="0" name="tmpwi_rtyx8.png"/>
                     <pic:cNvPicPr/>
                   </pic:nvPicPr>
                   <pic:blipFill>
@@ -2254,7 +2254,7 @@
               <a:graphicData uri="http://schemas.openxmlformats.org/drawingml/2006/picture">
                 <pic:pic>
                   <pic:nvPicPr>
-                    <pic:cNvPr id="0" name="tmpusazg_le.png"/>
+                    <pic:cNvPr id="0" name="tmpyg6q8_sv.png"/>
                     <pic:cNvPicPr/>
                   </pic:nvPicPr>
                   <pic:blipFill>
@@ -2310,7 +2310,7 @@
               <a:graphicData uri="http://schemas.openxmlformats.org/drawingml/2006/picture">
                 <pic:pic>
                   <pic:nvPicPr>
-                    <pic:cNvPr id="0" name="tmp3lbgmw6c.png"/>
+                    <pic:cNvPr id="0" name="tmpvkmttv7m.png"/>
                     <pic:cNvPicPr/>
                   </pic:nvPicPr>
                   <pic:blipFill>
@@ -2417,7 +2417,7 @@
               <a:graphicData uri="http://schemas.openxmlformats.org/drawingml/2006/picture">
                 <pic:pic>
                   <pic:nvPicPr>
-                    <pic:cNvPr id="0" name="tmp7wdy2s7m.png"/>
+                    <pic:cNvPr id="0" name="tmp1h0sbgbb.png"/>
                     <pic:cNvPicPr/>
                   </pic:nvPicPr>
                   <pic:blipFill>
@@ -2524,7 +2524,7 @@
               <a:graphicData uri="http://schemas.openxmlformats.org/drawingml/2006/picture">
                 <pic:pic>
                   <pic:nvPicPr>
-                    <pic:cNvPr id="0" name="tmpr19og8wv.png"/>
+                    <pic:cNvPr id="0" name="tmpu6c4am4d.png"/>
                     <pic:cNvPicPr/>
                   </pic:nvPicPr>
                   <pic:blipFill>
@@ -2631,7 +2631,7 @@
               <a:graphicData uri="http://schemas.openxmlformats.org/drawingml/2006/picture">
                 <pic:pic>
                   <pic:nvPicPr>
-                    <pic:cNvPr id="0" name="tmpl650o24g.png"/>
+                    <pic:cNvPr id="0" name="tmpfpdltp80.png"/>
                     <pic:cNvPicPr/>
                   </pic:nvPicPr>
                   <pic:blipFill>
@@ -2687,7 +2687,7 @@
               <a:graphicData uri="http://schemas.openxmlformats.org/drawingml/2006/picture">
                 <pic:pic>
                   <pic:nvPicPr>
-                    <pic:cNvPr id="0" name="tmpcg_ybanq.png"/>
+                    <pic:cNvPr id="0" name="tmpxmc64h5f.png"/>
                     <pic:cNvPicPr/>
                   </pic:nvPicPr>
                   <pic:blipFill>
@@ -2754,7 +2754,7 @@
               <a:graphicData uri="http://schemas.openxmlformats.org/drawingml/2006/picture">
                 <pic:pic>
                   <pic:nvPicPr>
-                    <pic:cNvPr id="0" name="tmpr8urmqid.png"/>
+                    <pic:cNvPr id="0" name="tmpq9zq3d9e.png"/>
                     <pic:cNvPicPr/>
                   </pic:nvPicPr>
                   <pic:blipFill>
@@ -2810,7 +2810,16 @@
         <w:t>Tolerance</w:t>
       </w:r>
       <w:r>
-        <w:t>, com a diferença ao passar o mouse.</w:t>
+        <w:t xml:space="preserve">, com a diferença ao passar o mouse. A pasta de insumos guarda </w:t>
+      </w:r>
+      <w:r>
+        <w:rPr>
+          <w:b/>
+        </w:rPr>
+        <w:t>um arquivo de cada tipo</w:t>
+      </w:r>
+      <w:r>
+        <w:t xml:space="preserve"> (HistoricoMensagens JPM, HistoricoMensagens MGT, cashflows, RLDOCREC…): o que entra pelo dropzone substitui o do mesmo tipo, e com dois na pasta vale o salvo por último — o mais antigo é apagado.</w:t>
       </w:r>
     </w:p>
     <w:p>
@@ -2829,7 +2838,7 @@
               <a:graphicData uri="http://schemas.openxmlformats.org/drawingml/2006/picture">
                 <pic:pic>
                   <pic:nvPicPr>
-                    <pic:cNvPr id="0" name="tmpy5vsxctt.png"/>
+                    <pic:cNvPr id="0" name="tmp53gnfp0u.png"/>
                     <pic:cNvPicPr/>
                   </pic:nvPicPr>
                   <pic:blipFill>
@@ -2894,7 +2903,7 @@
               <a:graphicData uri="http://schemas.openxmlformats.org/drawingml/2006/picture">
                 <pic:pic>
                   <pic:nvPicPr>
-                    <pic:cNvPr id="0" name="tmpg9bx5htc.png"/>
+                    <pic:cNvPr id="0" name="tmpx57aicqn.png"/>
                     <pic:cNvPicPr/>
                   </pic:nvPicPr>
                   <pic:blipFill>
@@ -3013,7 +3022,7 @@
               <a:graphicData uri="http://schemas.openxmlformats.org/drawingml/2006/picture">
                 <pic:pic>
                   <pic:nvPicPr>
-                    <pic:cNvPr id="0" name="tmpxvg9tmzn.png"/>
+                    <pic:cNvPr id="0" name="tmp76txx05n.png"/>
                     <pic:cNvPicPr/>
                   </pic:nvPicPr>
                   <pic:blipFill>
@@ -3080,7 +3089,7 @@
               <a:graphicData uri="http://schemas.openxmlformats.org/drawingml/2006/picture">
                 <pic:pic>
                   <pic:nvPicPr>
-                    <pic:cNvPr id="0" name="tmpfgat9mss.png"/>
+                    <pic:cNvPr id="0" name="tmp4p7a0e31.png"/>
                     <pic:cNvPicPr/>
                   </pic:nvPicPr>
                   <pic:blipFill>
@@ -3217,7 +3226,7 @@
               <a:graphicData uri="http://schemas.openxmlformats.org/drawingml/2006/picture">
                 <pic:pic>
                   <pic:nvPicPr>
-                    <pic:cNvPr id="0" name="tmp6d_kudwc.png"/>
+                    <pic:cNvPr id="0" name="tmp3uwz0klp.png"/>
                     <pic:cNvPicPr/>
                   </pic:nvPicPr>
                   <pic:blipFill>
@@ -3296,7 +3305,7 @@
               <a:graphicData uri="http://schemas.openxmlformats.org/drawingml/2006/picture">
                 <pic:pic>
                   <pic:nvPicPr>
-                    <pic:cNvPr id="0" name="tmpt7n99q3i.png"/>
+                    <pic:cNvPr id="0" name="tmpvarg5pm5.png"/>
                     <pic:cNvPicPr/>
                   </pic:nvPicPr>
                   <pic:blipFill>
@@ -3363,7 +3372,7 @@
               <a:graphicData uri="http://schemas.openxmlformats.org/drawingml/2006/picture">
                 <pic:pic>
                   <pic:nvPicPr>
-                    <pic:cNvPr id="0" name="tmp5qouwxby.png"/>
+                    <pic:cNvPr id="0" name="tmpwajppjyr.png"/>
                     <pic:cNvPicPr/>
                   </pic:nvPicPr>
                   <pic:blipFill>
@@ -3419,7 +3428,7 @@
               <a:graphicData uri="http://schemas.openxmlformats.org/drawingml/2006/picture">
                 <pic:pic>
                   <pic:nvPicPr>
-                    <pic:cNvPr id="0" name="tmp9qvcngwx.png"/>
+                    <pic:cNvPr id="0" name="tmpjzwrvb2f.png"/>
                     <pic:cNvPicPr/>
                   </pic:nvPicPr>
                   <pic:blipFill>
@@ -3486,7 +3495,7 @@
               <a:graphicData uri="http://schemas.openxmlformats.org/drawingml/2006/picture">
                 <pic:pic>
                   <pic:nvPicPr>
-                    <pic:cNvPr id="0" name="tmp7kvxhq70.png"/>
+                    <pic:cNvPr id="0" name="tmpwk75zb41.png"/>
                     <pic:cNvPicPr/>
                   </pic:nvPicPr>
                   <pic:blipFill>
@@ -3542,7 +3551,7 @@
               <a:graphicData uri="http://schemas.openxmlformats.org/drawingml/2006/picture">
                 <pic:pic>
                   <pic:nvPicPr>
-                    <pic:cNvPr id="0" name="tmpht23cf8v.png"/>
+                    <pic:cNvPr id="0" name="tmpfxayjakn.png"/>
                     <pic:cNvPicPr/>
                   </pic:nvPicPr>
                   <pic:blipFill>
@@ -3598,7 +3607,7 @@
               <a:graphicData uri="http://schemas.openxmlformats.org/drawingml/2006/picture">
                 <pic:pic>
                   <pic:nvPicPr>
-                    <pic:cNvPr id="0" name="tmpjvel93y7.png"/>
+                    <pic:cNvPr id="0" name="tmp5b0y8f50.png"/>
                     <pic:cNvPicPr/>
                   </pic:nvPicPr>
                   <pic:blipFill>
@@ -3654,7 +3663,7 @@
               <a:graphicData uri="http://schemas.openxmlformats.org/drawingml/2006/picture">
                 <pic:pic>
                   <pic:nvPicPr>
-                    <pic:cNvPr id="0" name="tmpq_y9_p41.png"/>
+                    <pic:cNvPr id="0" name="tmpejwby14u.png"/>
                     <pic:cNvPicPr/>
                   </pic:nvPicPr>
                   <pic:blipFill>
@@ -3710,7 +3719,7 @@
               <a:graphicData uri="http://schemas.openxmlformats.org/drawingml/2006/picture">
                 <pic:pic>
                   <pic:nvPicPr>
-                    <pic:cNvPr id="0" name="tmp69ancnk1.png"/>
+                    <pic:cNvPr id="0" name="tmpnwvwobkh.png"/>
                     <pic:cNvPicPr/>
                   </pic:nvPicPr>
                   <pic:blipFill>
@@ -3766,7 +3775,7 @@
               <a:graphicData uri="http://schemas.openxmlformats.org/drawingml/2006/picture">
                 <pic:pic>
                   <pic:nvPicPr>
-                    <pic:cNvPr id="0" name="tmpmfxs88cm.png"/>
+                    <pic:cNvPr id="0" name="tmp598qhlmb.png"/>
                     <pic:cNvPicPr/>
                   </pic:nvPicPr>
                   <pic:blipFill>
@@ -4488,7 +4497,7 @@
               <a:graphicData uri="http://schemas.openxmlformats.org/drawingml/2006/picture">
                 <pic:pic>
                   <pic:nvPicPr>
-                    <pic:cNvPr id="0" name="tmpheu7ronq.png"/>
+                    <pic:cNvPr id="0" name="tmprazimw9x.png"/>
                     <pic:cNvPicPr/>
                   </pic:nvPicPr>
                   <pic:blipFill>
@@ -4544,7 +4553,7 @@
               <a:graphicData uri="http://schemas.openxmlformats.org/drawingml/2006/picture">
                 <pic:pic>
                   <pic:nvPicPr>
-                    <pic:cNvPr id="0" name="tmpnfc_zlde.png"/>
+                    <pic:cNvPr id="0" name="tmp1wsyksab.png"/>
                     <pic:cNvPicPr/>
                   </pic:nvPicPr>
                   <pic:blipFill>
@@ -4647,7 +4656,7 @@
               <a:graphicData uri="http://schemas.openxmlformats.org/drawingml/2006/picture">
                 <pic:pic>
                   <pic:nvPicPr>
-                    <pic:cNvPr id="0" name="tmpwamnfn5g.png"/>
+                    <pic:cNvPr id="0" name="tmpzpxwrz4r.png"/>
                     <pic:cNvPicPr/>
                   </pic:nvPicPr>
                   <pic:blipFill>
@@ -4732,7 +4741,7 @@
               <a:graphicData uri="http://schemas.openxmlformats.org/drawingml/2006/picture">
                 <pic:pic>
                   <pic:nvPicPr>
-                    <pic:cNvPr id="0" name="tmpsuzns7vf.png"/>
+                    <pic:cNvPr id="0" name="tmp4qyka9c8.png"/>
                     <pic:cNvPicPr/>
                   </pic:nvPicPr>
                   <pic:blipFill>
@@ -4788,7 +4797,7 @@
               <a:graphicData uri="http://schemas.openxmlformats.org/drawingml/2006/picture">
                 <pic:pic>
                   <pic:nvPicPr>
-                    <pic:cNvPr id="0" name="tmpe9cn8m9v.png"/>
+                    <pic:cNvPr id="0" name="tmpn9c060g2.png"/>
                     <pic:cNvPicPr/>
                   </pic:nvPicPr>
                   <pic:blipFill>
@@ -4844,7 +4853,7 @@
               <a:graphicData uri="http://schemas.openxmlformats.org/drawingml/2006/picture">
                 <pic:pic>
                   <pic:nvPicPr>
-                    <pic:cNvPr id="0" name="tmpxj6rs640.png"/>
+                    <pic:cNvPr id="0" name="tmpa_rdo8ad.png"/>
                     <pic:cNvPicPr/>
                   </pic:nvPicPr>
                   <pic:blipFill>
@@ -4900,7 +4909,7 @@
               <a:graphicData uri="http://schemas.openxmlformats.org/drawingml/2006/picture">
                 <pic:pic>
                   <pic:nvPicPr>
-                    <pic:cNvPr id="0" name="tmpayv11sui.png"/>
+                    <pic:cNvPr id="0" name="tmpblvzr0pc.png"/>
                     <pic:cNvPicPr/>
                   </pic:nvPicPr>
                   <pic:blipFill>
@@ -4956,7 +4965,7 @@
               <a:graphicData uri="http://schemas.openxmlformats.org/drawingml/2006/picture">
                 <pic:pic>
                   <pic:nvPicPr>
-                    <pic:cNvPr id="0" name="tmp1q_qql0z.png"/>
+                    <pic:cNvPr id="0" name="tmpurfwvq17.png"/>
                     <pic:cNvPicPr/>
                   </pic:nvPicPr>
                   <pic:blipFill>

</xml_diff>

<commit_message>
docs: HANDOFF §670, CLAUDE.md, Guia e SOP — recompra de Opção Comm e Swap EDG, match manual numa linha
HANDOFF §670 registra por que só o NDF de Commodities chegava à liquidação
(a lista de páginas com esteira tinha uma entrada, e o opb3-events barrava a
antecipação pela B3), o que cada produto passou a fazer (Termo com os
valores do produto, XML OPTION/SWAP, aviso de opção sem IR, swap pela mesma
leitura no Trade Level e no aviso, o fundo fora do documento), a suposição
do IR do swap a confirmar e o match manual numa linha. O CLAUDE.md troca o
"os outros produtos do catálogo ainda não têm Termo" pelo desenho novo e
conta o check_unwind_settlement.py; o README dos testes diz o que ele
prende. O Guia e o SOP dizem o ciclo das duas recompras e a linha única do
Match; os .docx regerados pelo build_sop_docx.py.

Co-Authored-By: Claude Opus 5.5 (1M context) <noreply@anthropic.com>
</commit_message>
<xml_diff>
--- a/SOP_PROCESSAMENTO_OTC.docx
+++ b/SOP_PROCESSAMENTO_OTC.docx
@@ -476,7 +476,7 @@
               <a:graphicData uri="http://schemas.openxmlformats.org/drawingml/2006/picture">
                 <pic:pic>
                   <pic:nvPicPr>
-                    <pic:cNvPr id="0" name="tmpekoekjpx.png"/>
+                    <pic:cNvPr id="0" name="tmpxh94iolz.png"/>
                     <pic:cNvPicPr/>
                   </pic:nvPicPr>
                   <pic:blipFill>
@@ -536,7 +536,7 @@
               <a:graphicData uri="http://schemas.openxmlformats.org/drawingml/2006/picture">
                 <pic:pic>
                   <pic:nvPicPr>
-                    <pic:cNvPr id="0" name="tmpen0qdvwb.png"/>
+                    <pic:cNvPr id="0" name="tmpl8eas21y.png"/>
                     <pic:cNvPicPr/>
                   </pic:nvPicPr>
                   <pic:blipFill>
@@ -596,7 +596,7 @@
               <a:graphicData uri="http://schemas.openxmlformats.org/drawingml/2006/picture">
                 <pic:pic>
                   <pic:nvPicPr>
-                    <pic:cNvPr id="0" name="tmpjd23a4dg.png"/>
+                    <pic:cNvPr id="0" name="tmpx6_25c8u.png"/>
                     <pic:cNvPicPr/>
                   </pic:nvPicPr>
                   <pic:blipFill>
@@ -656,7 +656,7 @@
               <a:graphicData uri="http://schemas.openxmlformats.org/drawingml/2006/picture">
                 <pic:pic>
                   <pic:nvPicPr>
-                    <pic:cNvPr id="0" name="tmp1h0sbgbb.png"/>
+                    <pic:cNvPr id="0" name="tmp076rfm1_.png"/>
                     <pic:cNvPicPr/>
                   </pic:nvPicPr>
                   <pic:blipFill>
@@ -716,7 +716,7 @@
               <a:graphicData uri="http://schemas.openxmlformats.org/drawingml/2006/picture">
                 <pic:pic>
                   <pic:nvPicPr>
-                    <pic:cNvPr id="0" name="tmpjzwrvb2f.png"/>
+                    <pic:cNvPr id="0" name="tmpb08zrjvz.png"/>
                     <pic:cNvPicPr/>
                   </pic:nvPicPr>
                   <pic:blipFill>
@@ -990,7 +990,7 @@
               <a:graphicData uri="http://schemas.openxmlformats.org/drawingml/2006/picture">
                 <pic:pic>
                   <pic:nvPicPr>
-                    <pic:cNvPr id="0" name="tmpasu17pj6.png"/>
+                    <pic:cNvPr id="0" name="tmphhar7mj_.png"/>
                     <pic:cNvPicPr/>
                   </pic:nvPicPr>
                   <pic:blipFill>
@@ -1046,7 +1046,7 @@
               <a:graphicData uri="http://schemas.openxmlformats.org/drawingml/2006/picture">
                 <pic:pic>
                   <pic:nvPicPr>
-                    <pic:cNvPr id="0" name="tmps3u8v5jv.png"/>
+                    <pic:cNvPr id="0" name="tmpcxyx0xnx.png"/>
                     <pic:cNvPicPr/>
                   </pic:nvPicPr>
                   <pic:blipFill>
@@ -1174,7 +1174,7 @@
               <a:graphicData uri="http://schemas.openxmlformats.org/drawingml/2006/picture">
                 <pic:pic>
                   <pic:nvPicPr>
-                    <pic:cNvPr id="0" name="tmpm_thyckz.png"/>
+                    <pic:cNvPr id="0" name="tmp05o_yxmx.png"/>
                     <pic:cNvPicPr/>
                   </pic:nvPicPr>
                   <pic:blipFill>
@@ -1239,7 +1239,7 @@
               <a:graphicData uri="http://schemas.openxmlformats.org/drawingml/2006/picture">
                 <pic:pic>
                   <pic:nvPicPr>
-                    <pic:cNvPr id="0" name="tmph4swcd13.png"/>
+                    <pic:cNvPr id="0" name="tmp0nknojbz.png"/>
                     <pic:cNvPicPr/>
                   </pic:nvPicPr>
                   <pic:blipFill>
@@ -1564,7 +1564,7 @@
               <a:graphicData uri="http://schemas.openxmlformats.org/drawingml/2006/picture">
                 <pic:pic>
                   <pic:nvPicPr>
-                    <pic:cNvPr id="0" name="tmpekoekjpx.png"/>
+                    <pic:cNvPr id="0" name="tmpxh94iolz.png"/>
                     <pic:cNvPicPr/>
                   </pic:nvPicPr>
                   <pic:blipFill>
@@ -1950,7 +1950,7 @@
               <a:graphicData uri="http://schemas.openxmlformats.org/drawingml/2006/picture">
                 <pic:pic>
                   <pic:nvPicPr>
-                    <pic:cNvPr id="0" name="tmpjd23a4dg.png"/>
+                    <pic:cNvPr id="0" name="tmpx6_25c8u.png"/>
                     <pic:cNvPicPr/>
                   </pic:nvPicPr>
                   <pic:blipFill>
@@ -2006,7 +2006,7 @@
               <a:graphicData uri="http://schemas.openxmlformats.org/drawingml/2006/picture">
                 <pic:pic>
                   <pic:nvPicPr>
-                    <pic:cNvPr id="0" name="tmpen0qdvwb.png"/>
+                    <pic:cNvPr id="0" name="tmpl8eas21y.png"/>
                     <pic:cNvPicPr/>
                   </pic:nvPicPr>
                   <pic:blipFill>
@@ -2198,7 +2198,7 @@
               <a:graphicData uri="http://schemas.openxmlformats.org/drawingml/2006/picture">
                 <pic:pic>
                   <pic:nvPicPr>
-                    <pic:cNvPr id="0" name="tmpwi_rtyx8.png"/>
+                    <pic:cNvPr id="0" name="tmpr74n8sry.png"/>
                     <pic:cNvPicPr/>
                   </pic:nvPicPr>
                   <pic:blipFill>
@@ -2254,7 +2254,7 @@
               <a:graphicData uri="http://schemas.openxmlformats.org/drawingml/2006/picture">
                 <pic:pic>
                   <pic:nvPicPr>
-                    <pic:cNvPr id="0" name="tmpyg6q8_sv.png"/>
+                    <pic:cNvPr id="0" name="tmpe5fx6bhc.png"/>
                     <pic:cNvPicPr/>
                   </pic:nvPicPr>
                   <pic:blipFill>
@@ -2310,7 +2310,7 @@
               <a:graphicData uri="http://schemas.openxmlformats.org/drawingml/2006/picture">
                 <pic:pic>
                   <pic:nvPicPr>
-                    <pic:cNvPr id="0" name="tmpvkmttv7m.png"/>
+                    <pic:cNvPr id="0" name="tmp3pnfzxbk.png"/>
                     <pic:cNvPicPr/>
                   </pic:nvPicPr>
                   <pic:blipFill>
@@ -2417,7 +2417,7 @@
               <a:graphicData uri="http://schemas.openxmlformats.org/drawingml/2006/picture">
                 <pic:pic>
                   <pic:nvPicPr>
-                    <pic:cNvPr id="0" name="tmp1h0sbgbb.png"/>
+                    <pic:cNvPr id="0" name="tmp076rfm1_.png"/>
                     <pic:cNvPicPr/>
                   </pic:nvPicPr>
                   <pic:blipFill>
@@ -2524,7 +2524,7 @@
               <a:graphicData uri="http://schemas.openxmlformats.org/drawingml/2006/picture">
                 <pic:pic>
                   <pic:nvPicPr>
-                    <pic:cNvPr id="0" name="tmpu6c4am4d.png"/>
+                    <pic:cNvPr id="0" name="tmpmrsuwbob.png"/>
                     <pic:cNvPicPr/>
                   </pic:nvPicPr>
                   <pic:blipFill>
@@ -2631,7 +2631,7 @@
               <a:graphicData uri="http://schemas.openxmlformats.org/drawingml/2006/picture">
                 <pic:pic>
                   <pic:nvPicPr>
-                    <pic:cNvPr id="0" name="tmpfpdltp80.png"/>
+                    <pic:cNvPr id="0" name="tmpwjzxsv9t.png"/>
                     <pic:cNvPicPr/>
                   </pic:nvPicPr>
                   <pic:blipFill>
@@ -2687,7 +2687,7 @@
               <a:graphicData uri="http://schemas.openxmlformats.org/drawingml/2006/picture">
                 <pic:pic>
                   <pic:nvPicPr>
-                    <pic:cNvPr id="0" name="tmpxmc64h5f.png"/>
+                    <pic:cNvPr id="0" name="tmp7pxvuj78.png"/>
                     <pic:cNvPicPr/>
                   </pic:nvPicPr>
                   <pic:blipFill>
@@ -2754,7 +2754,7 @@
               <a:graphicData uri="http://schemas.openxmlformats.org/drawingml/2006/picture">
                 <pic:pic>
                   <pic:nvPicPr>
-                    <pic:cNvPr id="0" name="tmpq9zq3d9e.png"/>
+                    <pic:cNvPr id="0" name="tmpadgb3_4u.png"/>
                     <pic:cNvPicPr/>
                   </pic:nvPicPr>
                   <pic:blipFill>
@@ -2838,7 +2838,7 @@
               <a:graphicData uri="http://schemas.openxmlformats.org/drawingml/2006/picture">
                 <pic:pic>
                   <pic:nvPicPr>
-                    <pic:cNvPr id="0" name="tmp53gnfp0u.png"/>
+                    <pic:cNvPr id="0" name="tmpawey_4j7.png"/>
                     <pic:cNvPicPr/>
                   </pic:nvPicPr>
                   <pic:blipFill>
@@ -2903,7 +2903,7 @@
               <a:graphicData uri="http://schemas.openxmlformats.org/drawingml/2006/picture">
                 <pic:pic>
                   <pic:nvPicPr>
-                    <pic:cNvPr id="0" name="tmpx57aicqn.png"/>
+                    <pic:cNvPr id="0" name="tmpwd9jc0pi.png"/>
                     <pic:cNvPicPr/>
                   </pic:nvPicPr>
                   <pic:blipFill>
@@ -3022,7 +3022,7 @@
               <a:graphicData uri="http://schemas.openxmlformats.org/drawingml/2006/picture">
                 <pic:pic>
                   <pic:nvPicPr>
-                    <pic:cNvPr id="0" name="tmp76txx05n.png"/>
+                    <pic:cNvPr id="0" name="tmp4dz4cfwa.png"/>
                     <pic:cNvPicPr/>
                   </pic:nvPicPr>
                   <pic:blipFill>
@@ -3089,7 +3089,7 @@
               <a:graphicData uri="http://schemas.openxmlformats.org/drawingml/2006/picture">
                 <pic:pic>
                   <pic:nvPicPr>
-                    <pic:cNvPr id="0" name="tmp4p7a0e31.png"/>
+                    <pic:cNvPr id="0" name="tmpj2vo0gpw.png"/>
                     <pic:cNvPicPr/>
                   </pic:nvPicPr>
                   <pic:blipFill>
@@ -3226,7 +3226,7 @@
               <a:graphicData uri="http://schemas.openxmlformats.org/drawingml/2006/picture">
                 <pic:pic>
                   <pic:nvPicPr>
-                    <pic:cNvPr id="0" name="tmp3uwz0klp.png"/>
+                    <pic:cNvPr id="0" name="tmp06lalhus.png"/>
                     <pic:cNvPicPr/>
                   </pic:nvPicPr>
                   <pic:blipFill>
@@ -3305,7 +3305,7 @@
               <a:graphicData uri="http://schemas.openxmlformats.org/drawingml/2006/picture">
                 <pic:pic>
                   <pic:nvPicPr>
-                    <pic:cNvPr id="0" name="tmpvarg5pm5.png"/>
+                    <pic:cNvPr id="0" name="tmpp6ln4_j5.png"/>
                     <pic:cNvPicPr/>
                   </pic:nvPicPr>
                   <pic:blipFill>
@@ -3372,7 +3372,7 @@
               <a:graphicData uri="http://schemas.openxmlformats.org/drawingml/2006/picture">
                 <pic:pic>
                   <pic:nvPicPr>
-                    <pic:cNvPr id="0" name="tmpwajppjyr.png"/>
+                    <pic:cNvPr id="0" name="tmpabh3lwx2.png"/>
                     <pic:cNvPicPr/>
                   </pic:nvPicPr>
                   <pic:blipFill>
@@ -3428,7 +3428,7 @@
               <a:graphicData uri="http://schemas.openxmlformats.org/drawingml/2006/picture">
                 <pic:pic>
                   <pic:nvPicPr>
-                    <pic:cNvPr id="0" name="tmpjzwrvb2f.png"/>
+                    <pic:cNvPr id="0" name="tmpb08zrjvz.png"/>
                     <pic:cNvPicPr/>
                   </pic:nvPicPr>
                   <pic:blipFill>
@@ -3495,7 +3495,7 @@
               <a:graphicData uri="http://schemas.openxmlformats.org/drawingml/2006/picture">
                 <pic:pic>
                   <pic:nvPicPr>
-                    <pic:cNvPr id="0" name="tmpwk75zb41.png"/>
+                    <pic:cNvPr id="0" name="tmpss1phj5d.png"/>
                     <pic:cNvPicPr/>
                   </pic:nvPicPr>
                   <pic:blipFill>
@@ -3551,7 +3551,7 @@
               <a:graphicData uri="http://schemas.openxmlformats.org/drawingml/2006/picture">
                 <pic:pic>
                   <pic:nvPicPr>
-                    <pic:cNvPr id="0" name="tmpfxayjakn.png"/>
+                    <pic:cNvPr id="0" name="tmp4iocypim.png"/>
                     <pic:cNvPicPr/>
                   </pic:nvPicPr>
                   <pic:blipFill>
@@ -3607,7 +3607,7 @@
               <a:graphicData uri="http://schemas.openxmlformats.org/drawingml/2006/picture">
                 <pic:pic>
                   <pic:nvPicPr>
-                    <pic:cNvPr id="0" name="tmp5b0y8f50.png"/>
+                    <pic:cNvPr id="0" name="tmpw7gb4pim.png"/>
                     <pic:cNvPicPr/>
                   </pic:nvPicPr>
                   <pic:blipFill>
@@ -3663,7 +3663,7 @@
               <a:graphicData uri="http://schemas.openxmlformats.org/drawingml/2006/picture">
                 <pic:pic>
                   <pic:nvPicPr>
-                    <pic:cNvPr id="0" name="tmpejwby14u.png"/>
+                    <pic:cNvPr id="0" name="tmp5gxvr52k.png"/>
                     <pic:cNvPicPr/>
                   </pic:nvPicPr>
                   <pic:blipFill>
@@ -3719,7 +3719,7 @@
               <a:graphicData uri="http://schemas.openxmlformats.org/drawingml/2006/picture">
                 <pic:pic>
                   <pic:nvPicPr>
-                    <pic:cNvPr id="0" name="tmpnwvwobkh.png"/>
+                    <pic:cNvPr id="0" name="tmpmdwfpoz9.png"/>
                     <pic:cNvPicPr/>
                   </pic:nvPicPr>
                   <pic:blipFill>
@@ -3775,7 +3775,7 @@
               <a:graphicData uri="http://schemas.openxmlformats.org/drawingml/2006/picture">
                 <pic:pic>
                   <pic:nvPicPr>
-                    <pic:cNvPr id="0" name="tmp598qhlmb.png"/>
+                    <pic:cNvPr id="0" name="tmpiga9e1zt.png"/>
                     <pic:cNvPicPr/>
                   </pic:nvPicPr>
                   <pic:blipFill>
@@ -4322,7 +4322,7 @@
     </w:p>
     <w:p>
       <w:r>
-        <w:t>Valor Base saem só com a quantidade, sem o código da mercadoria. Swap, Options, COE e DCE ainda não têm Termo, esteira nem Intrag.</w:t>
+        <w:t>Valor Base saem só com a quantidade, sem o código da mercadoria. A recompra de Opção de Commodities e a de Swap EDG seguem o mesmo ciclo: contra o cliente, Termo de Resilição e esteira; contra Atacama/Lawton, a Intrag › Unwind; a liquidação no Other Products e no Settlement Advice de opção e de swap, com o aviso de recompra. Swap CEM, Options FXO/EDG, COE e DCE ainda não têm Termo nem esteira.</w:t>
       </w:r>
     </w:p>
     <w:p>
@@ -4497,7 +4497,7 @@
               <a:graphicData uri="http://schemas.openxmlformats.org/drawingml/2006/picture">
                 <pic:pic>
                   <pic:nvPicPr>
-                    <pic:cNvPr id="0" name="tmprazimw9x.png"/>
+                    <pic:cNvPr id="0" name="tmpifto0bjj.png"/>
                     <pic:cNvPicPr/>
                   </pic:nvPicPr>
                   <pic:blipFill>
@@ -4553,7 +4553,7 @@
               <a:graphicData uri="http://schemas.openxmlformats.org/drawingml/2006/picture">
                 <pic:pic>
                   <pic:nvPicPr>
-                    <pic:cNvPr id="0" name="tmp1wsyksab.png"/>
+                    <pic:cNvPr id="0" name="tmpto6ee5xn.png"/>
                     <pic:cNvPicPr/>
                   </pic:nvPicPr>
                   <pic:blipFill>
@@ -4656,7 +4656,7 @@
               <a:graphicData uri="http://schemas.openxmlformats.org/drawingml/2006/picture">
                 <pic:pic>
                   <pic:nvPicPr>
-                    <pic:cNvPr id="0" name="tmpzpxwrz4r.png"/>
+                    <pic:cNvPr id="0" name="tmpf4a1g9mr.png"/>
                     <pic:cNvPicPr/>
                   </pic:nvPicPr>
                   <pic:blipFill>
@@ -4741,7 +4741,7 @@
               <a:graphicData uri="http://schemas.openxmlformats.org/drawingml/2006/picture">
                 <pic:pic>
                   <pic:nvPicPr>
-                    <pic:cNvPr id="0" name="tmp4qyka9c8.png"/>
+                    <pic:cNvPr id="0" name="tmpje7xewo3.png"/>
                     <pic:cNvPicPr/>
                   </pic:nvPicPr>
                   <pic:blipFill>
@@ -4797,7 +4797,7 @@
               <a:graphicData uri="http://schemas.openxmlformats.org/drawingml/2006/picture">
                 <pic:pic>
                   <pic:nvPicPr>
-                    <pic:cNvPr id="0" name="tmpn9c060g2.png"/>
+                    <pic:cNvPr id="0" name="tmp6uqh2c_1.png"/>
                     <pic:cNvPicPr/>
                   </pic:nvPicPr>
                   <pic:blipFill>
@@ -4853,7 +4853,7 @@
               <a:graphicData uri="http://schemas.openxmlformats.org/drawingml/2006/picture">
                 <pic:pic>
                   <pic:nvPicPr>
-                    <pic:cNvPr id="0" name="tmpa_rdo8ad.png"/>
+                    <pic:cNvPr id="0" name="tmpifpd2htx.png"/>
                     <pic:cNvPicPr/>
                   </pic:nvPicPr>
                   <pic:blipFill>
@@ -4909,7 +4909,7 @@
               <a:graphicData uri="http://schemas.openxmlformats.org/drawingml/2006/picture">
                 <pic:pic>
                   <pic:nvPicPr>
-                    <pic:cNvPr id="0" name="tmpblvzr0pc.png"/>
+                    <pic:cNvPr id="0" name="tmp96c_0m_3.png"/>
                     <pic:cNvPicPr/>
                   </pic:nvPicPr>
                   <pic:blipFill>
@@ -4965,7 +4965,7 @@
               <a:graphicData uri="http://schemas.openxmlformats.org/drawingml/2006/picture">
                 <pic:pic>
                   <pic:nvPicPr>
-                    <pic:cNvPr id="0" name="tmpurfwvq17.png"/>
+                    <pic:cNvPr id="0" name="tmp8yiscpc5.png"/>
                     <pic:cNvPicPr/>
                   </pic:nvPicPr>
                   <pic:blipFill>

</xml_diff>

<commit_message>
docs: HANDOFF §675/§676, CLAUDE.md, Guia e SOP — datas, Import do Summary e o dia de hoje
HANDOFF §675 (o datepicker da casa: o helper, o laço do setDate, as telas
que saíram do nativo, a prova nas 99 telas) e §676 (o Import settlement no
NDF Summary). O CLAUDE.md troca "type=date só invisível" pela regra do
date-std.js e diz que o typeableDate da Quotes ficou só com o Enter; o
README dos testes conta o §5 novo do check_export_padrao.

O Guia e o SOP estavam para trás de tudo o que mudou hoje: as paredes da
paleta do sistema (3.9), o Today e o "vale para todo campo de data" (4.11),
o Import settlement e o piso de IR do MÊS no NDF Summary (6.1 e o verbete do
SOP), e o Database Explorer só do master (menu, 15.3 e índice). Os .docx
regerados pelo build_sop_docx.py.

Co-Authored-By: Claude Opus 5.5 (1M context) <noreply@anthropic.com>
</commit_message>
<xml_diff>
--- a/SOP_PROCESSAMENTO_OTC.docx
+++ b/SOP_PROCESSAMENTO_OTC.docx
@@ -476,7 +476,7 @@
               <a:graphicData uri="http://schemas.openxmlformats.org/drawingml/2006/picture">
                 <pic:pic>
                   <pic:nvPicPr>
-                    <pic:cNvPr id="0" name="tmpxh94iolz.png"/>
+                    <pic:cNvPr id="0" name="tmpqwscq83f.png"/>
                     <pic:cNvPicPr/>
                   </pic:nvPicPr>
                   <pic:blipFill>
@@ -536,7 +536,7 @@
               <a:graphicData uri="http://schemas.openxmlformats.org/drawingml/2006/picture">
                 <pic:pic>
                   <pic:nvPicPr>
-                    <pic:cNvPr id="0" name="tmpl8eas21y.png"/>
+                    <pic:cNvPr id="0" name="tmpnv9ujjc5.png"/>
                     <pic:cNvPicPr/>
                   </pic:nvPicPr>
                   <pic:blipFill>
@@ -596,7 +596,7 @@
               <a:graphicData uri="http://schemas.openxmlformats.org/drawingml/2006/picture">
                 <pic:pic>
                   <pic:nvPicPr>
-                    <pic:cNvPr id="0" name="tmpx6_25c8u.png"/>
+                    <pic:cNvPr id="0" name="tmpmjdgl5lh.png"/>
                     <pic:cNvPicPr/>
                   </pic:nvPicPr>
                   <pic:blipFill>
@@ -656,7 +656,7 @@
               <a:graphicData uri="http://schemas.openxmlformats.org/drawingml/2006/picture">
                 <pic:pic>
                   <pic:nvPicPr>
-                    <pic:cNvPr id="0" name="tmp076rfm1_.png"/>
+                    <pic:cNvPr id="0" name="tmp5xfokiq3.png"/>
                     <pic:cNvPicPr/>
                   </pic:nvPicPr>
                   <pic:blipFill>
@@ -716,7 +716,7 @@
               <a:graphicData uri="http://schemas.openxmlformats.org/drawingml/2006/picture">
                 <pic:pic>
                   <pic:nvPicPr>
-                    <pic:cNvPr id="0" name="tmpb08zrjvz.png"/>
+                    <pic:cNvPr id="0" name="tmpkryjoe91.png"/>
                     <pic:cNvPicPr/>
                   </pic:nvPicPr>
                   <pic:blipFill>
@@ -990,7 +990,7 @@
               <a:graphicData uri="http://schemas.openxmlformats.org/drawingml/2006/picture">
                 <pic:pic>
                   <pic:nvPicPr>
-                    <pic:cNvPr id="0" name="tmphhar7mj_.png"/>
+                    <pic:cNvPr id="0" name="tmp1fn69eob.png"/>
                     <pic:cNvPicPr/>
                   </pic:nvPicPr>
                   <pic:blipFill>
@@ -1046,7 +1046,7 @@
               <a:graphicData uri="http://schemas.openxmlformats.org/drawingml/2006/picture">
                 <pic:pic>
                   <pic:nvPicPr>
-                    <pic:cNvPr id="0" name="tmpcxyx0xnx.png"/>
+                    <pic:cNvPr id="0" name="tmpkwzirj4v.png"/>
                     <pic:cNvPicPr/>
                   </pic:nvPicPr>
                   <pic:blipFill>
@@ -1174,7 +1174,7 @@
               <a:graphicData uri="http://schemas.openxmlformats.org/drawingml/2006/picture">
                 <pic:pic>
                   <pic:nvPicPr>
-                    <pic:cNvPr id="0" name="tmp05o_yxmx.png"/>
+                    <pic:cNvPr id="0" name="tmp9z91lwyj.png"/>
                     <pic:cNvPicPr/>
                   </pic:nvPicPr>
                   <pic:blipFill>
@@ -1239,7 +1239,7 @@
               <a:graphicData uri="http://schemas.openxmlformats.org/drawingml/2006/picture">
                 <pic:pic>
                   <pic:nvPicPr>
-                    <pic:cNvPr id="0" name="tmp0nknojbz.png"/>
+                    <pic:cNvPr id="0" name="tmpa1p3cpav.png"/>
                     <pic:cNvPicPr/>
                   </pic:nvPicPr>
                   <pic:blipFill>
@@ -1564,7 +1564,7 @@
               <a:graphicData uri="http://schemas.openxmlformats.org/drawingml/2006/picture">
                 <pic:pic>
                   <pic:nvPicPr>
-                    <pic:cNvPr id="0" name="tmpxh94iolz.png"/>
+                    <pic:cNvPr id="0" name="tmpqwscq83f.png"/>
                     <pic:cNvPicPr/>
                   </pic:nvPicPr>
                   <pic:blipFill>
@@ -1931,7 +1931,34 @@
         <w:t>Clear Filters</w:t>
       </w:r>
       <w:r>
-        <w:t>, que limpa os funis só dela.</w:t>
+        <w:t xml:space="preserve">, que limpa os funis só dela. O botão </w:t>
+      </w:r>
+      <w:r>
+        <w:rPr>
+          <w:b/>
+        </w:rPr>
+        <w:t>Import settlement</w:t>
+      </w:r>
+      <w:r>
+        <w:t xml:space="preserve">, ao lado da data, traz as liquidações do dia da Athena sem sair da tela (o mesmo import do NDF Cockpit). O IR (0,005%) segue o </w:t>
+      </w:r>
+      <w:r>
+        <w:rPr>
+          <w:b/>
+        </w:rPr>
+        <w:t>piso de R$ 1,00 do mês</w:t>
+      </w:r>
+      <w:r>
+        <w:t xml:space="preserve"> por contraparte: abaixo dele não se retém e acumula; ao alcançá-lo, retém-se a soma — e, </w:t>
+      </w:r>
+      <w:r>
+        <w:rPr>
+          <w:b/>
+        </w:rPr>
+        <w:t>alcançado o piso, toda liquidação seguinte da contraparte no mês retém</w:t>
+      </w:r>
+      <w:r>
+        <w:t>, mesmo centavos.</w:t>
       </w:r>
     </w:p>
     <w:p>
@@ -1950,7 +1977,7 @@
               <a:graphicData uri="http://schemas.openxmlformats.org/drawingml/2006/picture">
                 <pic:pic>
                   <pic:nvPicPr>
-                    <pic:cNvPr id="0" name="tmpx6_25c8u.png"/>
+                    <pic:cNvPr id="0" name="tmpmjdgl5lh.png"/>
                     <pic:cNvPicPr/>
                   </pic:nvPicPr>
                   <pic:blipFill>
@@ -2006,7 +2033,7 @@
               <a:graphicData uri="http://schemas.openxmlformats.org/drawingml/2006/picture">
                 <pic:pic>
                   <pic:nvPicPr>
-                    <pic:cNvPr id="0" name="tmpl8eas21y.png"/>
+                    <pic:cNvPr id="0" name="tmpnv9ujjc5.png"/>
                     <pic:cNvPicPr/>
                   </pic:nvPicPr>
                   <pic:blipFill>
@@ -2198,7 +2225,7 @@
               <a:graphicData uri="http://schemas.openxmlformats.org/drawingml/2006/picture">
                 <pic:pic>
                   <pic:nvPicPr>
-                    <pic:cNvPr id="0" name="tmpr74n8sry.png"/>
+                    <pic:cNvPr id="0" name="tmpi7c9pcnm.png"/>
                     <pic:cNvPicPr/>
                   </pic:nvPicPr>
                   <pic:blipFill>
@@ -2254,7 +2281,7 @@
               <a:graphicData uri="http://schemas.openxmlformats.org/drawingml/2006/picture">
                 <pic:pic>
                   <pic:nvPicPr>
-                    <pic:cNvPr id="0" name="tmpe5fx6bhc.png"/>
+                    <pic:cNvPr id="0" name="tmp6ujop30x.png"/>
                     <pic:cNvPicPr/>
                   </pic:nvPicPr>
                   <pic:blipFill>
@@ -2310,7 +2337,7 @@
               <a:graphicData uri="http://schemas.openxmlformats.org/drawingml/2006/picture">
                 <pic:pic>
                   <pic:nvPicPr>
-                    <pic:cNvPr id="0" name="tmp3pnfzxbk.png"/>
+                    <pic:cNvPr id="0" name="tmp2dyp6fkc.png"/>
                     <pic:cNvPicPr/>
                   </pic:nvPicPr>
                   <pic:blipFill>
@@ -2417,7 +2444,7 @@
               <a:graphicData uri="http://schemas.openxmlformats.org/drawingml/2006/picture">
                 <pic:pic>
                   <pic:nvPicPr>
-                    <pic:cNvPr id="0" name="tmp076rfm1_.png"/>
+                    <pic:cNvPr id="0" name="tmp5xfokiq3.png"/>
                     <pic:cNvPicPr/>
                   </pic:nvPicPr>
                   <pic:blipFill>
@@ -2524,7 +2551,7 @@
               <a:graphicData uri="http://schemas.openxmlformats.org/drawingml/2006/picture">
                 <pic:pic>
                   <pic:nvPicPr>
-                    <pic:cNvPr id="0" name="tmpmrsuwbob.png"/>
+                    <pic:cNvPr id="0" name="tmplg1i8gy9.png"/>
                     <pic:cNvPicPr/>
                   </pic:nvPicPr>
                   <pic:blipFill>
@@ -2631,7 +2658,7 @@
               <a:graphicData uri="http://schemas.openxmlformats.org/drawingml/2006/picture">
                 <pic:pic>
                   <pic:nvPicPr>
-                    <pic:cNvPr id="0" name="tmpwjzxsv9t.png"/>
+                    <pic:cNvPr id="0" name="tmpe0d9b7kq.png"/>
                     <pic:cNvPicPr/>
                   </pic:nvPicPr>
                   <pic:blipFill>
@@ -2687,7 +2714,7 @@
               <a:graphicData uri="http://schemas.openxmlformats.org/drawingml/2006/picture">
                 <pic:pic>
                   <pic:nvPicPr>
-                    <pic:cNvPr id="0" name="tmp7pxvuj78.png"/>
+                    <pic:cNvPr id="0" name="tmplfyj1yob.png"/>
                     <pic:cNvPicPr/>
                   </pic:nvPicPr>
                   <pic:blipFill>
@@ -2754,7 +2781,7 @@
               <a:graphicData uri="http://schemas.openxmlformats.org/drawingml/2006/picture">
                 <pic:pic>
                   <pic:nvPicPr>
-                    <pic:cNvPr id="0" name="tmpadgb3_4u.png"/>
+                    <pic:cNvPr id="0" name="tmpois0l0uo.png"/>
                     <pic:cNvPicPr/>
                   </pic:nvPicPr>
                   <pic:blipFill>
@@ -2838,7 +2865,7 @@
               <a:graphicData uri="http://schemas.openxmlformats.org/drawingml/2006/picture">
                 <pic:pic>
                   <pic:nvPicPr>
-                    <pic:cNvPr id="0" name="tmpawey_4j7.png"/>
+                    <pic:cNvPr id="0" name="tmp_6clbn_u.png"/>
                     <pic:cNvPicPr/>
                   </pic:nvPicPr>
                   <pic:blipFill>
@@ -2903,7 +2930,7 @@
               <a:graphicData uri="http://schemas.openxmlformats.org/drawingml/2006/picture">
                 <pic:pic>
                   <pic:nvPicPr>
-                    <pic:cNvPr id="0" name="tmpwd9jc0pi.png"/>
+                    <pic:cNvPr id="0" name="tmplibyxb0w.png"/>
                     <pic:cNvPicPr/>
                   </pic:nvPicPr>
                   <pic:blipFill>
@@ -3022,7 +3049,7 @@
               <a:graphicData uri="http://schemas.openxmlformats.org/drawingml/2006/picture">
                 <pic:pic>
                   <pic:nvPicPr>
-                    <pic:cNvPr id="0" name="tmp4dz4cfwa.png"/>
+                    <pic:cNvPr id="0" name="tmp1eiuuu79.png"/>
                     <pic:cNvPicPr/>
                   </pic:nvPicPr>
                   <pic:blipFill>
@@ -3089,7 +3116,7 @@
               <a:graphicData uri="http://schemas.openxmlformats.org/drawingml/2006/picture">
                 <pic:pic>
                   <pic:nvPicPr>
-                    <pic:cNvPr id="0" name="tmpj2vo0gpw.png"/>
+                    <pic:cNvPr id="0" name="tmpuptgjfr9.png"/>
                     <pic:cNvPicPr/>
                   </pic:nvPicPr>
                   <pic:blipFill>
@@ -3226,7 +3253,7 @@
               <a:graphicData uri="http://schemas.openxmlformats.org/drawingml/2006/picture">
                 <pic:pic>
                   <pic:nvPicPr>
-                    <pic:cNvPr id="0" name="tmp06lalhus.png"/>
+                    <pic:cNvPr id="0" name="tmpbhcp_pwy.png"/>
                     <pic:cNvPicPr/>
                   </pic:nvPicPr>
                   <pic:blipFill>
@@ -3305,7 +3332,7 @@
               <a:graphicData uri="http://schemas.openxmlformats.org/drawingml/2006/picture">
                 <pic:pic>
                   <pic:nvPicPr>
-                    <pic:cNvPr id="0" name="tmpp6ln4_j5.png"/>
+                    <pic:cNvPr id="0" name="tmpijf1r2aj.png"/>
                     <pic:cNvPicPr/>
                   </pic:nvPicPr>
                   <pic:blipFill>
@@ -3372,7 +3399,7 @@
               <a:graphicData uri="http://schemas.openxmlformats.org/drawingml/2006/picture">
                 <pic:pic>
                   <pic:nvPicPr>
-                    <pic:cNvPr id="0" name="tmpabh3lwx2.png"/>
+                    <pic:cNvPr id="0" name="tmpsg42a_1z.png"/>
                     <pic:cNvPicPr/>
                   </pic:nvPicPr>
                   <pic:blipFill>
@@ -3428,7 +3455,7 @@
               <a:graphicData uri="http://schemas.openxmlformats.org/drawingml/2006/picture">
                 <pic:pic>
                   <pic:nvPicPr>
-                    <pic:cNvPr id="0" name="tmpb08zrjvz.png"/>
+                    <pic:cNvPr id="0" name="tmpkryjoe91.png"/>
                     <pic:cNvPicPr/>
                   </pic:nvPicPr>
                   <pic:blipFill>
@@ -3495,7 +3522,7 @@
               <a:graphicData uri="http://schemas.openxmlformats.org/drawingml/2006/picture">
                 <pic:pic>
                   <pic:nvPicPr>
-                    <pic:cNvPr id="0" name="tmpss1phj5d.png"/>
+                    <pic:cNvPr id="0" name="tmp9jumvck0.png"/>
                     <pic:cNvPicPr/>
                   </pic:nvPicPr>
                   <pic:blipFill>
@@ -3551,7 +3578,7 @@
               <a:graphicData uri="http://schemas.openxmlformats.org/drawingml/2006/picture">
                 <pic:pic>
                   <pic:nvPicPr>
-                    <pic:cNvPr id="0" name="tmp4iocypim.png"/>
+                    <pic:cNvPr id="0" name="tmpi3ejma6z.png"/>
                     <pic:cNvPicPr/>
                   </pic:nvPicPr>
                   <pic:blipFill>
@@ -3607,7 +3634,7 @@
               <a:graphicData uri="http://schemas.openxmlformats.org/drawingml/2006/picture">
                 <pic:pic>
                   <pic:nvPicPr>
-                    <pic:cNvPr id="0" name="tmpw7gb4pim.png"/>
+                    <pic:cNvPr id="0" name="tmpj52188rb.png"/>
                     <pic:cNvPicPr/>
                   </pic:nvPicPr>
                   <pic:blipFill>
@@ -3663,7 +3690,7 @@
               <a:graphicData uri="http://schemas.openxmlformats.org/drawingml/2006/picture">
                 <pic:pic>
                   <pic:nvPicPr>
-                    <pic:cNvPr id="0" name="tmp5gxvr52k.png"/>
+                    <pic:cNvPr id="0" name="tmpvjm_s300.png"/>
                     <pic:cNvPicPr/>
                   </pic:nvPicPr>
                   <pic:blipFill>
@@ -3719,7 +3746,7 @@
               <a:graphicData uri="http://schemas.openxmlformats.org/drawingml/2006/picture">
                 <pic:pic>
                   <pic:nvPicPr>
-                    <pic:cNvPr id="0" name="tmpmdwfpoz9.png"/>
+                    <pic:cNvPr id="0" name="tmpc8t96y9w.png"/>
                     <pic:cNvPicPr/>
                   </pic:nvPicPr>
                   <pic:blipFill>
@@ -3775,7 +3802,7 @@
               <a:graphicData uri="http://schemas.openxmlformats.org/drawingml/2006/picture">
                 <pic:pic>
                   <pic:nvPicPr>
-                    <pic:cNvPr id="0" name="tmpiga9e1zt.png"/>
+                    <pic:cNvPr id="0" name="tmp93i6s7l4.png"/>
                     <pic:cNvPicPr/>
                   </pic:nvPicPr>
                   <pic:blipFill>
@@ -4497,7 +4524,7 @@
               <a:graphicData uri="http://schemas.openxmlformats.org/drawingml/2006/picture">
                 <pic:pic>
                   <pic:nvPicPr>
-                    <pic:cNvPr id="0" name="tmpifto0bjj.png"/>
+                    <pic:cNvPr id="0" name="tmpemrtywx2.png"/>
                     <pic:cNvPicPr/>
                   </pic:nvPicPr>
                   <pic:blipFill>
@@ -4553,7 +4580,7 @@
               <a:graphicData uri="http://schemas.openxmlformats.org/drawingml/2006/picture">
                 <pic:pic>
                   <pic:nvPicPr>
-                    <pic:cNvPr id="0" name="tmpto6ee5xn.png"/>
+                    <pic:cNvPr id="0" name="tmpiv3m1brq.png"/>
                     <pic:cNvPicPr/>
                   </pic:nvPicPr>
                   <pic:blipFill>
@@ -4656,7 +4683,7 @@
               <a:graphicData uri="http://schemas.openxmlformats.org/drawingml/2006/picture">
                 <pic:pic>
                   <pic:nvPicPr>
-                    <pic:cNvPr id="0" name="tmpf4a1g9mr.png"/>
+                    <pic:cNvPr id="0" name="tmpmbu9yq24.png"/>
                     <pic:cNvPicPr/>
                   </pic:nvPicPr>
                   <pic:blipFill>
@@ -4741,7 +4768,7 @@
               <a:graphicData uri="http://schemas.openxmlformats.org/drawingml/2006/picture">
                 <pic:pic>
                   <pic:nvPicPr>
-                    <pic:cNvPr id="0" name="tmpje7xewo3.png"/>
+                    <pic:cNvPr id="0" name="tmpyye_18jd.png"/>
                     <pic:cNvPicPr/>
                   </pic:nvPicPr>
                   <pic:blipFill>
@@ -4797,7 +4824,7 @@
               <a:graphicData uri="http://schemas.openxmlformats.org/drawingml/2006/picture">
                 <pic:pic>
                   <pic:nvPicPr>
-                    <pic:cNvPr id="0" name="tmp6uqh2c_1.png"/>
+                    <pic:cNvPr id="0" name="tmpomm_olka.png"/>
                     <pic:cNvPicPr/>
                   </pic:nvPicPr>
                   <pic:blipFill>
@@ -4853,7 +4880,7 @@
               <a:graphicData uri="http://schemas.openxmlformats.org/drawingml/2006/picture">
                 <pic:pic>
                   <pic:nvPicPr>
-                    <pic:cNvPr id="0" name="tmpifpd2htx.png"/>
+                    <pic:cNvPr id="0" name="tmp9elb2lra.png"/>
                     <pic:cNvPicPr/>
                   </pic:nvPicPr>
                   <pic:blipFill>
@@ -4909,7 +4936,7 @@
               <a:graphicData uri="http://schemas.openxmlformats.org/drawingml/2006/picture">
                 <pic:pic>
                   <pic:nvPicPr>
-                    <pic:cNvPr id="0" name="tmp96c_0m_3.png"/>
+                    <pic:cNvPr id="0" name="tmp43hdhlap.png"/>
                     <pic:cNvPicPr/>
                   </pic:nvPicPr>
                   <pic:blipFill>
@@ -4965,7 +4992,7 @@
               <a:graphicData uri="http://schemas.openxmlformats.org/drawingml/2006/picture">
                 <pic:pic>
                   <pic:nvPicPr>
-                    <pic:cNvPr id="0" name="tmp8yiscpc5.png"/>
+                    <pic:cNvPr id="0" name="tmp1l6reok4.png"/>
                     <pic:cNvPicPr/>
                   </pic:nvPicPr>
                   <pic:blipFill>

</xml_diff>

<commit_message>
docs: HANDOFF §692, CLAUDE.md, Guia e SOP — a página WHT
O Guia dizia WHT "em construção" (e listava a tela entre as que dão página
não encontrada); ganhou o 12.1 com o decêndio, as duas fontes, os status e a
quebra do piso de R$ 1,00 com o exemplo da equipe. No CLAUDE.md, a regra do
WHT na Liquidação, os 51 cadastros e os 210 testes. O HANDOFF registra o que
ainda precisa de amostra real (o fim de linha do arquivo do HUB, a alíquota
de 0,005% e o .xls binário). Os .docx foram regerados do .md.

Co-Authored-By: Claude Opus 5.5 (1M context) <noreply@anthropic.com>
</commit_message>
<xml_diff>
--- a/SOP_PROCESSAMENTO_OTC.docx
+++ b/SOP_PROCESSAMENTO_OTC.docx
@@ -476,7 +476,7 @@
               <a:graphicData uri="http://schemas.openxmlformats.org/drawingml/2006/picture">
                 <pic:pic>
                   <pic:nvPicPr>
-                    <pic:cNvPr id="0" name="tmpqwscq83f.png"/>
+                    <pic:cNvPr id="0" name="tmpny34kkhj.png"/>
                     <pic:cNvPicPr/>
                   </pic:nvPicPr>
                   <pic:blipFill>
@@ -536,7 +536,7 @@
               <a:graphicData uri="http://schemas.openxmlformats.org/drawingml/2006/picture">
                 <pic:pic>
                   <pic:nvPicPr>
-                    <pic:cNvPr id="0" name="tmpnv9ujjc5.png"/>
+                    <pic:cNvPr id="0" name="tmp6lw9p2l7.png"/>
                     <pic:cNvPicPr/>
                   </pic:nvPicPr>
                   <pic:blipFill>
@@ -596,7 +596,7 @@
               <a:graphicData uri="http://schemas.openxmlformats.org/drawingml/2006/picture">
                 <pic:pic>
                   <pic:nvPicPr>
-                    <pic:cNvPr id="0" name="tmpmjdgl5lh.png"/>
+                    <pic:cNvPr id="0" name="tmptwbz28f9.png"/>
                     <pic:cNvPicPr/>
                   </pic:nvPicPr>
                   <pic:blipFill>
@@ -656,7 +656,7 @@
               <a:graphicData uri="http://schemas.openxmlformats.org/drawingml/2006/picture">
                 <pic:pic>
                   <pic:nvPicPr>
-                    <pic:cNvPr id="0" name="tmp5xfokiq3.png"/>
+                    <pic:cNvPr id="0" name="tmpzmyvnxqk.png"/>
                     <pic:cNvPicPr/>
                   </pic:nvPicPr>
                   <pic:blipFill>
@@ -716,7 +716,7 @@
               <a:graphicData uri="http://schemas.openxmlformats.org/drawingml/2006/picture">
                 <pic:pic>
                   <pic:nvPicPr>
-                    <pic:cNvPr id="0" name="tmpkryjoe91.png"/>
+                    <pic:cNvPr id="0" name="tmpodseftaw.png"/>
                     <pic:cNvPicPr/>
                   </pic:nvPicPr>
                   <pic:blipFill>
@@ -990,7 +990,7 @@
               <a:graphicData uri="http://schemas.openxmlformats.org/drawingml/2006/picture">
                 <pic:pic>
                   <pic:nvPicPr>
-                    <pic:cNvPr id="0" name="tmp1fn69eob.png"/>
+                    <pic:cNvPr id="0" name="tmplu8bc5uh.png"/>
                     <pic:cNvPicPr/>
                   </pic:nvPicPr>
                   <pic:blipFill>
@@ -1046,7 +1046,7 @@
               <a:graphicData uri="http://schemas.openxmlformats.org/drawingml/2006/picture">
                 <pic:pic>
                   <pic:nvPicPr>
-                    <pic:cNvPr id="0" name="tmpkwzirj4v.png"/>
+                    <pic:cNvPr id="0" name="tmpbr4kz_r6.png"/>
                     <pic:cNvPicPr/>
                   </pic:nvPicPr>
                   <pic:blipFill>
@@ -1174,7 +1174,7 @@
               <a:graphicData uri="http://schemas.openxmlformats.org/drawingml/2006/picture">
                 <pic:pic>
                   <pic:nvPicPr>
-                    <pic:cNvPr id="0" name="tmp9z91lwyj.png"/>
+                    <pic:cNvPr id="0" name="tmpj0ljcsvk.png"/>
                     <pic:cNvPicPr/>
                   </pic:nvPicPr>
                   <pic:blipFill>
@@ -1239,7 +1239,7 @@
               <a:graphicData uri="http://schemas.openxmlformats.org/drawingml/2006/picture">
                 <pic:pic>
                   <pic:nvPicPr>
-                    <pic:cNvPr id="0" name="tmpa1p3cpav.png"/>
+                    <pic:cNvPr id="0" name="tmp3t7lqta_.png"/>
                     <pic:cNvPicPr/>
                   </pic:nvPicPr>
                   <pic:blipFill>
@@ -1564,7 +1564,7 @@
               <a:graphicData uri="http://schemas.openxmlformats.org/drawingml/2006/picture">
                 <pic:pic>
                   <pic:nvPicPr>
-                    <pic:cNvPr id="0" name="tmpqwscq83f.png"/>
+                    <pic:cNvPr id="0" name="tmpny34kkhj.png"/>
                     <pic:cNvPicPr/>
                   </pic:nvPicPr>
                   <pic:blipFill>
@@ -1977,7 +1977,7 @@
               <a:graphicData uri="http://schemas.openxmlformats.org/drawingml/2006/picture">
                 <pic:pic>
                   <pic:nvPicPr>
-                    <pic:cNvPr id="0" name="tmpmjdgl5lh.png"/>
+                    <pic:cNvPr id="0" name="tmptwbz28f9.png"/>
                     <pic:cNvPicPr/>
                   </pic:nvPicPr>
                   <pic:blipFill>
@@ -2033,7 +2033,7 @@
               <a:graphicData uri="http://schemas.openxmlformats.org/drawingml/2006/picture">
                 <pic:pic>
                   <pic:nvPicPr>
-                    <pic:cNvPr id="0" name="tmpnv9ujjc5.png"/>
+                    <pic:cNvPr id="0" name="tmp6lw9p2l7.png"/>
                     <pic:cNvPicPr/>
                   </pic:nvPicPr>
                   <pic:blipFill>
@@ -2225,7 +2225,7 @@
               <a:graphicData uri="http://schemas.openxmlformats.org/drawingml/2006/picture">
                 <pic:pic>
                   <pic:nvPicPr>
-                    <pic:cNvPr id="0" name="tmpi7c9pcnm.png"/>
+                    <pic:cNvPr id="0" name="tmpprxfuon1.png"/>
                     <pic:cNvPicPr/>
                   </pic:nvPicPr>
                   <pic:blipFill>
@@ -2281,7 +2281,7 @@
               <a:graphicData uri="http://schemas.openxmlformats.org/drawingml/2006/picture">
                 <pic:pic>
                   <pic:nvPicPr>
-                    <pic:cNvPr id="0" name="tmp6ujop30x.png"/>
+                    <pic:cNvPr id="0" name="tmplbg72hyk.png"/>
                     <pic:cNvPicPr/>
                   </pic:nvPicPr>
                   <pic:blipFill>
@@ -2337,7 +2337,7 @@
               <a:graphicData uri="http://schemas.openxmlformats.org/drawingml/2006/picture">
                 <pic:pic>
                   <pic:nvPicPr>
-                    <pic:cNvPr id="0" name="tmp2dyp6fkc.png"/>
+                    <pic:cNvPr id="0" name="tmpkcf3u1b1.png"/>
                     <pic:cNvPicPr/>
                   </pic:nvPicPr>
                   <pic:blipFill>
@@ -2444,7 +2444,7 @@
               <a:graphicData uri="http://schemas.openxmlformats.org/drawingml/2006/picture">
                 <pic:pic>
                   <pic:nvPicPr>
-                    <pic:cNvPr id="0" name="tmp5xfokiq3.png"/>
+                    <pic:cNvPr id="0" name="tmpzmyvnxqk.png"/>
                     <pic:cNvPicPr/>
                   </pic:nvPicPr>
                   <pic:blipFill>
@@ -2551,7 +2551,7 @@
               <a:graphicData uri="http://schemas.openxmlformats.org/drawingml/2006/picture">
                 <pic:pic>
                   <pic:nvPicPr>
-                    <pic:cNvPr id="0" name="tmplg1i8gy9.png"/>
+                    <pic:cNvPr id="0" name="tmpxxv99q5i.png"/>
                     <pic:cNvPicPr/>
                   </pic:nvPicPr>
                   <pic:blipFill>
@@ -2658,7 +2658,7 @@
               <a:graphicData uri="http://schemas.openxmlformats.org/drawingml/2006/picture">
                 <pic:pic>
                   <pic:nvPicPr>
-                    <pic:cNvPr id="0" name="tmpe0d9b7kq.png"/>
+                    <pic:cNvPr id="0" name="tmp3wb9w96l.png"/>
                     <pic:cNvPicPr/>
                   </pic:nvPicPr>
                   <pic:blipFill>
@@ -2714,7 +2714,7 @@
               <a:graphicData uri="http://schemas.openxmlformats.org/drawingml/2006/picture">
                 <pic:pic>
                   <pic:nvPicPr>
-                    <pic:cNvPr id="0" name="tmplfyj1yob.png"/>
+                    <pic:cNvPr id="0" name="tmpu0k5lo4h.png"/>
                     <pic:cNvPicPr/>
                   </pic:nvPicPr>
                   <pic:blipFill>
@@ -2781,7 +2781,7 @@
               <a:graphicData uri="http://schemas.openxmlformats.org/drawingml/2006/picture">
                 <pic:pic>
                   <pic:nvPicPr>
-                    <pic:cNvPr id="0" name="tmpois0l0uo.png"/>
+                    <pic:cNvPr id="0" name="tmpe1p4pueb.png"/>
                     <pic:cNvPicPr/>
                   </pic:nvPicPr>
                   <pic:blipFill>
@@ -2865,7 +2865,7 @@
               <a:graphicData uri="http://schemas.openxmlformats.org/drawingml/2006/picture">
                 <pic:pic>
                   <pic:nvPicPr>
-                    <pic:cNvPr id="0" name="tmp_6clbn_u.png"/>
+                    <pic:cNvPr id="0" name="tmpzkxf9yb3.png"/>
                     <pic:cNvPicPr/>
                   </pic:nvPicPr>
                   <pic:blipFill>
@@ -2930,7 +2930,7 @@
               <a:graphicData uri="http://schemas.openxmlformats.org/drawingml/2006/picture">
                 <pic:pic>
                   <pic:nvPicPr>
-                    <pic:cNvPr id="0" name="tmplibyxb0w.png"/>
+                    <pic:cNvPr id="0" name="tmp25ibq1i_.png"/>
                     <pic:cNvPicPr/>
                   </pic:nvPicPr>
                   <pic:blipFill>
@@ -3049,7 +3049,7 @@
               <a:graphicData uri="http://schemas.openxmlformats.org/drawingml/2006/picture">
                 <pic:pic>
                   <pic:nvPicPr>
-                    <pic:cNvPr id="0" name="tmp1eiuuu79.png"/>
+                    <pic:cNvPr id="0" name="tmpr0m9bw64.png"/>
                     <pic:cNvPicPr/>
                   </pic:nvPicPr>
                   <pic:blipFill>
@@ -3116,7 +3116,7 @@
               <a:graphicData uri="http://schemas.openxmlformats.org/drawingml/2006/picture">
                 <pic:pic>
                   <pic:nvPicPr>
-                    <pic:cNvPr id="0" name="tmpuptgjfr9.png"/>
+                    <pic:cNvPr id="0" name="tmp3odc2_0t.png"/>
                     <pic:cNvPicPr/>
                   </pic:nvPicPr>
                   <pic:blipFill>
@@ -3253,7 +3253,7 @@
               <a:graphicData uri="http://schemas.openxmlformats.org/drawingml/2006/picture">
                 <pic:pic>
                   <pic:nvPicPr>
-                    <pic:cNvPr id="0" name="tmpbhcp_pwy.png"/>
+                    <pic:cNvPr id="0" name="tmpi7wczow_.png"/>
                     <pic:cNvPicPr/>
                   </pic:nvPicPr>
                   <pic:blipFill>
@@ -3332,7 +3332,7 @@
               <a:graphicData uri="http://schemas.openxmlformats.org/drawingml/2006/picture">
                 <pic:pic>
                   <pic:nvPicPr>
-                    <pic:cNvPr id="0" name="tmpijf1r2aj.png"/>
+                    <pic:cNvPr id="0" name="tmpxrmk3dzj.png"/>
                     <pic:cNvPicPr/>
                   </pic:nvPicPr>
                   <pic:blipFill>
@@ -3399,7 +3399,7 @@
               <a:graphicData uri="http://schemas.openxmlformats.org/drawingml/2006/picture">
                 <pic:pic>
                   <pic:nvPicPr>
-                    <pic:cNvPr id="0" name="tmpsg42a_1z.png"/>
+                    <pic:cNvPr id="0" name="tmp6ja1_py_.png"/>
                     <pic:cNvPicPr/>
                   </pic:nvPicPr>
                   <pic:blipFill>
@@ -3455,7 +3455,7 @@
               <a:graphicData uri="http://schemas.openxmlformats.org/drawingml/2006/picture">
                 <pic:pic>
                   <pic:nvPicPr>
-                    <pic:cNvPr id="0" name="tmpkryjoe91.png"/>
+                    <pic:cNvPr id="0" name="tmpodseftaw.png"/>
                     <pic:cNvPicPr/>
                   </pic:nvPicPr>
                   <pic:blipFill>
@@ -3522,7 +3522,7 @@
               <a:graphicData uri="http://schemas.openxmlformats.org/drawingml/2006/picture">
                 <pic:pic>
                   <pic:nvPicPr>
-                    <pic:cNvPr id="0" name="tmp9jumvck0.png"/>
+                    <pic:cNvPr id="0" name="tmpro4z79qu.png"/>
                     <pic:cNvPicPr/>
                   </pic:nvPicPr>
                   <pic:blipFill>
@@ -3578,7 +3578,7 @@
               <a:graphicData uri="http://schemas.openxmlformats.org/drawingml/2006/picture">
                 <pic:pic>
                   <pic:nvPicPr>
-                    <pic:cNvPr id="0" name="tmpi3ejma6z.png"/>
+                    <pic:cNvPr id="0" name="tmpeavn5wgs.png"/>
                     <pic:cNvPicPr/>
                   </pic:nvPicPr>
                   <pic:blipFill>
@@ -3634,7 +3634,7 @@
               <a:graphicData uri="http://schemas.openxmlformats.org/drawingml/2006/picture">
                 <pic:pic>
                   <pic:nvPicPr>
-                    <pic:cNvPr id="0" name="tmpj52188rb.png"/>
+                    <pic:cNvPr id="0" name="tmpj4p1uuiu.png"/>
                     <pic:cNvPicPr/>
                   </pic:nvPicPr>
                   <pic:blipFill>
@@ -3690,7 +3690,7 @@
               <a:graphicData uri="http://schemas.openxmlformats.org/drawingml/2006/picture">
                 <pic:pic>
                   <pic:nvPicPr>
-                    <pic:cNvPr id="0" name="tmpvjm_s300.png"/>
+                    <pic:cNvPr id="0" name="tmpmwceujf1.png"/>
                     <pic:cNvPicPr/>
                   </pic:nvPicPr>
                   <pic:blipFill>
@@ -3746,7 +3746,7 @@
               <a:graphicData uri="http://schemas.openxmlformats.org/drawingml/2006/picture">
                 <pic:pic>
                   <pic:nvPicPr>
-                    <pic:cNvPr id="0" name="tmpc8t96y9w.png"/>
+                    <pic:cNvPr id="0" name="tmpgqjbylc9.png"/>
                     <pic:cNvPicPr/>
                   </pic:nvPicPr>
                   <pic:blipFill>
@@ -3802,7 +3802,7 @@
               <a:graphicData uri="http://schemas.openxmlformats.org/drawingml/2006/picture">
                 <pic:pic>
                   <pic:nvPicPr>
-                    <pic:cNvPr id="0" name="tmp93i6s7l4.png"/>
+                    <pic:cNvPr id="0" name="tmpkx0opqid.png"/>
                     <pic:cNvPicPr/>
                   </pic:nvPicPr>
                   <pic:blipFill>
@@ -4524,7 +4524,7 @@
               <a:graphicData uri="http://schemas.openxmlformats.org/drawingml/2006/picture">
                 <pic:pic>
                   <pic:nvPicPr>
-                    <pic:cNvPr id="0" name="tmpemrtywx2.png"/>
+                    <pic:cNvPr id="0" name="tmpksvne0f5.png"/>
                     <pic:cNvPicPr/>
                   </pic:nvPicPr>
                   <pic:blipFill>
@@ -4580,7 +4580,7 @@
               <a:graphicData uri="http://schemas.openxmlformats.org/drawingml/2006/picture">
                 <pic:pic>
                   <pic:nvPicPr>
-                    <pic:cNvPr id="0" name="tmpiv3m1brq.png"/>
+                    <pic:cNvPr id="0" name="tmpdbnxujin.png"/>
                     <pic:cNvPicPr/>
                   </pic:nvPicPr>
                   <pic:blipFill>
@@ -4683,7 +4683,7 @@
               <a:graphicData uri="http://schemas.openxmlformats.org/drawingml/2006/picture">
                 <pic:pic>
                   <pic:nvPicPr>
-                    <pic:cNvPr id="0" name="tmpmbu9yq24.png"/>
+                    <pic:cNvPr id="0" name="tmpi1fg7ntm.png"/>
                     <pic:cNvPicPr/>
                   </pic:nvPicPr>
                   <pic:blipFill>
@@ -4768,7 +4768,7 @@
               <a:graphicData uri="http://schemas.openxmlformats.org/drawingml/2006/picture">
                 <pic:pic>
                   <pic:nvPicPr>
-                    <pic:cNvPr id="0" name="tmpyye_18jd.png"/>
+                    <pic:cNvPr id="0" name="tmp8gzfq7qd.png"/>
                     <pic:cNvPicPr/>
                   </pic:nvPicPr>
                   <pic:blipFill>
@@ -4824,7 +4824,7 @@
               <a:graphicData uri="http://schemas.openxmlformats.org/drawingml/2006/picture">
                 <pic:pic>
                   <pic:nvPicPr>
-                    <pic:cNvPr id="0" name="tmpomm_olka.png"/>
+                    <pic:cNvPr id="0" name="tmpi5d5kdij.png"/>
                     <pic:cNvPicPr/>
                   </pic:nvPicPr>
                   <pic:blipFill>
@@ -4880,7 +4880,7 @@
               <a:graphicData uri="http://schemas.openxmlformats.org/drawingml/2006/picture">
                 <pic:pic>
                   <pic:nvPicPr>
-                    <pic:cNvPr id="0" name="tmp9elb2lra.png"/>
+                    <pic:cNvPr id="0" name="tmpvgk1sql3.png"/>
                     <pic:cNvPicPr/>
                   </pic:nvPicPr>
                   <pic:blipFill>
@@ -4936,7 +4936,7 @@
               <a:graphicData uri="http://schemas.openxmlformats.org/drawingml/2006/picture">
                 <pic:pic>
                   <pic:nvPicPr>
-                    <pic:cNvPr id="0" name="tmp43hdhlap.png"/>
+                    <pic:cNvPr id="0" name="tmpml760lrx.png"/>
                     <pic:cNvPicPr/>
                   </pic:nvPicPr>
                   <pic:blipFill>
@@ -4992,7 +4992,7 @@
               <a:graphicData uri="http://schemas.openxmlformats.org/drawingml/2006/picture">
                 <pic:pic>
                   <pic:nvPicPr>
-                    <pic:cNvPr id="0" name="tmp1l6reok4.png"/>
+                    <pic:cNvPr id="0" name="tmp8djttd67.png"/>
                     <pic:cNvPicPr/>
                   </pic:nvPicPr>
                   <pic:blipFill>
@@ -5458,7 +5458,7 @@
         <w:rPr>
           <w:rFonts w:ascii="Segoe UI Symbol" w:hAnsi="Segoe UI Symbol"/>
         </w:rPr>
-        <w:t xml:space="preserve">☐ </w:t>
+        <w:t xml:space="preserve">☑ </w:t>
       </w:r>
       <w:r>
         <w:rPr>
@@ -5475,6 +5475,9 @@
           <w:color w:val="B03060"/>
         </w:rPr>
         <w:t>/regulatory/wht</w:t>
+      </w:r>
+      <w:r>
+        <w:t xml:space="preserve"> — *implementado* (o IR das liquidações por decêndio — NDF Summary + Other Products — batido com o relatório "Posição de Tributos" do HUB; o arquivo para o HUB inserir o que falta; HANDOFF §692)</w:t>
       </w:r>
     </w:p>
     <w:p>

</xml_diff>

<commit_message>
docs: Guia e SOP com a rodada do §701 (owners, marcas dos swaps, travas do Track, alertas das iniciativas)
O Guia do Usuário e o SOP ficaram para trás no commit do §701: owner e backup
no Intraday Monitor, as marcas e o Edit em blocos dos swaps, o Economic
Affirmation das operações marcadas, a gravação do Pending só com o que mudou,
as travas da grade do Track, o card Initiatives — Alerts e a preferência da
Settings. A tabela de seções do Control Panel no Guia ainda dizia cinco seções
(faltavam a Application e o Branch Settlement). No CLAUDE.md, a regra do CSS
de plugin no extra_css (o defeito do Pay/Rec) e a contagem de testes (219).

Co-Authored-By: Claude Opus 5.5 (1M context) <noreply@anthropic.com>
</commit_message>
<xml_diff>
--- a/SOP_PROCESSAMENTO_OTC.docx
+++ b/SOP_PROCESSAMENTO_OTC.docx
@@ -476,7 +476,7 @@
               <a:graphicData uri="http://schemas.openxmlformats.org/drawingml/2006/picture">
                 <pic:pic>
                   <pic:nvPicPr>
-                    <pic:cNvPr id="0" name="tmpny34kkhj.png"/>
+                    <pic:cNvPr id="0" name="tmpw04meue2.png"/>
                     <pic:cNvPicPr/>
                   </pic:nvPicPr>
                   <pic:blipFill>
@@ -536,7 +536,7 @@
               <a:graphicData uri="http://schemas.openxmlformats.org/drawingml/2006/picture">
                 <pic:pic>
                   <pic:nvPicPr>
-                    <pic:cNvPr id="0" name="tmp6lw9p2l7.png"/>
+                    <pic:cNvPr id="0" name="tmpqo8bxvbw.png"/>
                     <pic:cNvPicPr/>
                   </pic:nvPicPr>
                   <pic:blipFill>
@@ -596,7 +596,7 @@
               <a:graphicData uri="http://schemas.openxmlformats.org/drawingml/2006/picture">
                 <pic:pic>
                   <pic:nvPicPr>
-                    <pic:cNvPr id="0" name="tmptwbz28f9.png"/>
+                    <pic:cNvPr id="0" name="tmpnkvpm55k.png"/>
                     <pic:cNvPicPr/>
                   </pic:nvPicPr>
                   <pic:blipFill>
@@ -656,7 +656,7 @@
               <a:graphicData uri="http://schemas.openxmlformats.org/drawingml/2006/picture">
                 <pic:pic>
                   <pic:nvPicPr>
-                    <pic:cNvPr id="0" name="tmpzmyvnxqk.png"/>
+                    <pic:cNvPr id="0" name="tmpcc7tz9xk.png"/>
                     <pic:cNvPicPr/>
                   </pic:nvPicPr>
                   <pic:blipFill>
@@ -716,7 +716,7 @@
               <a:graphicData uri="http://schemas.openxmlformats.org/drawingml/2006/picture">
                 <pic:pic>
                   <pic:nvPicPr>
-                    <pic:cNvPr id="0" name="tmpodseftaw.png"/>
+                    <pic:cNvPr id="0" name="tmpbhkzhhj7.png"/>
                     <pic:cNvPicPr/>
                   </pic:nvPicPr>
                   <pic:blipFill>
@@ -990,7 +990,7 @@
               <a:graphicData uri="http://schemas.openxmlformats.org/drawingml/2006/picture">
                 <pic:pic>
                   <pic:nvPicPr>
-                    <pic:cNvPr id="0" name="tmplu8bc5uh.png"/>
+                    <pic:cNvPr id="0" name="tmpvmfd964a.png"/>
                     <pic:cNvPicPr/>
                   </pic:nvPicPr>
                   <pic:blipFill>
@@ -1046,7 +1046,7 @@
               <a:graphicData uri="http://schemas.openxmlformats.org/drawingml/2006/picture">
                 <pic:pic>
                   <pic:nvPicPr>
-                    <pic:cNvPr id="0" name="tmpbr4kz_r6.png"/>
+                    <pic:cNvPr id="0" name="tmp0kymyfmw.png"/>
                     <pic:cNvPicPr/>
                   </pic:nvPicPr>
                   <pic:blipFill>
@@ -1174,7 +1174,7 @@
               <a:graphicData uri="http://schemas.openxmlformats.org/drawingml/2006/picture">
                 <pic:pic>
                   <pic:nvPicPr>
-                    <pic:cNvPr id="0" name="tmpj0ljcsvk.png"/>
+                    <pic:cNvPr id="0" name="tmpz4fz37br.png"/>
                     <pic:cNvPicPr/>
                   </pic:nvPicPr>
                   <pic:blipFill>
@@ -1239,7 +1239,7 @@
               <a:graphicData uri="http://schemas.openxmlformats.org/drawingml/2006/picture">
                 <pic:pic>
                   <pic:nvPicPr>
-                    <pic:cNvPr id="0" name="tmp3t7lqta_.png"/>
+                    <pic:cNvPr id="0" name="tmpd47jqjd7.png"/>
                     <pic:cNvPicPr/>
                   </pic:nvPicPr>
                   <pic:blipFill>
@@ -1390,7 +1390,7 @@
               <w:t>CADASTROCURVASMOEDASFEEDERDOMINIOS</w:t>
             </w:r>
             <w:r>
-              <w:t xml:space="preserve"> também atualizam as bases de indexadores e de domínios, e o de domínios vai anexo no e-mail) · Intraday Monitor — Tasks &amp; Pending Action · Confirmations Escalation (Save CETIP Files e Confirmations Escalation também são tarefas do Intraday Monitor)</w:t>
+              <w:t xml:space="preserve"> também atualizam as bases de indexadores e de domínios, e o de domínios vai anexo no e-mail) · Intraday Monitor — Tasks &amp; Pending Action · Confirmations Escalation (Save CETIP Files e Confirmations Escalation também são tarefas do Intraday Monitor) · Initiatives — Alerts (todo dia útil às 08:00: o e-mail e o aviso no sino da iniciativa em andamento parada há mais de 5 dias úteis, com prazo — dela ou de uma tarefa — a 2 dias úteis, ou que termina no dia)</w:t>
             </w:r>
           </w:p>
         </w:tc>
@@ -1564,7 +1564,7 @@
               <a:graphicData uri="http://schemas.openxmlformats.org/drawingml/2006/picture">
                 <pic:pic>
                   <pic:nvPicPr>
-                    <pic:cNvPr id="0" name="tmpny34kkhj.png"/>
+                    <pic:cNvPr id="0" name="tmpw04meue2.png"/>
                     <pic:cNvPicPr/>
                   </pic:nvPicPr>
                   <pic:blipFill>
@@ -1977,7 +1977,7 @@
               <a:graphicData uri="http://schemas.openxmlformats.org/drawingml/2006/picture">
                 <pic:pic>
                   <pic:nvPicPr>
-                    <pic:cNvPr id="0" name="tmptwbz28f9.png"/>
+                    <pic:cNvPr id="0" name="tmpnkvpm55k.png"/>
                     <pic:cNvPicPr/>
                   </pic:nvPicPr>
                   <pic:blipFill>
@@ -2033,7 +2033,7 @@
               <a:graphicData uri="http://schemas.openxmlformats.org/drawingml/2006/picture">
                 <pic:pic>
                   <pic:nvPicPr>
-                    <pic:cNvPr id="0" name="tmp6lw9p2l7.png"/>
+                    <pic:cNvPr id="0" name="tmpqo8bxvbw.png"/>
                     <pic:cNvPicPr/>
                   </pic:nvPicPr>
                   <pic:blipFill>
@@ -2225,7 +2225,7 @@
               <a:graphicData uri="http://schemas.openxmlformats.org/drawingml/2006/picture">
                 <pic:pic>
                   <pic:nvPicPr>
-                    <pic:cNvPr id="0" name="tmpprxfuon1.png"/>
+                    <pic:cNvPr id="0" name="tmpa_79zn53.png"/>
                     <pic:cNvPicPr/>
                   </pic:nvPicPr>
                   <pic:blipFill>
@@ -2281,7 +2281,7 @@
               <a:graphicData uri="http://schemas.openxmlformats.org/drawingml/2006/picture">
                 <pic:pic>
                   <pic:nvPicPr>
-                    <pic:cNvPr id="0" name="tmplbg72hyk.png"/>
+                    <pic:cNvPr id="0" name="tmps4on1y__.png"/>
                     <pic:cNvPicPr/>
                   </pic:nvPicPr>
                   <pic:blipFill>
@@ -2337,7 +2337,7 @@
               <a:graphicData uri="http://schemas.openxmlformats.org/drawingml/2006/picture">
                 <pic:pic>
                   <pic:nvPicPr>
-                    <pic:cNvPr id="0" name="tmpkcf3u1b1.png"/>
+                    <pic:cNvPr id="0" name="tmpxdfczk7k.png"/>
                     <pic:cNvPicPr/>
                   </pic:nvPicPr>
                   <pic:blipFill>
@@ -2444,7 +2444,7 @@
               <a:graphicData uri="http://schemas.openxmlformats.org/drawingml/2006/picture">
                 <pic:pic>
                   <pic:nvPicPr>
-                    <pic:cNvPr id="0" name="tmpzmyvnxqk.png"/>
+                    <pic:cNvPr id="0" name="tmpcc7tz9xk.png"/>
                     <pic:cNvPicPr/>
                   </pic:nvPicPr>
                   <pic:blipFill>
@@ -2551,7 +2551,7 @@
               <a:graphicData uri="http://schemas.openxmlformats.org/drawingml/2006/picture">
                 <pic:pic>
                   <pic:nvPicPr>
-                    <pic:cNvPr id="0" name="tmpxxv99q5i.png"/>
+                    <pic:cNvPr id="0" name="tmpd911fafu.png"/>
                     <pic:cNvPicPr/>
                   </pic:nvPicPr>
                   <pic:blipFill>
@@ -2658,7 +2658,7 @@
               <a:graphicData uri="http://schemas.openxmlformats.org/drawingml/2006/picture">
                 <pic:pic>
                   <pic:nvPicPr>
-                    <pic:cNvPr id="0" name="tmp3wb9w96l.png"/>
+                    <pic:cNvPr id="0" name="tmp_ccfmbwt.png"/>
                     <pic:cNvPicPr/>
                   </pic:nvPicPr>
                   <pic:blipFill>
@@ -2714,7 +2714,7 @@
               <a:graphicData uri="http://schemas.openxmlformats.org/drawingml/2006/picture">
                 <pic:pic>
                   <pic:nvPicPr>
-                    <pic:cNvPr id="0" name="tmpu0k5lo4h.png"/>
+                    <pic:cNvPr id="0" name="tmpfp443hey.png"/>
                     <pic:cNvPicPr/>
                   </pic:nvPicPr>
                   <pic:blipFill>
@@ -2781,7 +2781,7 @@
               <a:graphicData uri="http://schemas.openxmlformats.org/drawingml/2006/picture">
                 <pic:pic>
                   <pic:nvPicPr>
-                    <pic:cNvPr id="0" name="tmpe1p4pueb.png"/>
+                    <pic:cNvPr id="0" name="tmpptgkjaie.png"/>
                     <pic:cNvPicPr/>
                   </pic:nvPicPr>
                   <pic:blipFill>
@@ -2865,7 +2865,7 @@
               <a:graphicData uri="http://schemas.openxmlformats.org/drawingml/2006/picture">
                 <pic:pic>
                   <pic:nvPicPr>
-                    <pic:cNvPr id="0" name="tmpzkxf9yb3.png"/>
+                    <pic:cNvPr id="0" name="tmppc01i77z.png"/>
                     <pic:cNvPicPr/>
                   </pic:nvPicPr>
                   <pic:blipFill>
@@ -2930,7 +2930,7 @@
               <a:graphicData uri="http://schemas.openxmlformats.org/drawingml/2006/picture">
                 <pic:pic>
                   <pic:nvPicPr>
-                    <pic:cNvPr id="0" name="tmp25ibq1i_.png"/>
+                    <pic:cNvPr id="0" name="tmpsw_aaeaf.png"/>
                     <pic:cNvPicPr/>
                   </pic:nvPicPr>
                   <pic:blipFill>
@@ -3049,7 +3049,7 @@
               <a:graphicData uri="http://schemas.openxmlformats.org/drawingml/2006/picture">
                 <pic:pic>
                   <pic:nvPicPr>
-                    <pic:cNvPr id="0" name="tmpr0m9bw64.png"/>
+                    <pic:cNvPr id="0" name="tmpyz415q02.png"/>
                     <pic:cNvPicPr/>
                   </pic:nvPicPr>
                   <pic:blipFill>
@@ -3101,6 +3101,20 @@
       </w:r>
     </w:p>
     <w:p>
+      <w:r>
+        <w:t xml:space="preserve">A gravação da tela leva </w:t>
+      </w:r>
+      <w:r>
+        <w:rPr>
+          <w:b/>
+        </w:rPr>
+        <w:t>só o que o operador alterou</w:t>
+      </w:r>
+      <w:r>
+        <w:t>: o que outra pessoa ou a esteira de confirmação gravou na mesma linha depois que a tela carregou é preservado, e a linha apagada nesse meio-tempo não é recriada (a tela pede para recarregar). A exclusão só sai da tabela com o servidor confirmando.</w:t>
+      </w:r>
+    </w:p>
+    <w:p>
       <w:pPr>
         <w:jc w:val="left"/>
       </w:pPr>
@@ -3116,7 +3130,7 @@
               <a:graphicData uri="http://schemas.openxmlformats.org/drawingml/2006/picture">
                 <pic:pic>
                   <pic:nvPicPr>
-                    <pic:cNvPr id="0" name="tmp3odc2_0t.png"/>
+                    <pic:cNvPr id="0" name="tmp4ljyaiy4.png"/>
                     <pic:cNvPicPr/>
                   </pic:nvPicPr>
                   <pic:blipFill>
@@ -3253,7 +3267,7 @@
               <a:graphicData uri="http://schemas.openxmlformats.org/drawingml/2006/picture">
                 <pic:pic>
                   <pic:nvPicPr>
-                    <pic:cNvPr id="0" name="tmpi7wczow_.png"/>
+                    <pic:cNvPr id="0" name="tmp0yjg48ev.png"/>
                     <pic:cNvPicPr/>
                   </pic:nvPicPr>
                   <pic:blipFill>
@@ -3295,6 +3309,21 @@
     </w:p>
     <w:p>
       <w:r>
+        <w:t xml:space="preserve">A grade segue as travas do Confirmations Monitor: preencher uma coluna de validação é validar (a mesa da etapa, justificativa fora do prazo), o MO e o FO só validam depois do OTC, e preencher o envio ao cliente é o *Mark as sent* — do OTC, com as validações feitas e a *Data Callback* preenchida (exceto MGT × cliente). Reabrir a esteira é pôr o *Pending* em </w:t>
+      </w:r>
+      <w:r>
+        <w:rPr>
+          <w:rFonts w:ascii="Consolas" w:hAnsi="Consolas"/>
+          <w:color w:val="B03060"/>
+        </w:rPr>
+        <w:t>Pending OTC</w:t>
+      </w:r>
+      <w:r>
+        <w:t>.</w:t>
+      </w:r>
+    </w:p>
+    <w:p>
+      <w:r>
         <w:t xml:space="preserve">Os títulos das colunas seguem o idioma da aplicação (*Settlement Date*, *Trade Date*, *Underlying Asset*, *Notional/Qty*, *Counterparty*). A coluna </w:t>
       </w:r>
       <w:r>
@@ -3332,7 +3361,7 @@
               <a:graphicData uri="http://schemas.openxmlformats.org/drawingml/2006/picture">
                 <pic:pic>
                   <pic:nvPicPr>
-                    <pic:cNvPr id="0" name="tmpxrmk3dzj.png"/>
+                    <pic:cNvPr id="0" name="tmpjncvl54k.png"/>
                     <pic:cNvPicPr/>
                   </pic:nvPicPr>
                   <pic:blipFill>
@@ -3399,7 +3428,7 @@
               <a:graphicData uri="http://schemas.openxmlformats.org/drawingml/2006/picture">
                 <pic:pic>
                   <pic:nvPicPr>
-                    <pic:cNvPr id="0" name="tmp6ja1_py_.png"/>
+                    <pic:cNvPr id="0" name="tmpd3qcj6fx.png"/>
                     <pic:cNvPicPr/>
                   </pic:nvPicPr>
                   <pic:blipFill>
@@ -3455,7 +3484,7 @@
               <a:graphicData uri="http://schemas.openxmlformats.org/drawingml/2006/picture">
                 <pic:pic>
                   <pic:nvPicPr>
-                    <pic:cNvPr id="0" name="tmpodseftaw.png"/>
+                    <pic:cNvPr id="0" name="tmpbhkzhhj7.png"/>
                     <pic:cNvPicPr/>
                   </pic:nvPicPr>
                   <pic:blipFill>
@@ -3522,7 +3551,7 @@
               <a:graphicData uri="http://schemas.openxmlformats.org/drawingml/2006/picture">
                 <pic:pic>
                   <pic:nvPicPr>
-                    <pic:cNvPr id="0" name="tmpro4z79qu.png"/>
+                    <pic:cNvPr id="0" name="tmpeorjqusj.png"/>
                     <pic:cNvPicPr/>
                   </pic:nvPicPr>
                   <pic:blipFill>
@@ -3578,7 +3607,7 @@
               <a:graphicData uri="http://schemas.openxmlformats.org/drawingml/2006/picture">
                 <pic:pic>
                   <pic:nvPicPr>
-                    <pic:cNvPr id="0" name="tmpeavn5wgs.png"/>
+                    <pic:cNvPr id="0" name="tmpsedtp0tp.png"/>
                     <pic:cNvPicPr/>
                   </pic:nvPicPr>
                   <pic:blipFill>
@@ -3634,7 +3663,7 @@
               <a:graphicData uri="http://schemas.openxmlformats.org/drawingml/2006/picture">
                 <pic:pic>
                   <pic:nvPicPr>
-                    <pic:cNvPr id="0" name="tmpj4p1uuiu.png"/>
+                    <pic:cNvPr id="0" name="tmp9haajkkh.png"/>
                     <pic:cNvPicPr/>
                   </pic:nvPicPr>
                   <pic:blipFill>
@@ -3690,7 +3719,7 @@
               <a:graphicData uri="http://schemas.openxmlformats.org/drawingml/2006/picture">
                 <pic:pic>
                   <pic:nvPicPr>
-                    <pic:cNvPr id="0" name="tmpmwceujf1.png"/>
+                    <pic:cNvPr id="0" name="tmp2uierpi_.png"/>
                     <pic:cNvPicPr/>
                   </pic:nvPicPr>
                   <pic:blipFill>
@@ -3746,7 +3775,7 @@
               <a:graphicData uri="http://schemas.openxmlformats.org/drawingml/2006/picture">
                 <pic:pic>
                   <pic:nvPicPr>
-                    <pic:cNvPr id="0" name="tmpgqjbylc9.png"/>
+                    <pic:cNvPr id="0" name="tmp6g23zp0n.png"/>
                     <pic:cNvPicPr/>
                   </pic:nvPicPr>
                   <pic:blipFill>
@@ -3802,7 +3831,7 @@
               <a:graphicData uri="http://schemas.openxmlformats.org/drawingml/2006/picture">
                 <pic:pic>
                   <pic:nvPicPr>
-                    <pic:cNvPr id="0" name="tmpkx0opqid.png"/>
+                    <pic:cNvPr id="0" name="tmpwmgasor_.png"/>
                     <pic:cNvPicPr/>
                   </pic:nvPicPr>
                   <pic:blipFill>
@@ -4524,7 +4553,7 @@
               <a:graphicData uri="http://schemas.openxmlformats.org/drawingml/2006/picture">
                 <pic:pic>
                   <pic:nvPicPr>
-                    <pic:cNvPr id="0" name="tmpksvne0f5.png"/>
+                    <pic:cNvPr id="0" name="tmpowl1_w38.png"/>
                     <pic:cNvPicPr/>
                   </pic:nvPicPr>
                   <pic:blipFill>
@@ -4580,7 +4609,7 @@
               <a:graphicData uri="http://schemas.openxmlformats.org/drawingml/2006/picture">
                 <pic:pic>
                   <pic:nvPicPr>
-                    <pic:cNvPr id="0" name="tmpdbnxujin.png"/>
+                    <pic:cNvPr id="0" name="tmpbcl02vd4.png"/>
                     <pic:cNvPicPr/>
                   </pic:nvPicPr>
                   <pic:blipFill>
@@ -4683,7 +4712,7 @@
               <a:graphicData uri="http://schemas.openxmlformats.org/drawingml/2006/picture">
                 <pic:pic>
                   <pic:nvPicPr>
-                    <pic:cNvPr id="0" name="tmpi1fg7ntm.png"/>
+                    <pic:cNvPr id="0" name="tmpjavavps3.png"/>
                     <pic:cNvPicPr/>
                   </pic:nvPicPr>
                   <pic:blipFill>
@@ -4768,7 +4797,7 @@
               <a:graphicData uri="http://schemas.openxmlformats.org/drawingml/2006/picture">
                 <pic:pic>
                   <pic:nvPicPr>
-                    <pic:cNvPr id="0" name="tmp8gzfq7qd.png"/>
+                    <pic:cNvPr id="0" name="tmp2od602av.png"/>
                     <pic:cNvPicPr/>
                   </pic:nvPicPr>
                   <pic:blipFill>
@@ -4824,7 +4853,7 @@
               <a:graphicData uri="http://schemas.openxmlformats.org/drawingml/2006/picture">
                 <pic:pic>
                   <pic:nvPicPr>
-                    <pic:cNvPr id="0" name="tmpi5d5kdij.png"/>
+                    <pic:cNvPr id="0" name="tmphflv325f.png"/>
                     <pic:cNvPicPr/>
                   </pic:nvPicPr>
                   <pic:blipFill>
@@ -4880,7 +4909,7 @@
               <a:graphicData uri="http://schemas.openxmlformats.org/drawingml/2006/picture">
                 <pic:pic>
                   <pic:nvPicPr>
-                    <pic:cNvPr id="0" name="tmpvgk1sql3.png"/>
+                    <pic:cNvPr id="0" name="tmp53uf8h1g.png"/>
                     <pic:cNvPicPr/>
                   </pic:nvPicPr>
                   <pic:blipFill>
@@ -4936,7 +4965,7 @@
               <a:graphicData uri="http://schemas.openxmlformats.org/drawingml/2006/picture">
                 <pic:pic>
                   <pic:nvPicPr>
-                    <pic:cNvPr id="0" name="tmpml760lrx.png"/>
+                    <pic:cNvPr id="0" name="tmpy553vwim.png"/>
                     <pic:cNvPicPr/>
                   </pic:nvPicPr>
                   <pic:blipFill>
@@ -4992,7 +5021,7 @@
               <a:graphicData uri="http://schemas.openxmlformats.org/drawingml/2006/picture">
                 <pic:pic>
                   <pic:nvPicPr>
-                    <pic:cNvPr id="0" name="tmp8djttd67.png"/>
+                    <pic:cNvPr id="0" name="tmpbhmorz3m.png"/>
                     <pic:cNvPicPr/>
                   </pic:nvPicPr>
                   <pic:blipFill>

</xml_diff>

<commit_message>
docs(sop): o WHT com a edição, o Add Row e o Trade Date × Event Date (§702)
Co-Authored-By: Claude Opus 5.5 (1M context) <noreply@anthropic.com>
</commit_message>
<xml_diff>
--- a/SOP_PROCESSAMENTO_OTC.docx
+++ b/SOP_PROCESSAMENTO_OTC.docx
@@ -476,7 +476,7 @@
               <a:graphicData uri="http://schemas.openxmlformats.org/drawingml/2006/picture">
                 <pic:pic>
                   <pic:nvPicPr>
-                    <pic:cNvPr id="0" name="tmpw04meue2.png"/>
+                    <pic:cNvPr id="0" name="tmp93apwgba.png"/>
                     <pic:cNvPicPr/>
                   </pic:nvPicPr>
                   <pic:blipFill>
@@ -536,7 +536,7 @@
               <a:graphicData uri="http://schemas.openxmlformats.org/drawingml/2006/picture">
                 <pic:pic>
                   <pic:nvPicPr>
-                    <pic:cNvPr id="0" name="tmpqo8bxvbw.png"/>
+                    <pic:cNvPr id="0" name="tmpwtcus_lw.png"/>
                     <pic:cNvPicPr/>
                   </pic:nvPicPr>
                   <pic:blipFill>
@@ -596,7 +596,7 @@
               <a:graphicData uri="http://schemas.openxmlformats.org/drawingml/2006/picture">
                 <pic:pic>
                   <pic:nvPicPr>
-                    <pic:cNvPr id="0" name="tmpnkvpm55k.png"/>
+                    <pic:cNvPr id="0" name="tmps7scnil9.png"/>
                     <pic:cNvPicPr/>
                   </pic:nvPicPr>
                   <pic:blipFill>
@@ -656,7 +656,7 @@
               <a:graphicData uri="http://schemas.openxmlformats.org/drawingml/2006/picture">
                 <pic:pic>
                   <pic:nvPicPr>
-                    <pic:cNvPr id="0" name="tmpcc7tz9xk.png"/>
+                    <pic:cNvPr id="0" name="tmppbg53yun.png"/>
                     <pic:cNvPicPr/>
                   </pic:nvPicPr>
                   <pic:blipFill>
@@ -716,7 +716,7 @@
               <a:graphicData uri="http://schemas.openxmlformats.org/drawingml/2006/picture">
                 <pic:pic>
                   <pic:nvPicPr>
-                    <pic:cNvPr id="0" name="tmpbhkzhhj7.png"/>
+                    <pic:cNvPr id="0" name="tmpsv1l70d4.png"/>
                     <pic:cNvPicPr/>
                   </pic:nvPicPr>
                   <pic:blipFill>
@@ -990,7 +990,7 @@
               <a:graphicData uri="http://schemas.openxmlformats.org/drawingml/2006/picture">
                 <pic:pic>
                   <pic:nvPicPr>
-                    <pic:cNvPr id="0" name="tmpvmfd964a.png"/>
+                    <pic:cNvPr id="0" name="tmpd_0i7774.png"/>
                     <pic:cNvPicPr/>
                   </pic:nvPicPr>
                   <pic:blipFill>
@@ -1046,7 +1046,7 @@
               <a:graphicData uri="http://schemas.openxmlformats.org/drawingml/2006/picture">
                 <pic:pic>
                   <pic:nvPicPr>
-                    <pic:cNvPr id="0" name="tmp0kymyfmw.png"/>
+                    <pic:cNvPr id="0" name="tmp8xk7cona.png"/>
                     <pic:cNvPicPr/>
                   </pic:nvPicPr>
                   <pic:blipFill>
@@ -1174,7 +1174,7 @@
               <a:graphicData uri="http://schemas.openxmlformats.org/drawingml/2006/picture">
                 <pic:pic>
                   <pic:nvPicPr>
-                    <pic:cNvPr id="0" name="tmpz4fz37br.png"/>
+                    <pic:cNvPr id="0" name="tmpk_ip_ud1.png"/>
                     <pic:cNvPicPr/>
                   </pic:nvPicPr>
                   <pic:blipFill>
@@ -1239,7 +1239,7 @@
               <a:graphicData uri="http://schemas.openxmlformats.org/drawingml/2006/picture">
                 <pic:pic>
                   <pic:nvPicPr>
-                    <pic:cNvPr id="0" name="tmpd47jqjd7.png"/>
+                    <pic:cNvPr id="0" name="tmphsw2i_09.png"/>
                     <pic:cNvPicPr/>
                   </pic:nvPicPr>
                   <pic:blipFill>
@@ -1564,7 +1564,7 @@
               <a:graphicData uri="http://schemas.openxmlformats.org/drawingml/2006/picture">
                 <pic:pic>
                   <pic:nvPicPr>
-                    <pic:cNvPr id="0" name="tmpw04meue2.png"/>
+                    <pic:cNvPr id="0" name="tmp93apwgba.png"/>
                     <pic:cNvPicPr/>
                   </pic:nvPicPr>
                   <pic:blipFill>
@@ -1977,7 +1977,7 @@
               <a:graphicData uri="http://schemas.openxmlformats.org/drawingml/2006/picture">
                 <pic:pic>
                   <pic:nvPicPr>
-                    <pic:cNvPr id="0" name="tmpnkvpm55k.png"/>
+                    <pic:cNvPr id="0" name="tmps7scnil9.png"/>
                     <pic:cNvPicPr/>
                   </pic:nvPicPr>
                   <pic:blipFill>
@@ -2033,7 +2033,7 @@
               <a:graphicData uri="http://schemas.openxmlformats.org/drawingml/2006/picture">
                 <pic:pic>
                   <pic:nvPicPr>
-                    <pic:cNvPr id="0" name="tmpqo8bxvbw.png"/>
+                    <pic:cNvPr id="0" name="tmpwtcus_lw.png"/>
                     <pic:cNvPicPr/>
                   </pic:nvPicPr>
                   <pic:blipFill>
@@ -2225,7 +2225,7 @@
               <a:graphicData uri="http://schemas.openxmlformats.org/drawingml/2006/picture">
                 <pic:pic>
                   <pic:nvPicPr>
-                    <pic:cNvPr id="0" name="tmpa_79zn53.png"/>
+                    <pic:cNvPr id="0" name="tmp0uqr9z6i.png"/>
                     <pic:cNvPicPr/>
                   </pic:nvPicPr>
                   <pic:blipFill>
@@ -2281,7 +2281,7 @@
               <a:graphicData uri="http://schemas.openxmlformats.org/drawingml/2006/picture">
                 <pic:pic>
                   <pic:nvPicPr>
-                    <pic:cNvPr id="0" name="tmps4on1y__.png"/>
+                    <pic:cNvPr id="0" name="tmpgbmssdsa.png"/>
                     <pic:cNvPicPr/>
                   </pic:nvPicPr>
                   <pic:blipFill>
@@ -2337,7 +2337,7 @@
               <a:graphicData uri="http://schemas.openxmlformats.org/drawingml/2006/picture">
                 <pic:pic>
                   <pic:nvPicPr>
-                    <pic:cNvPr id="0" name="tmpxdfczk7k.png"/>
+                    <pic:cNvPr id="0" name="tmprbj65u7d.png"/>
                     <pic:cNvPicPr/>
                   </pic:nvPicPr>
                   <pic:blipFill>
@@ -2444,7 +2444,7 @@
               <a:graphicData uri="http://schemas.openxmlformats.org/drawingml/2006/picture">
                 <pic:pic>
                   <pic:nvPicPr>
-                    <pic:cNvPr id="0" name="tmpcc7tz9xk.png"/>
+                    <pic:cNvPr id="0" name="tmppbg53yun.png"/>
                     <pic:cNvPicPr/>
                   </pic:nvPicPr>
                   <pic:blipFill>
@@ -2551,7 +2551,7 @@
               <a:graphicData uri="http://schemas.openxmlformats.org/drawingml/2006/picture">
                 <pic:pic>
                   <pic:nvPicPr>
-                    <pic:cNvPr id="0" name="tmpd911fafu.png"/>
+                    <pic:cNvPr id="0" name="tmpcfkexugx.png"/>
                     <pic:cNvPicPr/>
                   </pic:nvPicPr>
                   <pic:blipFill>
@@ -2658,7 +2658,7 @@
               <a:graphicData uri="http://schemas.openxmlformats.org/drawingml/2006/picture">
                 <pic:pic>
                   <pic:nvPicPr>
-                    <pic:cNvPr id="0" name="tmp_ccfmbwt.png"/>
+                    <pic:cNvPr id="0" name="tmp6q38ewym.png"/>
                     <pic:cNvPicPr/>
                   </pic:nvPicPr>
                   <pic:blipFill>
@@ -2714,7 +2714,7 @@
               <a:graphicData uri="http://schemas.openxmlformats.org/drawingml/2006/picture">
                 <pic:pic>
                   <pic:nvPicPr>
-                    <pic:cNvPr id="0" name="tmpfp443hey.png"/>
+                    <pic:cNvPr id="0" name="tmp_ec2xmu_.png"/>
                     <pic:cNvPicPr/>
                   </pic:nvPicPr>
                   <pic:blipFill>
@@ -2781,7 +2781,7 @@
               <a:graphicData uri="http://schemas.openxmlformats.org/drawingml/2006/picture">
                 <pic:pic>
                   <pic:nvPicPr>
-                    <pic:cNvPr id="0" name="tmpptgkjaie.png"/>
+                    <pic:cNvPr id="0" name="tmpsv7m_cc5.png"/>
                     <pic:cNvPicPr/>
                   </pic:nvPicPr>
                   <pic:blipFill>
@@ -2865,7 +2865,7 @@
               <a:graphicData uri="http://schemas.openxmlformats.org/drawingml/2006/picture">
                 <pic:pic>
                   <pic:nvPicPr>
-                    <pic:cNvPr id="0" name="tmppc01i77z.png"/>
+                    <pic:cNvPr id="0" name="tmptldr3io2.png"/>
                     <pic:cNvPicPr/>
                   </pic:nvPicPr>
                   <pic:blipFill>
@@ -2930,7 +2930,7 @@
               <a:graphicData uri="http://schemas.openxmlformats.org/drawingml/2006/picture">
                 <pic:pic>
                   <pic:nvPicPr>
-                    <pic:cNvPr id="0" name="tmpsw_aaeaf.png"/>
+                    <pic:cNvPr id="0" name="tmpve0x7bg6.png"/>
                     <pic:cNvPicPr/>
                   </pic:nvPicPr>
                   <pic:blipFill>
@@ -3049,7 +3049,7 @@
               <a:graphicData uri="http://schemas.openxmlformats.org/drawingml/2006/picture">
                 <pic:pic>
                   <pic:nvPicPr>
-                    <pic:cNvPr id="0" name="tmpyz415q02.png"/>
+                    <pic:cNvPr id="0" name="tmp6lmsqtfv.png"/>
                     <pic:cNvPicPr/>
                   </pic:nvPicPr>
                   <pic:blipFill>
@@ -3130,7 +3130,7 @@
               <a:graphicData uri="http://schemas.openxmlformats.org/drawingml/2006/picture">
                 <pic:pic>
                   <pic:nvPicPr>
-                    <pic:cNvPr id="0" name="tmp4ljyaiy4.png"/>
+                    <pic:cNvPr id="0" name="tmp0oh19xhk.png"/>
                     <pic:cNvPicPr/>
                   </pic:nvPicPr>
                   <pic:blipFill>
@@ -3267,7 +3267,7 @@
               <a:graphicData uri="http://schemas.openxmlformats.org/drawingml/2006/picture">
                 <pic:pic>
                   <pic:nvPicPr>
-                    <pic:cNvPr id="0" name="tmp0yjg48ev.png"/>
+                    <pic:cNvPr id="0" name="tmp8a3aaqvs.png"/>
                     <pic:cNvPicPr/>
                   </pic:nvPicPr>
                   <pic:blipFill>
@@ -3361,7 +3361,7 @@
               <a:graphicData uri="http://schemas.openxmlformats.org/drawingml/2006/picture">
                 <pic:pic>
                   <pic:nvPicPr>
-                    <pic:cNvPr id="0" name="tmpjncvl54k.png"/>
+                    <pic:cNvPr id="0" name="tmpdm58yrsw.png"/>
                     <pic:cNvPicPr/>
                   </pic:nvPicPr>
                   <pic:blipFill>
@@ -3428,7 +3428,7 @@
               <a:graphicData uri="http://schemas.openxmlformats.org/drawingml/2006/picture">
                 <pic:pic>
                   <pic:nvPicPr>
-                    <pic:cNvPr id="0" name="tmpd3qcj6fx.png"/>
+                    <pic:cNvPr id="0" name="tmpivx4pw_0.png"/>
                     <pic:cNvPicPr/>
                   </pic:nvPicPr>
                   <pic:blipFill>
@@ -3484,7 +3484,7 @@
               <a:graphicData uri="http://schemas.openxmlformats.org/drawingml/2006/picture">
                 <pic:pic>
                   <pic:nvPicPr>
-                    <pic:cNvPr id="0" name="tmpbhkzhhj7.png"/>
+                    <pic:cNvPr id="0" name="tmpsv1l70d4.png"/>
                     <pic:cNvPicPr/>
                   </pic:nvPicPr>
                   <pic:blipFill>
@@ -3551,7 +3551,7 @@
               <a:graphicData uri="http://schemas.openxmlformats.org/drawingml/2006/picture">
                 <pic:pic>
                   <pic:nvPicPr>
-                    <pic:cNvPr id="0" name="tmpeorjqusj.png"/>
+                    <pic:cNvPr id="0" name="tmpd0maey49.png"/>
                     <pic:cNvPicPr/>
                   </pic:nvPicPr>
                   <pic:blipFill>
@@ -3607,7 +3607,7 @@
               <a:graphicData uri="http://schemas.openxmlformats.org/drawingml/2006/picture">
                 <pic:pic>
                   <pic:nvPicPr>
-                    <pic:cNvPr id="0" name="tmpsedtp0tp.png"/>
+                    <pic:cNvPr id="0" name="tmptvlx2zgq.png"/>
                     <pic:cNvPicPr/>
                   </pic:nvPicPr>
                   <pic:blipFill>
@@ -3663,7 +3663,7 @@
               <a:graphicData uri="http://schemas.openxmlformats.org/drawingml/2006/picture">
                 <pic:pic>
                   <pic:nvPicPr>
-                    <pic:cNvPr id="0" name="tmp9haajkkh.png"/>
+                    <pic:cNvPr id="0" name="tmpvo6td5dr.png"/>
                     <pic:cNvPicPr/>
                   </pic:nvPicPr>
                   <pic:blipFill>
@@ -3719,7 +3719,7 @@
               <a:graphicData uri="http://schemas.openxmlformats.org/drawingml/2006/picture">
                 <pic:pic>
                   <pic:nvPicPr>
-                    <pic:cNvPr id="0" name="tmp2uierpi_.png"/>
+                    <pic:cNvPr id="0" name="tmppyvlkaxz.png"/>
                     <pic:cNvPicPr/>
                   </pic:nvPicPr>
                   <pic:blipFill>
@@ -3775,7 +3775,7 @@
               <a:graphicData uri="http://schemas.openxmlformats.org/drawingml/2006/picture">
                 <pic:pic>
                   <pic:nvPicPr>
-                    <pic:cNvPr id="0" name="tmp6g23zp0n.png"/>
+                    <pic:cNvPr id="0" name="tmpe71d2dap.png"/>
                     <pic:cNvPicPr/>
                   </pic:nvPicPr>
                   <pic:blipFill>
@@ -3831,7 +3831,7 @@
               <a:graphicData uri="http://schemas.openxmlformats.org/drawingml/2006/picture">
                 <pic:pic>
                   <pic:nvPicPr>
-                    <pic:cNvPr id="0" name="tmpwmgasor_.png"/>
+                    <pic:cNvPr id="0" name="tmpwag5tccw.png"/>
                     <pic:cNvPicPr/>
                   </pic:nvPicPr>
                   <pic:blipFill>
@@ -4553,7 +4553,7 @@
               <a:graphicData uri="http://schemas.openxmlformats.org/drawingml/2006/picture">
                 <pic:pic>
                   <pic:nvPicPr>
-                    <pic:cNvPr id="0" name="tmpowl1_w38.png"/>
+                    <pic:cNvPr id="0" name="tmpvxippejp.png"/>
                     <pic:cNvPicPr/>
                   </pic:nvPicPr>
                   <pic:blipFill>
@@ -4609,7 +4609,7 @@
               <a:graphicData uri="http://schemas.openxmlformats.org/drawingml/2006/picture">
                 <pic:pic>
                   <pic:nvPicPr>
-                    <pic:cNvPr id="0" name="tmpbcl02vd4.png"/>
+                    <pic:cNvPr id="0" name="tmp66gfm717.png"/>
                     <pic:cNvPicPr/>
                   </pic:nvPicPr>
                   <pic:blipFill>
@@ -4712,7 +4712,7 @@
               <a:graphicData uri="http://schemas.openxmlformats.org/drawingml/2006/picture">
                 <pic:pic>
                   <pic:nvPicPr>
-                    <pic:cNvPr id="0" name="tmpjavavps3.png"/>
+                    <pic:cNvPr id="0" name="tmp7wobv5id.png"/>
                     <pic:cNvPicPr/>
                   </pic:nvPicPr>
                   <pic:blipFill>
@@ -4797,7 +4797,7 @@
               <a:graphicData uri="http://schemas.openxmlformats.org/drawingml/2006/picture">
                 <pic:pic>
                   <pic:nvPicPr>
-                    <pic:cNvPr id="0" name="tmp2od602av.png"/>
+                    <pic:cNvPr id="0" name="tmpswcx9qca.png"/>
                     <pic:cNvPicPr/>
                   </pic:nvPicPr>
                   <pic:blipFill>
@@ -4853,7 +4853,7 @@
               <a:graphicData uri="http://schemas.openxmlformats.org/drawingml/2006/picture">
                 <pic:pic>
                   <pic:nvPicPr>
-                    <pic:cNvPr id="0" name="tmphflv325f.png"/>
+                    <pic:cNvPr id="0" name="tmp0mcbs87g.png"/>
                     <pic:cNvPicPr/>
                   </pic:nvPicPr>
                   <pic:blipFill>
@@ -4909,7 +4909,7 @@
               <a:graphicData uri="http://schemas.openxmlformats.org/drawingml/2006/picture">
                 <pic:pic>
                   <pic:nvPicPr>
-                    <pic:cNvPr id="0" name="tmp53uf8h1g.png"/>
+                    <pic:cNvPr id="0" name="tmps7pc9zwu.png"/>
                     <pic:cNvPicPr/>
                   </pic:nvPicPr>
                   <pic:blipFill>
@@ -4965,7 +4965,7 @@
               <a:graphicData uri="http://schemas.openxmlformats.org/drawingml/2006/picture">
                 <pic:pic>
                   <pic:nvPicPr>
-                    <pic:cNvPr id="0" name="tmpy553vwim.png"/>
+                    <pic:cNvPr id="0" name="tmpnvjbcmaw.png"/>
                     <pic:cNvPicPr/>
                   </pic:nvPicPr>
                   <pic:blipFill>
@@ -5021,7 +5021,7 @@
               <a:graphicData uri="http://schemas.openxmlformats.org/drawingml/2006/picture">
                 <pic:pic>
                   <pic:nvPicPr>
-                    <pic:cNvPr id="0" name="tmpbhmorz3m.png"/>
+                    <pic:cNvPr id="0" name="tmprm7w5c7i.png"/>
                     <pic:cNvPicPr/>
                   </pic:nvPicPr>
                   <pic:blipFill>
@@ -5506,7 +5506,7 @@
         <w:t>/regulatory/wht</w:t>
       </w:r>
       <w:r>
-        <w:t xml:space="preserve"> — *implementado* (o IR das liquidações por decêndio — NDF Summary + Other Products — batido com o relatório "Posição de Tributos" do HUB; o arquivo para o HUB inserir o que falta; HANDOFF §692)</w:t>
+        <w:t xml:space="preserve"> — *implementado* (o IR das liquidações por decêndio — NDF Summary + Other Products — batido com o relatório "Posição de Tributos" do HUB; o arquivo para o HUB inserir o que falta; a correção de linha, em lote, a exclusão e a inclusão manual (Add Row) com confirmação de outro usuário, o Trade Date (OTC_TD) separado da data do evento (OTC_ET/HUB_ET); HANDOFF §692, §702)</w:t>
       </w:r>
     </w:p>
     <w:p>

</xml_diff>

<commit_message>
docs: Guia e SOP com o §703 (owners por produto, o Vanilla asiático/BRL fixed na esteira, o ID de cada confirmação)
Co-Authored-By: Claude Opus 5.5 (1M context) <noreply@anthropic.com>
</commit_message>
<xml_diff>
--- a/SOP_PROCESSAMENTO_OTC.docx
+++ b/SOP_PROCESSAMENTO_OTC.docx
@@ -476,7 +476,7 @@
               <a:graphicData uri="http://schemas.openxmlformats.org/drawingml/2006/picture">
                 <pic:pic>
                   <pic:nvPicPr>
-                    <pic:cNvPr id="0" name="tmp93apwgba.png"/>
+                    <pic:cNvPr id="0" name="tmpccfwkdm8.png"/>
                     <pic:cNvPicPr/>
                   </pic:nvPicPr>
                   <pic:blipFill>
@@ -536,7 +536,7 @@
               <a:graphicData uri="http://schemas.openxmlformats.org/drawingml/2006/picture">
                 <pic:pic>
                   <pic:nvPicPr>
-                    <pic:cNvPr id="0" name="tmpwtcus_lw.png"/>
+                    <pic:cNvPr id="0" name="tmpzlkpwq0o.png"/>
                     <pic:cNvPicPr/>
                   </pic:nvPicPr>
                   <pic:blipFill>
@@ -596,7 +596,7 @@
               <a:graphicData uri="http://schemas.openxmlformats.org/drawingml/2006/picture">
                 <pic:pic>
                   <pic:nvPicPr>
-                    <pic:cNvPr id="0" name="tmps7scnil9.png"/>
+                    <pic:cNvPr id="0" name="tmpnyky80et.png"/>
                     <pic:cNvPicPr/>
                   </pic:nvPicPr>
                   <pic:blipFill>
@@ -656,7 +656,7 @@
               <a:graphicData uri="http://schemas.openxmlformats.org/drawingml/2006/picture">
                 <pic:pic>
                   <pic:nvPicPr>
-                    <pic:cNvPr id="0" name="tmppbg53yun.png"/>
+                    <pic:cNvPr id="0" name="tmpua6qh9fs.png"/>
                     <pic:cNvPicPr/>
                   </pic:nvPicPr>
                   <pic:blipFill>
@@ -716,7 +716,7 @@
               <a:graphicData uri="http://schemas.openxmlformats.org/drawingml/2006/picture">
                 <pic:pic>
                   <pic:nvPicPr>
-                    <pic:cNvPr id="0" name="tmpsv1l70d4.png"/>
+                    <pic:cNvPr id="0" name="tmpmahhrf3b.png"/>
                     <pic:cNvPicPr/>
                   </pic:nvPicPr>
                   <pic:blipFill>
@@ -990,7 +990,7 @@
               <a:graphicData uri="http://schemas.openxmlformats.org/drawingml/2006/picture">
                 <pic:pic>
                   <pic:nvPicPr>
-                    <pic:cNvPr id="0" name="tmpd_0i7774.png"/>
+                    <pic:cNvPr id="0" name="tmpredv4mde.png"/>
                     <pic:cNvPicPr/>
                   </pic:nvPicPr>
                   <pic:blipFill>
@@ -1046,7 +1046,7 @@
               <a:graphicData uri="http://schemas.openxmlformats.org/drawingml/2006/picture">
                 <pic:pic>
                   <pic:nvPicPr>
-                    <pic:cNvPr id="0" name="tmp8xk7cona.png"/>
+                    <pic:cNvPr id="0" name="tmp_8eodafd.png"/>
                     <pic:cNvPicPr/>
                   </pic:nvPicPr>
                   <pic:blipFill>
@@ -1174,7 +1174,7 @@
               <a:graphicData uri="http://schemas.openxmlformats.org/drawingml/2006/picture">
                 <pic:pic>
                   <pic:nvPicPr>
-                    <pic:cNvPr id="0" name="tmpk_ip_ud1.png"/>
+                    <pic:cNvPr id="0" name="tmpnm8qqqja.png"/>
                     <pic:cNvPicPr/>
                   </pic:nvPicPr>
                   <pic:blipFill>
@@ -1239,7 +1239,7 @@
               <a:graphicData uri="http://schemas.openxmlformats.org/drawingml/2006/picture">
                 <pic:pic>
                   <pic:nvPicPr>
-                    <pic:cNvPr id="0" name="tmphsw2i_09.png"/>
+                    <pic:cNvPr id="0" name="tmphl0erjex.png"/>
                     <pic:cNvPicPr/>
                   </pic:nvPicPr>
                   <pic:blipFill>
@@ -1564,7 +1564,7 @@
               <a:graphicData uri="http://schemas.openxmlformats.org/drawingml/2006/picture">
                 <pic:pic>
                   <pic:nvPicPr>
-                    <pic:cNvPr id="0" name="tmp93apwgba.png"/>
+                    <pic:cNvPr id="0" name="tmpccfwkdm8.png"/>
                     <pic:cNvPicPr/>
                   </pic:nvPicPr>
                   <pic:blipFill>
@@ -1977,7 +1977,7 @@
               <a:graphicData uri="http://schemas.openxmlformats.org/drawingml/2006/picture">
                 <pic:pic>
                   <pic:nvPicPr>
-                    <pic:cNvPr id="0" name="tmps7scnil9.png"/>
+                    <pic:cNvPr id="0" name="tmpnyky80et.png"/>
                     <pic:cNvPicPr/>
                   </pic:nvPicPr>
                   <pic:blipFill>
@@ -2033,7 +2033,7 @@
               <a:graphicData uri="http://schemas.openxmlformats.org/drawingml/2006/picture">
                 <pic:pic>
                   <pic:nvPicPr>
-                    <pic:cNvPr id="0" name="tmpwtcus_lw.png"/>
+                    <pic:cNvPr id="0" name="tmpzlkpwq0o.png"/>
                     <pic:cNvPicPr/>
                   </pic:nvPicPr>
                   <pic:blipFill>
@@ -2225,7 +2225,7 @@
               <a:graphicData uri="http://schemas.openxmlformats.org/drawingml/2006/picture">
                 <pic:pic>
                   <pic:nvPicPr>
-                    <pic:cNvPr id="0" name="tmp0uqr9z6i.png"/>
+                    <pic:cNvPr id="0" name="tmpq8qek7zu.png"/>
                     <pic:cNvPicPr/>
                   </pic:nvPicPr>
                   <pic:blipFill>
@@ -2281,7 +2281,7 @@
               <a:graphicData uri="http://schemas.openxmlformats.org/drawingml/2006/picture">
                 <pic:pic>
                   <pic:nvPicPr>
-                    <pic:cNvPr id="0" name="tmpgbmssdsa.png"/>
+                    <pic:cNvPr id="0" name="tmp4ylfk1sg.png"/>
                     <pic:cNvPicPr/>
                   </pic:nvPicPr>
                   <pic:blipFill>
@@ -2337,7 +2337,7 @@
               <a:graphicData uri="http://schemas.openxmlformats.org/drawingml/2006/picture">
                 <pic:pic>
                   <pic:nvPicPr>
-                    <pic:cNvPr id="0" name="tmprbj65u7d.png"/>
+                    <pic:cNvPr id="0" name="tmpp9unyze7.png"/>
                     <pic:cNvPicPr/>
                   </pic:nvPicPr>
                   <pic:blipFill>
@@ -2444,7 +2444,7 @@
               <a:graphicData uri="http://schemas.openxmlformats.org/drawingml/2006/picture">
                 <pic:pic>
                   <pic:nvPicPr>
-                    <pic:cNvPr id="0" name="tmppbg53yun.png"/>
+                    <pic:cNvPr id="0" name="tmpua6qh9fs.png"/>
                     <pic:cNvPicPr/>
                   </pic:nvPicPr>
                   <pic:blipFill>
@@ -2551,7 +2551,7 @@
               <a:graphicData uri="http://schemas.openxmlformats.org/drawingml/2006/picture">
                 <pic:pic>
                   <pic:nvPicPr>
-                    <pic:cNvPr id="0" name="tmpcfkexugx.png"/>
+                    <pic:cNvPr id="0" name="tmp2cfluoei.png"/>
                     <pic:cNvPicPr/>
                   </pic:nvPicPr>
                   <pic:blipFill>
@@ -2658,7 +2658,7 @@
               <a:graphicData uri="http://schemas.openxmlformats.org/drawingml/2006/picture">
                 <pic:pic>
                   <pic:nvPicPr>
-                    <pic:cNvPr id="0" name="tmp6q38ewym.png"/>
+                    <pic:cNvPr id="0" name="tmpjw1y7nfd.png"/>
                     <pic:cNvPicPr/>
                   </pic:nvPicPr>
                   <pic:blipFill>
@@ -2714,7 +2714,7 @@
               <a:graphicData uri="http://schemas.openxmlformats.org/drawingml/2006/picture">
                 <pic:pic>
                   <pic:nvPicPr>
-                    <pic:cNvPr id="0" name="tmp_ec2xmu_.png"/>
+                    <pic:cNvPr id="0" name="tmpvqy14nw5.png"/>
                     <pic:cNvPicPr/>
                   </pic:nvPicPr>
                   <pic:blipFill>
@@ -2781,7 +2781,7 @@
               <a:graphicData uri="http://schemas.openxmlformats.org/drawingml/2006/picture">
                 <pic:pic>
                   <pic:nvPicPr>
-                    <pic:cNvPr id="0" name="tmpsv7m_cc5.png"/>
+                    <pic:cNvPr id="0" name="tmpgb_svtnr.png"/>
                     <pic:cNvPicPr/>
                   </pic:nvPicPr>
                   <pic:blipFill>
@@ -2865,7 +2865,7 @@
               <a:graphicData uri="http://schemas.openxmlformats.org/drawingml/2006/picture">
                 <pic:pic>
                   <pic:nvPicPr>
-                    <pic:cNvPr id="0" name="tmptldr3io2.png"/>
+                    <pic:cNvPr id="0" name="tmpzd46vjjc.png"/>
                     <pic:cNvPicPr/>
                   </pic:nvPicPr>
                   <pic:blipFill>
@@ -2930,7 +2930,7 @@
               <a:graphicData uri="http://schemas.openxmlformats.org/drawingml/2006/picture">
                 <pic:pic>
                   <pic:nvPicPr>
-                    <pic:cNvPr id="0" name="tmpve0x7bg6.png"/>
+                    <pic:cNvPr id="0" name="tmpv48ps75b.png"/>
                     <pic:cNvPicPr/>
                   </pic:nvPicPr>
                   <pic:blipFill>
@@ -3049,7 +3049,7 @@
               <a:graphicData uri="http://schemas.openxmlformats.org/drawingml/2006/picture">
                 <pic:pic>
                   <pic:nvPicPr>
-                    <pic:cNvPr id="0" name="tmp6lmsqtfv.png"/>
+                    <pic:cNvPr id="0" name="tmpjeep29xu.png"/>
                     <pic:cNvPicPr/>
                   </pic:nvPicPr>
                   <pic:blipFill>
@@ -3130,7 +3130,7 @@
               <a:graphicData uri="http://schemas.openxmlformats.org/drawingml/2006/picture">
                 <pic:pic>
                   <pic:nvPicPr>
-                    <pic:cNvPr id="0" name="tmp0oh19xhk.png"/>
+                    <pic:cNvPr id="0" name="tmpc__a8pz1.png"/>
                     <pic:cNvPicPr/>
                   </pic:nvPicPr>
                   <pic:blipFill>
@@ -3210,6 +3210,71 @@
     </w:p>
     <w:p>
       <w:r>
+        <w:rPr>
+          <w:b/>
+        </w:rPr>
+        <w:t>Entram na esteira</w:t>
+      </w:r>
+      <w:r>
+        <w:t xml:space="preserve"> NDF FWD Start, NDF Commodities, opções de commodities e FXO, swaps e recompras contra cliente e o </w:t>
+      </w:r>
+      <w:r>
+        <w:rPr>
+          <w:b/>
+        </w:rPr>
+        <w:t>NDF Vanilla</w:t>
+      </w:r>
+      <w:r>
+        <w:t xml:space="preserve"> de MGT contra cliente e, do Banco, o </w:t>
+      </w:r>
+      <w:r>
+        <w:rPr>
+          <w:b/>
+        </w:rPr>
+        <w:t>asiático</w:t>
+      </w:r>
+      <w:r>
+        <w:t xml:space="preserve"> e o </w:t>
+      </w:r>
+      <w:r>
+        <w:rPr>
+          <w:b/>
+        </w:rPr>
+        <w:t>BRL fixed</w:t>
+      </w:r>
+      <w:r>
+        <w:t xml:space="preserve"> (o Vanilla comum do Banco fica só no Pending Confirmation). O número da operação é um só no Pending, na esteira, no documento e no XML: </w:t>
+      </w:r>
+      <w:r>
+        <w:rPr>
+          <w:b/>
+        </w:rPr>
+        <w:t>B3 ID</w:t>
+      </w:r>
+      <w:r>
+        <w:t xml:space="preserve"> no FWD Start e nos swaps, </w:t>
+      </w:r>
+      <w:r>
+        <w:rPr>
+          <w:b/>
+        </w:rPr>
+        <w:t>Deal (Athena ID)</w:t>
+      </w:r>
+      <w:r>
+        <w:t xml:space="preserve"> no Vanilla, FXO, NDF e opção de commodities; salvar o documento grava o *numeroContrato* no </w:t>
+      </w:r>
+      <w:r>
+        <w:rPr>
+          <w:b/>
+        </w:rPr>
+        <w:t>FepWeb ID</w:t>
+      </w:r>
+      <w:r>
+        <w:t xml:space="preserve"> do Pending.</w:t>
+      </w:r>
+    </w:p>
+    <w:p>
+      <w:r>
         <w:t xml:space="preserve">As duas pontas não são de validação: </w:t>
       </w:r>
       <w:r>
@@ -3267,7 +3332,7 @@
               <a:graphicData uri="http://schemas.openxmlformats.org/drawingml/2006/picture">
                 <pic:pic>
                   <pic:nvPicPr>
-                    <pic:cNvPr id="0" name="tmp8a3aaqvs.png"/>
+                    <pic:cNvPr id="0" name="tmpze95_vwn.png"/>
                     <pic:cNvPicPr/>
                   </pic:nvPicPr>
                   <pic:blipFill>
@@ -3361,7 +3426,7 @@
               <a:graphicData uri="http://schemas.openxmlformats.org/drawingml/2006/picture">
                 <pic:pic>
                   <pic:nvPicPr>
-                    <pic:cNvPr id="0" name="tmpdm58yrsw.png"/>
+                    <pic:cNvPr id="0" name="tmpitqji_cw.png"/>
                     <pic:cNvPicPr/>
                   </pic:nvPicPr>
                   <pic:blipFill>
@@ -3428,7 +3493,7 @@
               <a:graphicData uri="http://schemas.openxmlformats.org/drawingml/2006/picture">
                 <pic:pic>
                   <pic:nvPicPr>
-                    <pic:cNvPr id="0" name="tmpivx4pw_0.png"/>
+                    <pic:cNvPr id="0" name="tmpp19ryvtv.png"/>
                     <pic:cNvPicPr/>
                   </pic:nvPicPr>
                   <pic:blipFill>
@@ -3484,7 +3549,7 @@
               <a:graphicData uri="http://schemas.openxmlformats.org/drawingml/2006/picture">
                 <pic:pic>
                   <pic:nvPicPr>
-                    <pic:cNvPr id="0" name="tmpsv1l70d4.png"/>
+                    <pic:cNvPr id="0" name="tmpmahhrf3b.png"/>
                     <pic:cNvPicPr/>
                   </pic:nvPicPr>
                   <pic:blipFill>
@@ -3551,7 +3616,7 @@
               <a:graphicData uri="http://schemas.openxmlformats.org/drawingml/2006/picture">
                 <pic:pic>
                   <pic:nvPicPr>
-                    <pic:cNvPr id="0" name="tmpd0maey49.png"/>
+                    <pic:cNvPr id="0" name="tmpkumkhe4w.png"/>
                     <pic:cNvPicPr/>
                   </pic:nvPicPr>
                   <pic:blipFill>
@@ -3607,7 +3672,7 @@
               <a:graphicData uri="http://schemas.openxmlformats.org/drawingml/2006/picture">
                 <pic:pic>
                   <pic:nvPicPr>
-                    <pic:cNvPr id="0" name="tmptvlx2zgq.png"/>
+                    <pic:cNvPr id="0" name="tmpzuzs9tw4.png"/>
                     <pic:cNvPicPr/>
                   </pic:nvPicPr>
                   <pic:blipFill>
@@ -3663,7 +3728,7 @@
               <a:graphicData uri="http://schemas.openxmlformats.org/drawingml/2006/picture">
                 <pic:pic>
                   <pic:nvPicPr>
-                    <pic:cNvPr id="0" name="tmpvo6td5dr.png"/>
+                    <pic:cNvPr id="0" name="tmp5vayts9c.png"/>
                     <pic:cNvPicPr/>
                   </pic:nvPicPr>
                   <pic:blipFill>
@@ -3719,7 +3784,7 @@
               <a:graphicData uri="http://schemas.openxmlformats.org/drawingml/2006/picture">
                 <pic:pic>
                   <pic:nvPicPr>
-                    <pic:cNvPr id="0" name="tmppyvlkaxz.png"/>
+                    <pic:cNvPr id="0" name="tmp8psij3tw.png"/>
                     <pic:cNvPicPr/>
                   </pic:nvPicPr>
                   <pic:blipFill>
@@ -3775,7 +3840,7 @@
               <a:graphicData uri="http://schemas.openxmlformats.org/drawingml/2006/picture">
                 <pic:pic>
                   <pic:nvPicPr>
-                    <pic:cNvPr id="0" name="tmpe71d2dap.png"/>
+                    <pic:cNvPr id="0" name="tmp23dx7jsc.png"/>
                     <pic:cNvPicPr/>
                   </pic:nvPicPr>
                   <pic:blipFill>
@@ -3831,7 +3896,7 @@
               <a:graphicData uri="http://schemas.openxmlformats.org/drawingml/2006/picture">
                 <pic:pic>
                   <pic:nvPicPr>
-                    <pic:cNvPr id="0" name="tmpwag5tccw.png"/>
+                    <pic:cNvPr id="0" name="tmp2v19hjb7.png"/>
                     <pic:cNvPicPr/>
                   </pic:nvPicPr>
                   <pic:blipFill>
@@ -4553,7 +4618,7 @@
               <a:graphicData uri="http://schemas.openxmlformats.org/drawingml/2006/picture">
                 <pic:pic>
                   <pic:nvPicPr>
-                    <pic:cNvPr id="0" name="tmpvxippejp.png"/>
+                    <pic:cNvPr id="0" name="tmpc6jsrk24.png"/>
                     <pic:cNvPicPr/>
                   </pic:nvPicPr>
                   <pic:blipFill>
@@ -4609,7 +4674,7 @@
               <a:graphicData uri="http://schemas.openxmlformats.org/drawingml/2006/picture">
                 <pic:pic>
                   <pic:nvPicPr>
-                    <pic:cNvPr id="0" name="tmp66gfm717.png"/>
+                    <pic:cNvPr id="0" name="tmplsmidnx2.png"/>
                     <pic:cNvPicPr/>
                   </pic:nvPicPr>
                   <pic:blipFill>
@@ -4712,7 +4777,7 @@
               <a:graphicData uri="http://schemas.openxmlformats.org/drawingml/2006/picture">
                 <pic:pic>
                   <pic:nvPicPr>
-                    <pic:cNvPr id="0" name="tmp7wobv5id.png"/>
+                    <pic:cNvPr id="0" name="tmplh980f6r.png"/>
                     <pic:cNvPicPr/>
                   </pic:nvPicPr>
                   <pic:blipFill>
@@ -4797,7 +4862,7 @@
               <a:graphicData uri="http://schemas.openxmlformats.org/drawingml/2006/picture">
                 <pic:pic>
                   <pic:nvPicPr>
-                    <pic:cNvPr id="0" name="tmpswcx9qca.png"/>
+                    <pic:cNvPr id="0" name="tmp4y_do4so.png"/>
                     <pic:cNvPicPr/>
                   </pic:nvPicPr>
                   <pic:blipFill>
@@ -4853,7 +4918,7 @@
               <a:graphicData uri="http://schemas.openxmlformats.org/drawingml/2006/picture">
                 <pic:pic>
                   <pic:nvPicPr>
-                    <pic:cNvPr id="0" name="tmp0mcbs87g.png"/>
+                    <pic:cNvPr id="0" name="tmpuafn2djh.png"/>
                     <pic:cNvPicPr/>
                   </pic:nvPicPr>
                   <pic:blipFill>
@@ -4909,7 +4974,7 @@
               <a:graphicData uri="http://schemas.openxmlformats.org/drawingml/2006/picture">
                 <pic:pic>
                   <pic:nvPicPr>
-                    <pic:cNvPr id="0" name="tmps7pc9zwu.png"/>
+                    <pic:cNvPr id="0" name="tmpw1uxpms9.png"/>
                     <pic:cNvPicPr/>
                   </pic:nvPicPr>
                   <pic:blipFill>
@@ -4965,7 +5030,7 @@
               <a:graphicData uri="http://schemas.openxmlformats.org/drawingml/2006/picture">
                 <pic:pic>
                   <pic:nvPicPr>
-                    <pic:cNvPr id="0" name="tmpnvjbcmaw.png"/>
+                    <pic:cNvPr id="0" name="tmp3v37aunu.png"/>
                     <pic:cNvPicPr/>
                   </pic:nvPicPr>
                   <pic:blipFill>
@@ -5021,7 +5086,7 @@
               <a:graphicData uri="http://schemas.openxmlformats.org/drawingml/2006/picture">
                 <pic:pic>
                   <pic:nvPicPr>
-                    <pic:cNvPr id="0" name="tmprm7w5c7i.png"/>
+                    <pic:cNvPr id="0" name="tmphkbx44jz.png"/>
                     <pic:cNvPicPr/>
                   </pic:nvPicPr>
                   <pic:blipFill>

</xml_diff>

<commit_message>
docs: Guia e SOP com o §704 e o §705 (a pendência do Pay/Rec nos dias seguintes; a zona sem movimento fora do quadro)
Co-Authored-By: Claude Opus 5.5 (1M context) <noreply@anthropic.com>
</commit_message>
<xml_diff>
--- a/SOP_PROCESSAMENTO_OTC.docx
+++ b/SOP_PROCESSAMENTO_OTC.docx
@@ -476,7 +476,7 @@
               <a:graphicData uri="http://schemas.openxmlformats.org/drawingml/2006/picture">
                 <pic:pic>
                   <pic:nvPicPr>
-                    <pic:cNvPr id="0" name="tmpccfwkdm8.png"/>
+                    <pic:cNvPr id="0" name="tmpqnrgr8vs.png"/>
                     <pic:cNvPicPr/>
                   </pic:nvPicPr>
                   <pic:blipFill>
@@ -536,7 +536,7 @@
               <a:graphicData uri="http://schemas.openxmlformats.org/drawingml/2006/picture">
                 <pic:pic>
                   <pic:nvPicPr>
-                    <pic:cNvPr id="0" name="tmpzlkpwq0o.png"/>
+                    <pic:cNvPr id="0" name="tmpb5dprhsx.png"/>
                     <pic:cNvPicPr/>
                   </pic:nvPicPr>
                   <pic:blipFill>
@@ -596,7 +596,7 @@
               <a:graphicData uri="http://schemas.openxmlformats.org/drawingml/2006/picture">
                 <pic:pic>
                   <pic:nvPicPr>
-                    <pic:cNvPr id="0" name="tmpnyky80et.png"/>
+                    <pic:cNvPr id="0" name="tmp_ccno9sw.png"/>
                     <pic:cNvPicPr/>
                   </pic:nvPicPr>
                   <pic:blipFill>
@@ -656,7 +656,7 @@
               <a:graphicData uri="http://schemas.openxmlformats.org/drawingml/2006/picture">
                 <pic:pic>
                   <pic:nvPicPr>
-                    <pic:cNvPr id="0" name="tmpua6qh9fs.png"/>
+                    <pic:cNvPr id="0" name="tmpoqwfi6qr.png"/>
                     <pic:cNvPicPr/>
                   </pic:nvPicPr>
                   <pic:blipFill>
@@ -716,7 +716,7 @@
               <a:graphicData uri="http://schemas.openxmlformats.org/drawingml/2006/picture">
                 <pic:pic>
                   <pic:nvPicPr>
-                    <pic:cNvPr id="0" name="tmpmahhrf3b.png"/>
+                    <pic:cNvPr id="0" name="tmpz9yc5t7l.png"/>
                     <pic:cNvPicPr/>
                   </pic:nvPicPr>
                   <pic:blipFill>
@@ -990,7 +990,7 @@
               <a:graphicData uri="http://schemas.openxmlformats.org/drawingml/2006/picture">
                 <pic:pic>
                   <pic:nvPicPr>
-                    <pic:cNvPr id="0" name="tmpredv4mde.png"/>
+                    <pic:cNvPr id="0" name="tmpf7mwx8lt.png"/>
                     <pic:cNvPicPr/>
                   </pic:nvPicPr>
                   <pic:blipFill>
@@ -1046,7 +1046,7 @@
               <a:graphicData uri="http://schemas.openxmlformats.org/drawingml/2006/picture">
                 <pic:pic>
                   <pic:nvPicPr>
-                    <pic:cNvPr id="0" name="tmp_8eodafd.png"/>
+                    <pic:cNvPr id="0" name="tmpkufz81tq.png"/>
                     <pic:cNvPicPr/>
                   </pic:nvPicPr>
                   <pic:blipFill>
@@ -1174,7 +1174,7 @@
               <a:graphicData uri="http://schemas.openxmlformats.org/drawingml/2006/picture">
                 <pic:pic>
                   <pic:nvPicPr>
-                    <pic:cNvPr id="0" name="tmpnm8qqqja.png"/>
+                    <pic:cNvPr id="0" name="tmpzm_gm9fa.png"/>
                     <pic:cNvPicPr/>
                   </pic:nvPicPr>
                   <pic:blipFill>
@@ -1239,7 +1239,7 @@
               <a:graphicData uri="http://schemas.openxmlformats.org/drawingml/2006/picture">
                 <pic:pic>
                   <pic:nvPicPr>
-                    <pic:cNvPr id="0" name="tmphl0erjex.png"/>
+                    <pic:cNvPr id="0" name="tmp9xwq3iny.png"/>
                     <pic:cNvPicPr/>
                   </pic:nvPicPr>
                   <pic:blipFill>
@@ -1390,7 +1390,7 @@
               <w:t>CADASTROCURVASMOEDASFEEDERDOMINIOS</w:t>
             </w:r>
             <w:r>
-              <w:t xml:space="preserve"> também atualizam as bases de indexadores e de domínios, e o de domínios vai anexo no e-mail) · Intraday Monitor — Tasks &amp; Pending Action · Confirmations Escalation (Save CETIP Files e Confirmations Escalation também são tarefas do Intraday Monitor) · Initiatives — Alerts (todo dia útil às 08:00: o e-mail e o aviso no sino da iniciativa em andamento parada há mais de 5 dias úteis, com prazo — dela ou de uma tarefa — a 2 dias úteis, ou que termina no dia)</w:t>
+              <w:t xml:space="preserve"> também atualizam as bases de indexadores e de domínios, e o de domínios vai anexo no e-mail) · Intraday Monitor — Tasks &amp; Pending Action (as tarefas de zona — B3 Registration, Confirmations, Intrag — só entram no quadro no dia em que a zona teve operação importada) · Confirmations Escalation (Save CETIP Files e Confirmations Escalation também são tarefas do Intraday Monitor) · Initiatives — Alerts (todo dia útil às 08:00: o e-mail e o aviso no sino da iniciativa em andamento parada há mais de 5 dias úteis, com prazo — dela ou de uma tarefa — a 2 dias úteis, ou que termina no dia)</w:t>
             </w:r>
           </w:p>
         </w:tc>
@@ -1564,7 +1564,7 @@
               <a:graphicData uri="http://schemas.openxmlformats.org/drawingml/2006/picture">
                 <pic:pic>
                   <pic:nvPicPr>
-                    <pic:cNvPr id="0" name="tmpccfwkdm8.png"/>
+                    <pic:cNvPr id="0" name="tmpqnrgr8vs.png"/>
                     <pic:cNvPicPr/>
                   </pic:nvPicPr>
                   <pic:blipFill>
@@ -1977,7 +1977,7 @@
               <a:graphicData uri="http://schemas.openxmlformats.org/drawingml/2006/picture">
                 <pic:pic>
                   <pic:nvPicPr>
-                    <pic:cNvPr id="0" name="tmpnyky80et.png"/>
+                    <pic:cNvPr id="0" name="tmp_ccno9sw.png"/>
                     <pic:cNvPicPr/>
                   </pic:nvPicPr>
                   <pic:blipFill>
@@ -2033,7 +2033,7 @@
               <a:graphicData uri="http://schemas.openxmlformats.org/drawingml/2006/picture">
                 <pic:pic>
                   <pic:nvPicPr>
-                    <pic:cNvPr id="0" name="tmpzlkpwq0o.png"/>
+                    <pic:cNvPr id="0" name="tmpb5dprhsx.png"/>
                     <pic:cNvPicPr/>
                   </pic:nvPicPr>
                   <pic:blipFill>
@@ -2225,7 +2225,7 @@
               <a:graphicData uri="http://schemas.openxmlformats.org/drawingml/2006/picture">
                 <pic:pic>
                   <pic:nvPicPr>
-                    <pic:cNvPr id="0" name="tmpq8qek7zu.png"/>
+                    <pic:cNvPr id="0" name="tmpk4q0cewl.png"/>
                     <pic:cNvPicPr/>
                   </pic:nvPicPr>
                   <pic:blipFill>
@@ -2281,7 +2281,7 @@
               <a:graphicData uri="http://schemas.openxmlformats.org/drawingml/2006/picture">
                 <pic:pic>
                   <pic:nvPicPr>
-                    <pic:cNvPr id="0" name="tmp4ylfk1sg.png"/>
+                    <pic:cNvPr id="0" name="tmpdfamyfq3.png"/>
                     <pic:cNvPicPr/>
                   </pic:nvPicPr>
                   <pic:blipFill>
@@ -2337,7 +2337,7 @@
               <a:graphicData uri="http://schemas.openxmlformats.org/drawingml/2006/picture">
                 <pic:pic>
                   <pic:nvPicPr>
-                    <pic:cNvPr id="0" name="tmpp9unyze7.png"/>
+                    <pic:cNvPr id="0" name="tmp5g58hr_h.png"/>
                     <pic:cNvPicPr/>
                   </pic:nvPicPr>
                   <pic:blipFill>
@@ -2444,7 +2444,7 @@
               <a:graphicData uri="http://schemas.openxmlformats.org/drawingml/2006/picture">
                 <pic:pic>
                   <pic:nvPicPr>
-                    <pic:cNvPr id="0" name="tmpua6qh9fs.png"/>
+                    <pic:cNvPr id="0" name="tmpoqwfi6qr.png"/>
                     <pic:cNvPicPr/>
                   </pic:nvPicPr>
                   <pic:blipFill>
@@ -2551,7 +2551,7 @@
               <a:graphicData uri="http://schemas.openxmlformats.org/drawingml/2006/picture">
                 <pic:pic>
                   <pic:nvPicPr>
-                    <pic:cNvPr id="0" name="tmp2cfluoei.png"/>
+                    <pic:cNvPr id="0" name="tmpn7qmvkyz.png"/>
                     <pic:cNvPicPr/>
                   </pic:nvPicPr>
                   <pic:blipFill>
@@ -2658,7 +2658,7 @@
               <a:graphicData uri="http://schemas.openxmlformats.org/drawingml/2006/picture">
                 <pic:pic>
                   <pic:nvPicPr>
-                    <pic:cNvPr id="0" name="tmpjw1y7nfd.png"/>
+                    <pic:cNvPr id="0" name="tmpoigkptve.png"/>
                     <pic:cNvPicPr/>
                   </pic:nvPicPr>
                   <pic:blipFill>
@@ -2714,7 +2714,7 @@
               <a:graphicData uri="http://schemas.openxmlformats.org/drawingml/2006/picture">
                 <pic:pic>
                   <pic:nvPicPr>
-                    <pic:cNvPr id="0" name="tmpvqy14nw5.png"/>
+                    <pic:cNvPr id="0" name="tmp5xgcpq4w.png"/>
                     <pic:cNvPicPr/>
                   </pic:nvPicPr>
                   <pic:blipFill>
@@ -2781,7 +2781,7 @@
               <a:graphicData uri="http://schemas.openxmlformats.org/drawingml/2006/picture">
                 <pic:pic>
                   <pic:nvPicPr>
-                    <pic:cNvPr id="0" name="tmpgb_svtnr.png"/>
+                    <pic:cNvPr id="0" name="tmp3akoa9iu.png"/>
                     <pic:cNvPicPr/>
                   </pic:nvPicPr>
                   <pic:blipFill>
@@ -2846,7 +2846,25 @@
         <w:t>um arquivo de cada tipo</w:t>
       </w:r>
       <w:r>
-        <w:t xml:space="preserve"> (HistoricoMensagens JPM, HistoricoMensagens MGT, cashflows, RLDOCREC…): o que entra pelo dropzone substitui o do mesmo tipo, e com dois na pasta vale o salvo por último — o mais antigo é apagado.</w:t>
+        <w:t xml:space="preserve"> (HistoricoMensagens JPM, HistoricoMensagens MGT, cashflows, RLDOCREC…): o que entra pelo dropzone substitui o do mesmo tipo, e com dois na pasta vale o salvo por último — o mais antigo é apagado. A linha marcada como </w:t>
+      </w:r>
+      <w:r>
+        <w:rPr>
+          <w:b/>
+        </w:rPr>
+        <w:t>Pending Payment</w:t>
+      </w:r>
+      <w:r>
+        <w:t xml:space="preserve"> ou </w:t>
+      </w:r>
+      <w:r>
+        <w:rPr>
+          <w:b/>
+        </w:rPr>
+        <w:t>Pending Receivement</w:t>
+      </w:r>
+      <w:r>
+        <w:t xml:space="preserve"> no Edit é uma liquidação que não aconteceu: ela volta sozinha nos dias seguintes (com a data de origem no comentário) até liquidar ou ser justificada; a marcação vale também depois do End process.</w:t>
       </w:r>
     </w:p>
     <w:p>
@@ -2865,7 +2883,7 @@
               <a:graphicData uri="http://schemas.openxmlformats.org/drawingml/2006/picture">
                 <pic:pic>
                   <pic:nvPicPr>
-                    <pic:cNvPr id="0" name="tmpzd46vjjc.png"/>
+                    <pic:cNvPr id="0" name="tmpm5rho2dv.png"/>
                     <pic:cNvPicPr/>
                   </pic:nvPicPr>
                   <pic:blipFill>
@@ -2930,7 +2948,7 @@
               <a:graphicData uri="http://schemas.openxmlformats.org/drawingml/2006/picture">
                 <pic:pic>
                   <pic:nvPicPr>
-                    <pic:cNvPr id="0" name="tmpv48ps75b.png"/>
+                    <pic:cNvPr id="0" name="tmpm5r6v32i.png"/>
                     <pic:cNvPicPr/>
                   </pic:nvPicPr>
                   <pic:blipFill>
@@ -3049,7 +3067,7 @@
               <a:graphicData uri="http://schemas.openxmlformats.org/drawingml/2006/picture">
                 <pic:pic>
                   <pic:nvPicPr>
-                    <pic:cNvPr id="0" name="tmpjeep29xu.png"/>
+                    <pic:cNvPr id="0" name="tmptnzqmkjn.png"/>
                     <pic:cNvPicPr/>
                   </pic:nvPicPr>
                   <pic:blipFill>
@@ -3130,7 +3148,7 @@
               <a:graphicData uri="http://schemas.openxmlformats.org/drawingml/2006/picture">
                 <pic:pic>
                   <pic:nvPicPr>
-                    <pic:cNvPr id="0" name="tmpc__a8pz1.png"/>
+                    <pic:cNvPr id="0" name="tmpfm70dxux.png"/>
                     <pic:cNvPicPr/>
                   </pic:nvPicPr>
                   <pic:blipFill>
@@ -3332,7 +3350,7 @@
               <a:graphicData uri="http://schemas.openxmlformats.org/drawingml/2006/picture">
                 <pic:pic>
                   <pic:nvPicPr>
-                    <pic:cNvPr id="0" name="tmpze95_vwn.png"/>
+                    <pic:cNvPr id="0" name="tmpwzpavuce.png"/>
                     <pic:cNvPicPr/>
                   </pic:nvPicPr>
                   <pic:blipFill>
@@ -3426,7 +3444,7 @@
               <a:graphicData uri="http://schemas.openxmlformats.org/drawingml/2006/picture">
                 <pic:pic>
                   <pic:nvPicPr>
-                    <pic:cNvPr id="0" name="tmpitqji_cw.png"/>
+                    <pic:cNvPr id="0" name="tmpnsu8wj0m.png"/>
                     <pic:cNvPicPr/>
                   </pic:nvPicPr>
                   <pic:blipFill>
@@ -3493,7 +3511,7 @@
               <a:graphicData uri="http://schemas.openxmlformats.org/drawingml/2006/picture">
                 <pic:pic>
                   <pic:nvPicPr>
-                    <pic:cNvPr id="0" name="tmpp19ryvtv.png"/>
+                    <pic:cNvPr id="0" name="tmpsvu7op2y.png"/>
                     <pic:cNvPicPr/>
                   </pic:nvPicPr>
                   <pic:blipFill>
@@ -3549,7 +3567,7 @@
               <a:graphicData uri="http://schemas.openxmlformats.org/drawingml/2006/picture">
                 <pic:pic>
                   <pic:nvPicPr>
-                    <pic:cNvPr id="0" name="tmpmahhrf3b.png"/>
+                    <pic:cNvPr id="0" name="tmpz9yc5t7l.png"/>
                     <pic:cNvPicPr/>
                   </pic:nvPicPr>
                   <pic:blipFill>
@@ -3616,7 +3634,7 @@
               <a:graphicData uri="http://schemas.openxmlformats.org/drawingml/2006/picture">
                 <pic:pic>
                   <pic:nvPicPr>
-                    <pic:cNvPr id="0" name="tmpkumkhe4w.png"/>
+                    <pic:cNvPr id="0" name="tmpanefpkfm.png"/>
                     <pic:cNvPicPr/>
                   </pic:nvPicPr>
                   <pic:blipFill>
@@ -3672,7 +3690,7 @@
               <a:graphicData uri="http://schemas.openxmlformats.org/drawingml/2006/picture">
                 <pic:pic>
                   <pic:nvPicPr>
-                    <pic:cNvPr id="0" name="tmpzuzs9tw4.png"/>
+                    <pic:cNvPr id="0" name="tmpmfcl4_q3.png"/>
                     <pic:cNvPicPr/>
                   </pic:nvPicPr>
                   <pic:blipFill>
@@ -3728,7 +3746,7 @@
               <a:graphicData uri="http://schemas.openxmlformats.org/drawingml/2006/picture">
                 <pic:pic>
                   <pic:nvPicPr>
-                    <pic:cNvPr id="0" name="tmp5vayts9c.png"/>
+                    <pic:cNvPr id="0" name="tmp7eampko_.png"/>
                     <pic:cNvPicPr/>
                   </pic:nvPicPr>
                   <pic:blipFill>
@@ -3784,7 +3802,7 @@
               <a:graphicData uri="http://schemas.openxmlformats.org/drawingml/2006/picture">
                 <pic:pic>
                   <pic:nvPicPr>
-                    <pic:cNvPr id="0" name="tmp8psij3tw.png"/>
+                    <pic:cNvPr id="0" name="tmpzcecnixm.png"/>
                     <pic:cNvPicPr/>
                   </pic:nvPicPr>
                   <pic:blipFill>
@@ -3840,7 +3858,7 @@
               <a:graphicData uri="http://schemas.openxmlformats.org/drawingml/2006/picture">
                 <pic:pic>
                   <pic:nvPicPr>
-                    <pic:cNvPr id="0" name="tmp23dx7jsc.png"/>
+                    <pic:cNvPr id="0" name="tmp_tdjw9zx.png"/>
                     <pic:cNvPicPr/>
                   </pic:nvPicPr>
                   <pic:blipFill>
@@ -3896,7 +3914,7 @@
               <a:graphicData uri="http://schemas.openxmlformats.org/drawingml/2006/picture">
                 <pic:pic>
                   <pic:nvPicPr>
-                    <pic:cNvPr id="0" name="tmp2v19hjb7.png"/>
+                    <pic:cNvPr id="0" name="tmp6ublg0dz.png"/>
                     <pic:cNvPicPr/>
                   </pic:nvPicPr>
                   <pic:blipFill>
@@ -4618,7 +4636,7 @@
               <a:graphicData uri="http://schemas.openxmlformats.org/drawingml/2006/picture">
                 <pic:pic>
                   <pic:nvPicPr>
-                    <pic:cNvPr id="0" name="tmpc6jsrk24.png"/>
+                    <pic:cNvPr id="0" name="tmpngmpzfg0.png"/>
                     <pic:cNvPicPr/>
                   </pic:nvPicPr>
                   <pic:blipFill>
@@ -4674,7 +4692,7 @@
               <a:graphicData uri="http://schemas.openxmlformats.org/drawingml/2006/picture">
                 <pic:pic>
                   <pic:nvPicPr>
-                    <pic:cNvPr id="0" name="tmplsmidnx2.png"/>
+                    <pic:cNvPr id="0" name="tmp13fimw_0.png"/>
                     <pic:cNvPicPr/>
                   </pic:nvPicPr>
                   <pic:blipFill>
@@ -4777,7 +4795,7 @@
               <a:graphicData uri="http://schemas.openxmlformats.org/drawingml/2006/picture">
                 <pic:pic>
                   <pic:nvPicPr>
-                    <pic:cNvPr id="0" name="tmplh980f6r.png"/>
+                    <pic:cNvPr id="0" name="tmpprknfltj.png"/>
                     <pic:cNvPicPr/>
                   </pic:nvPicPr>
                   <pic:blipFill>
@@ -4862,7 +4880,7 @@
               <a:graphicData uri="http://schemas.openxmlformats.org/drawingml/2006/picture">
                 <pic:pic>
                   <pic:nvPicPr>
-                    <pic:cNvPr id="0" name="tmp4y_do4so.png"/>
+                    <pic:cNvPr id="0" name="tmpkpgt0epw.png"/>
                     <pic:cNvPicPr/>
                   </pic:nvPicPr>
                   <pic:blipFill>
@@ -4918,7 +4936,7 @@
               <a:graphicData uri="http://schemas.openxmlformats.org/drawingml/2006/picture">
                 <pic:pic>
                   <pic:nvPicPr>
-                    <pic:cNvPr id="0" name="tmpuafn2djh.png"/>
+                    <pic:cNvPr id="0" name="tmpc8joxert.png"/>
                     <pic:cNvPicPr/>
                   </pic:nvPicPr>
                   <pic:blipFill>
@@ -4974,7 +4992,7 @@
               <a:graphicData uri="http://schemas.openxmlformats.org/drawingml/2006/picture">
                 <pic:pic>
                   <pic:nvPicPr>
-                    <pic:cNvPr id="0" name="tmpw1uxpms9.png"/>
+                    <pic:cNvPr id="0" name="tmp2powynnb.png"/>
                     <pic:cNvPicPr/>
                   </pic:nvPicPr>
                   <pic:blipFill>
@@ -5030,7 +5048,7 @@
               <a:graphicData uri="http://schemas.openxmlformats.org/drawingml/2006/picture">
                 <pic:pic>
                   <pic:nvPicPr>
-                    <pic:cNvPr id="0" name="tmp3v37aunu.png"/>
+                    <pic:cNvPr id="0" name="tmpx0hvlfqe.png"/>
                     <pic:cNvPicPr/>
                   </pic:nvPicPr>
                   <pic:blipFill>
@@ -5086,7 +5104,7 @@
               <a:graphicData uri="http://schemas.openxmlformats.org/drawingml/2006/picture">
                 <pic:pic>
                   <pic:nvPicPr>
-                    <pic:cNvPr id="0" name="tmphkbx44jz.png"/>
+                    <pic:cNvPr id="0" name="tmpqi8oi482.png"/>
                     <pic:cNvPicPr/>
                   </pic:nvPicPr>
                   <pic:blipFill>

</xml_diff>

<commit_message>
docs(e-financeira): a data do CGD e o CNPJ se cadastram no Reference Data
O passo 4 da seção 12.2 do Guia mandava completar as linhas Incomplete pelo
Edit; desde o §738 a data do CGD vem do Reference Data, e o certo para o CGD
e o CNPJ é cadastrar na origem (o CGD só vale aprovado, Active) — vale para
todos os meses e para as confirmações; o Edit corrige só aquela linha. A mesma
orientação no SOP, e a linha do check_efinanceira no README dos testes, que
ainda dizia a data do CGD pelo Tracking Docs. .docx regerados.

Co-Authored-By: Claude Opus 5.5 (1M context) <noreply@anthropic.com>
</commit_message>
<xml_diff>
--- a/SOP_PROCESSAMENTO_OTC.docx
+++ b/SOP_PROCESSAMENTO_OTC.docx
@@ -476,7 +476,7 @@
               <a:graphicData uri="http://schemas.openxmlformats.org/drawingml/2006/picture">
                 <pic:pic>
                   <pic:nvPicPr>
-                    <pic:cNvPr id="0" name="tmpebuk97yi.png"/>
+                    <pic:cNvPr id="0" name="tmpldq5fouo.png"/>
                     <pic:cNvPicPr/>
                   </pic:nvPicPr>
                   <pic:blipFill>
@@ -536,7 +536,7 @@
               <a:graphicData uri="http://schemas.openxmlformats.org/drawingml/2006/picture">
                 <pic:pic>
                   <pic:nvPicPr>
-                    <pic:cNvPr id="0" name="tmpul51zv5s.png"/>
+                    <pic:cNvPr id="0" name="tmph16jmlp8.png"/>
                     <pic:cNvPicPr/>
                   </pic:nvPicPr>
                   <pic:blipFill>
@@ -596,7 +596,7 @@
               <a:graphicData uri="http://schemas.openxmlformats.org/drawingml/2006/picture">
                 <pic:pic>
                   <pic:nvPicPr>
-                    <pic:cNvPr id="0" name="tmpd9mnw45g.png"/>
+                    <pic:cNvPr id="0" name="tmpz7yup5lh.png"/>
                     <pic:cNvPicPr/>
                   </pic:nvPicPr>
                   <pic:blipFill>
@@ -656,7 +656,7 @@
               <a:graphicData uri="http://schemas.openxmlformats.org/drawingml/2006/picture">
                 <pic:pic>
                   <pic:nvPicPr>
-                    <pic:cNvPr id="0" name="tmpecpupugq.png"/>
+                    <pic:cNvPr id="0" name="tmprn91tw55.png"/>
                     <pic:cNvPicPr/>
                   </pic:nvPicPr>
                   <pic:blipFill>
@@ -716,7 +716,7 @@
               <a:graphicData uri="http://schemas.openxmlformats.org/drawingml/2006/picture">
                 <pic:pic>
                   <pic:nvPicPr>
-                    <pic:cNvPr id="0" name="tmpem64q3rx.png"/>
+                    <pic:cNvPr id="0" name="tmpi33v9khn.png"/>
                     <pic:cNvPicPr/>
                   </pic:nvPicPr>
                   <pic:blipFill>
@@ -990,7 +990,7 @@
               <a:graphicData uri="http://schemas.openxmlformats.org/drawingml/2006/picture">
                 <pic:pic>
                   <pic:nvPicPr>
-                    <pic:cNvPr id="0" name="tmp1myxypba.png"/>
+                    <pic:cNvPr id="0" name="tmplwvpaltu.png"/>
                     <pic:cNvPicPr/>
                   </pic:nvPicPr>
                   <pic:blipFill>
@@ -1046,7 +1046,7 @@
               <a:graphicData uri="http://schemas.openxmlformats.org/drawingml/2006/picture">
                 <pic:pic>
                   <pic:nvPicPr>
-                    <pic:cNvPr id="0" name="tmp2v31c0h2.png"/>
+                    <pic:cNvPr id="0" name="tmpbds1gnt_.png"/>
                     <pic:cNvPicPr/>
                   </pic:nvPicPr>
                   <pic:blipFill>
@@ -1174,7 +1174,7 @@
               <a:graphicData uri="http://schemas.openxmlformats.org/drawingml/2006/picture">
                 <pic:pic>
                   <pic:nvPicPr>
-                    <pic:cNvPr id="0" name="tmpi13y26uz.png"/>
+                    <pic:cNvPr id="0" name="tmp3wdu3qwo.png"/>
                     <pic:cNvPicPr/>
                   </pic:nvPicPr>
                   <pic:blipFill>
@@ -1239,7 +1239,7 @@
               <a:graphicData uri="http://schemas.openxmlformats.org/drawingml/2006/picture">
                 <pic:pic>
                   <pic:nvPicPr>
-                    <pic:cNvPr id="0" name="tmpu77k7qoh.png"/>
+                    <pic:cNvPr id="0" name="tmp7h1ocsdo.png"/>
                     <pic:cNvPicPr/>
                   </pic:nvPicPr>
                   <pic:blipFill>
@@ -1564,7 +1564,7 @@
               <a:graphicData uri="http://schemas.openxmlformats.org/drawingml/2006/picture">
                 <pic:pic>
                   <pic:nvPicPr>
-                    <pic:cNvPr id="0" name="tmpebuk97yi.png"/>
+                    <pic:cNvPr id="0" name="tmpldq5fouo.png"/>
                     <pic:cNvPicPr/>
                   </pic:nvPicPr>
                   <pic:blipFill>
@@ -1977,7 +1977,7 @@
               <a:graphicData uri="http://schemas.openxmlformats.org/drawingml/2006/picture">
                 <pic:pic>
                   <pic:nvPicPr>
-                    <pic:cNvPr id="0" name="tmpd9mnw45g.png"/>
+                    <pic:cNvPr id="0" name="tmpz7yup5lh.png"/>
                     <pic:cNvPicPr/>
                   </pic:nvPicPr>
                   <pic:blipFill>
@@ -2033,7 +2033,7 @@
               <a:graphicData uri="http://schemas.openxmlformats.org/drawingml/2006/picture">
                 <pic:pic>
                   <pic:nvPicPr>
-                    <pic:cNvPr id="0" name="tmpul51zv5s.png"/>
+                    <pic:cNvPr id="0" name="tmph16jmlp8.png"/>
                     <pic:cNvPicPr/>
                   </pic:nvPicPr>
                   <pic:blipFill>
@@ -2225,7 +2225,7 @@
               <a:graphicData uri="http://schemas.openxmlformats.org/drawingml/2006/picture">
                 <pic:pic>
                   <pic:nvPicPr>
-                    <pic:cNvPr id="0" name="tmpj5_hscz9.png"/>
+                    <pic:cNvPr id="0" name="tmpod8aujo4.png"/>
                     <pic:cNvPicPr/>
                   </pic:nvPicPr>
                   <pic:blipFill>
@@ -2281,7 +2281,7 @@
               <a:graphicData uri="http://schemas.openxmlformats.org/drawingml/2006/picture">
                 <pic:pic>
                   <pic:nvPicPr>
-                    <pic:cNvPr id="0" name="tmp9y13mvgg.png"/>
+                    <pic:cNvPr id="0" name="tmpshl1l392.png"/>
                     <pic:cNvPicPr/>
                   </pic:nvPicPr>
                   <pic:blipFill>
@@ -2337,7 +2337,7 @@
               <a:graphicData uri="http://schemas.openxmlformats.org/drawingml/2006/picture">
                 <pic:pic>
                   <pic:nvPicPr>
-                    <pic:cNvPr id="0" name="tmptcb0gdq3.png"/>
+                    <pic:cNvPr id="0" name="tmpp2ir9yil.png"/>
                     <pic:cNvPicPr/>
                   </pic:nvPicPr>
                   <pic:blipFill>
@@ -2444,7 +2444,7 @@
               <a:graphicData uri="http://schemas.openxmlformats.org/drawingml/2006/picture">
                 <pic:pic>
                   <pic:nvPicPr>
-                    <pic:cNvPr id="0" name="tmpecpupugq.png"/>
+                    <pic:cNvPr id="0" name="tmprn91tw55.png"/>
                     <pic:cNvPicPr/>
                   </pic:nvPicPr>
                   <pic:blipFill>
@@ -2551,7 +2551,7 @@
               <a:graphicData uri="http://schemas.openxmlformats.org/drawingml/2006/picture">
                 <pic:pic>
                   <pic:nvPicPr>
-                    <pic:cNvPr id="0" name="tmp0ysjcmk1.png"/>
+                    <pic:cNvPr id="0" name="tmpboh3tk5d.png"/>
                     <pic:cNvPicPr/>
                   </pic:nvPicPr>
                   <pic:blipFill>
@@ -2658,7 +2658,7 @@
               <a:graphicData uri="http://schemas.openxmlformats.org/drawingml/2006/picture">
                 <pic:pic>
                   <pic:nvPicPr>
-                    <pic:cNvPr id="0" name="tmp2qgspyy_.png"/>
+                    <pic:cNvPr id="0" name="tmp7gsutumb.png"/>
                     <pic:cNvPicPr/>
                   </pic:nvPicPr>
                   <pic:blipFill>
@@ -2714,7 +2714,7 @@
               <a:graphicData uri="http://schemas.openxmlformats.org/drawingml/2006/picture">
                 <pic:pic>
                   <pic:nvPicPr>
-                    <pic:cNvPr id="0" name="tmpx7n4dmdo.png"/>
+                    <pic:cNvPr id="0" name="tmp4kb2mhhg.png"/>
                     <pic:cNvPicPr/>
                   </pic:nvPicPr>
                   <pic:blipFill>
@@ -2781,7 +2781,7 @@
               <a:graphicData uri="http://schemas.openxmlformats.org/drawingml/2006/picture">
                 <pic:pic>
                   <pic:nvPicPr>
-                    <pic:cNvPr id="0" name="tmpuzhs5ef0.png"/>
+                    <pic:cNvPr id="0" name="tmpwweosvsf.png"/>
                     <pic:cNvPicPr/>
                   </pic:nvPicPr>
                   <pic:blipFill>
@@ -2883,7 +2883,7 @@
               <a:graphicData uri="http://schemas.openxmlformats.org/drawingml/2006/picture">
                 <pic:pic>
                   <pic:nvPicPr>
-                    <pic:cNvPr id="0" name="tmpjiacn6li.png"/>
+                    <pic:cNvPr id="0" name="tmptgfjfeag.png"/>
                     <pic:cNvPicPr/>
                   </pic:nvPicPr>
                   <pic:blipFill>
@@ -2948,7 +2948,7 @@
               <a:graphicData uri="http://schemas.openxmlformats.org/drawingml/2006/picture">
                 <pic:pic>
                   <pic:nvPicPr>
-                    <pic:cNvPr id="0" name="tmp09k_e7x_.png"/>
+                    <pic:cNvPr id="0" name="tmpa2v0hdqm.png"/>
                     <pic:cNvPicPr/>
                   </pic:nvPicPr>
                   <pic:blipFill>
@@ -3067,7 +3067,7 @@
               <a:graphicData uri="http://schemas.openxmlformats.org/drawingml/2006/picture">
                 <pic:pic>
                   <pic:nvPicPr>
-                    <pic:cNvPr id="0" name="tmp5fsyagcs.png"/>
+                    <pic:cNvPr id="0" name="tmpilj4a3qn.png"/>
                     <pic:cNvPicPr/>
                   </pic:nvPicPr>
                   <pic:blipFill>
@@ -3148,7 +3148,7 @@
               <a:graphicData uri="http://schemas.openxmlformats.org/drawingml/2006/picture">
                 <pic:pic>
                   <pic:nvPicPr>
-                    <pic:cNvPr id="0" name="tmpvvna87n6.png"/>
+                    <pic:cNvPr id="0" name="tmpwibk23eg.png"/>
                     <pic:cNvPicPr/>
                   </pic:nvPicPr>
                   <pic:blipFill>
@@ -3350,7 +3350,7 @@
               <a:graphicData uri="http://schemas.openxmlformats.org/drawingml/2006/picture">
                 <pic:pic>
                   <pic:nvPicPr>
-                    <pic:cNvPr id="0" name="tmpx63g3675.png"/>
+                    <pic:cNvPr id="0" name="tmpw69cblzz.png"/>
                     <pic:cNvPicPr/>
                   </pic:nvPicPr>
                   <pic:blipFill>
@@ -3444,7 +3444,7 @@
               <a:graphicData uri="http://schemas.openxmlformats.org/drawingml/2006/picture">
                 <pic:pic>
                   <pic:nvPicPr>
-                    <pic:cNvPr id="0" name="tmptlndtiws.png"/>
+                    <pic:cNvPr id="0" name="tmpelstn9_i.png"/>
                     <pic:cNvPicPr/>
                   </pic:nvPicPr>
                   <pic:blipFill>
@@ -3511,7 +3511,7 @@
               <a:graphicData uri="http://schemas.openxmlformats.org/drawingml/2006/picture">
                 <pic:pic>
                   <pic:nvPicPr>
-                    <pic:cNvPr id="0" name="tmp5y58cx05.png"/>
+                    <pic:cNvPr id="0" name="tmpbxsd8y60.png"/>
                     <pic:cNvPicPr/>
                   </pic:nvPicPr>
                   <pic:blipFill>
@@ -3567,7 +3567,7 @@
               <a:graphicData uri="http://schemas.openxmlformats.org/drawingml/2006/picture">
                 <pic:pic>
                   <pic:nvPicPr>
-                    <pic:cNvPr id="0" name="tmpem64q3rx.png"/>
+                    <pic:cNvPr id="0" name="tmpi33v9khn.png"/>
                     <pic:cNvPicPr/>
                   </pic:nvPicPr>
                   <pic:blipFill>
@@ -3650,7 +3650,7 @@
               <a:graphicData uri="http://schemas.openxmlformats.org/drawingml/2006/picture">
                 <pic:pic>
                   <pic:nvPicPr>
-                    <pic:cNvPr id="0" name="tmpkzccalok.png"/>
+                    <pic:cNvPr id="0" name="tmp5d08ppdq.png"/>
                     <pic:cNvPicPr/>
                   </pic:nvPicPr>
                   <pic:blipFill>
@@ -3741,7 +3741,7 @@
         <w:t>Incomplete</w:t>
       </w:r>
       <w:r>
-        <w:t xml:space="preserve"> (LE, B3 ID, Tax ID, data do CGD) e clique em </w:t>
+        <w:t xml:space="preserve"> (LE, B3 ID, Tax ID, data do CGD — a data e o CNPJ vêm do Reference Data: cadastre lá) e clique em </w:t>
       </w:r>
       <w:r>
         <w:rPr>
@@ -3779,7 +3779,7 @@
               <a:graphicData uri="http://schemas.openxmlformats.org/drawingml/2006/picture">
                 <pic:pic>
                   <pic:nvPicPr>
-                    <pic:cNvPr id="0" name="tmpx7c2xoxc.png"/>
+                    <pic:cNvPr id="0" name="tmpt759gclt.png"/>
                     <pic:cNvPicPr/>
                   </pic:nvPicPr>
                   <pic:blipFill>
@@ -3846,7 +3846,7 @@
               <a:graphicData uri="http://schemas.openxmlformats.org/drawingml/2006/picture">
                 <pic:pic>
                   <pic:nvPicPr>
-                    <pic:cNvPr id="0" name="tmpd16qac34.png"/>
+                    <pic:cNvPr id="0" name="tmpusc0yqn_.png"/>
                     <pic:cNvPicPr/>
                   </pic:nvPicPr>
                   <pic:blipFill>
@@ -3902,7 +3902,7 @@
               <a:graphicData uri="http://schemas.openxmlformats.org/drawingml/2006/picture">
                 <pic:pic>
                   <pic:nvPicPr>
-                    <pic:cNvPr id="0" name="tmpf68dfieo.png"/>
+                    <pic:cNvPr id="0" name="tmp4_k0ajbe.png"/>
                     <pic:cNvPicPr/>
                   </pic:nvPicPr>
                   <pic:blipFill>
@@ -3958,7 +3958,7 @@
               <a:graphicData uri="http://schemas.openxmlformats.org/drawingml/2006/picture">
                 <pic:pic>
                   <pic:nvPicPr>
-                    <pic:cNvPr id="0" name="tmpz74x5dvq.png"/>
+                    <pic:cNvPr id="0" name="tmpsj0gv5qc.png"/>
                     <pic:cNvPicPr/>
                   </pic:nvPicPr>
                   <pic:blipFill>
@@ -4014,7 +4014,7 @@
               <a:graphicData uri="http://schemas.openxmlformats.org/drawingml/2006/picture">
                 <pic:pic>
                   <pic:nvPicPr>
-                    <pic:cNvPr id="0" name="tmpf7_9mazl.png"/>
+                    <pic:cNvPr id="0" name="tmpv1cvjx0q.png"/>
                     <pic:cNvPicPr/>
                   </pic:nvPicPr>
                   <pic:blipFill>
@@ -4070,7 +4070,7 @@
               <a:graphicData uri="http://schemas.openxmlformats.org/drawingml/2006/picture">
                 <pic:pic>
                   <pic:nvPicPr>
-                    <pic:cNvPr id="0" name="tmpixbytwk2.png"/>
+                    <pic:cNvPr id="0" name="tmp3ow1l0cj.png"/>
                     <pic:cNvPicPr/>
                   </pic:nvPicPr>
                   <pic:blipFill>
@@ -4126,7 +4126,7 @@
               <a:graphicData uri="http://schemas.openxmlformats.org/drawingml/2006/picture">
                 <pic:pic>
                   <pic:nvPicPr>
-                    <pic:cNvPr id="0" name="tmp8cpdlu31.png"/>
+                    <pic:cNvPr id="0" name="tmpqpdunj_f.png"/>
                     <pic:cNvPicPr/>
                   </pic:nvPicPr>
                   <pic:blipFill>
@@ -4848,7 +4848,7 @@
               <a:graphicData uri="http://schemas.openxmlformats.org/drawingml/2006/picture">
                 <pic:pic>
                   <pic:nvPicPr>
-                    <pic:cNvPr id="0" name="tmplgsyhlvy.png"/>
+                    <pic:cNvPr id="0" name="tmp0apia4u8.png"/>
                     <pic:cNvPicPr/>
                   </pic:nvPicPr>
                   <pic:blipFill>
@@ -4904,7 +4904,7 @@
               <a:graphicData uri="http://schemas.openxmlformats.org/drawingml/2006/picture">
                 <pic:pic>
                   <pic:nvPicPr>
-                    <pic:cNvPr id="0" name="tmpz2_ck_pf.png"/>
+                    <pic:cNvPr id="0" name="tmpsw2shmdv.png"/>
                     <pic:cNvPicPr/>
                   </pic:nvPicPr>
                   <pic:blipFill>
@@ -5007,7 +5007,7 @@
               <a:graphicData uri="http://schemas.openxmlformats.org/drawingml/2006/picture">
                 <pic:pic>
                   <pic:nvPicPr>
-                    <pic:cNvPr id="0" name="tmp8q5_yxud.png"/>
+                    <pic:cNvPr id="0" name="tmpfdcvuiqd.png"/>
                     <pic:cNvPicPr/>
                   </pic:nvPicPr>
                   <pic:blipFill>
@@ -5092,7 +5092,7 @@
               <a:graphicData uri="http://schemas.openxmlformats.org/drawingml/2006/picture">
                 <pic:pic>
                   <pic:nvPicPr>
-                    <pic:cNvPr id="0" name="tmpyrcgrm3l.png"/>
+                    <pic:cNvPr id="0" name="tmp_5bu6nj0.png"/>
                     <pic:cNvPicPr/>
                   </pic:nvPicPr>
                   <pic:blipFill>
@@ -5148,7 +5148,7 @@
               <a:graphicData uri="http://schemas.openxmlformats.org/drawingml/2006/picture">
                 <pic:pic>
                   <pic:nvPicPr>
-                    <pic:cNvPr id="0" name="tmp0phd6jce.png"/>
+                    <pic:cNvPr id="0" name="tmprnvev3dt.png"/>
                     <pic:cNvPicPr/>
                   </pic:nvPicPr>
                   <pic:blipFill>
@@ -5204,7 +5204,7 @@
               <a:graphicData uri="http://schemas.openxmlformats.org/drawingml/2006/picture">
                 <pic:pic>
                   <pic:nvPicPr>
-                    <pic:cNvPr id="0" name="tmph2w0v9y8.png"/>
+                    <pic:cNvPr id="0" name="tmpbjwqxku8.png"/>
                     <pic:cNvPicPr/>
                   </pic:nvPicPr>
                   <pic:blipFill>
@@ -5260,7 +5260,7 @@
               <a:graphicData uri="http://schemas.openxmlformats.org/drawingml/2006/picture">
                 <pic:pic>
                   <pic:nvPicPr>
-                    <pic:cNvPr id="0" name="tmpfly8ojgt.png"/>
+                    <pic:cNvPr id="0" name="tmp2cr9kzld.png"/>
                     <pic:cNvPicPr/>
                   </pic:nvPicPr>
                   <pic:blipFill>
@@ -5316,7 +5316,7 @@
               <a:graphicData uri="http://schemas.openxmlformats.org/drawingml/2006/picture">
                 <pic:pic>
                   <pic:nvPicPr>
-                    <pic:cNvPr id="0" name="tmprj6nnlu1.png"/>
+                    <pic:cNvPr id="0" name="tmpa08p4tk0.png"/>
                     <pic:cNvPicPr/>
                   </pic:nvPicPr>
                   <pic:blipFill>

</xml_diff>